<commit_message>
xong chÆáAPI quản lý quy trình Æứng tuyÃển
</commit_message>
<xml_diff>
--- a/Documents/BC_CNLTHD.docx
+++ b/Documents/BC_CNLTHD.docx
@@ -1937,9 +1937,9 @@
           <w:szCs w:val="26"/>
         </w:rPr>
       </w:pPr>
-      <w:bookmarkStart w:id="0" w:name="_Toc10285"/>
-      <w:bookmarkStart w:id="1" w:name="_Toc127971471"/>
-      <w:bookmarkStart w:id="2" w:name="_Toc49105238"/>
+      <w:bookmarkStart w:id="0" w:name="_Toc127971471"/>
+      <w:bookmarkStart w:id="1" w:name="_Toc49105238"/>
+      <w:bookmarkStart w:id="2" w:name="_Toc10285"/>
       <w:r>
         <w:rPr>
           <w:rFonts w:cs="Times New Roman"/>
@@ -1971,8 +1971,8 @@
           <w:szCs w:val="26"/>
         </w:rPr>
       </w:pPr>
-      <w:bookmarkStart w:id="3" w:name="_Toc25729"/>
-      <w:bookmarkStart w:id="4" w:name="_Toc127971472"/>
+      <w:bookmarkStart w:id="3" w:name="_Toc127971472"/>
+      <w:bookmarkStart w:id="4" w:name="_Toc25729"/>
       <w:r>
         <w:rPr>
           <w:rFonts w:cs="Times New Roman"/>
@@ -2295,8 +2295,8 @@
           <w:szCs w:val="26"/>
         </w:rPr>
       </w:pPr>
-      <w:bookmarkStart w:id="5" w:name="_Toc18513"/>
-      <w:bookmarkStart w:id="6" w:name="_Toc127971473"/>
+      <w:bookmarkStart w:id="5" w:name="_Toc127971473"/>
+      <w:bookmarkStart w:id="6" w:name="_Toc18513"/>
       <w:bookmarkStart w:id="7" w:name="_Toc49105237"/>
       <w:r>
         <w:rPr>
@@ -2403,11 +2403,11 @@
           <w:szCs w:val="26"/>
         </w:rPr>
       </w:pPr>
-      <w:bookmarkStart w:id="10" w:name="_Toc127971474"/>
-      <w:bookmarkStart w:id="11" w:name="_Toc1321"/>
-      <w:bookmarkStart w:id="12" w:name="_Toc26858"/>
-      <w:bookmarkStart w:id="13" w:name="_Toc12896"/>
-      <w:bookmarkStart w:id="14" w:name="_Toc29762"/>
+      <w:bookmarkStart w:id="10" w:name="_Toc29762"/>
+      <w:bookmarkStart w:id="11" w:name="_Toc26858"/>
+      <w:bookmarkStart w:id="12" w:name="_Toc12896"/>
+      <w:bookmarkStart w:id="13" w:name="_Toc127971474"/>
+      <w:bookmarkStart w:id="14" w:name="_Toc1321"/>
       <w:r>
         <w:rPr>
           <w:rFonts w:cs="Times New Roman"/>
@@ -2435,11 +2435,11 @@
           <w:lang w:val="vi-VN"/>
         </w:rPr>
       </w:pPr>
-      <w:bookmarkStart w:id="15" w:name="_Toc24559"/>
-      <w:bookmarkStart w:id="16" w:name="_Toc32569"/>
-      <w:bookmarkStart w:id="17" w:name="_Toc127971475"/>
-      <w:bookmarkStart w:id="18" w:name="_Toc24718"/>
-      <w:bookmarkStart w:id="19" w:name="_Toc15799"/>
+      <w:bookmarkStart w:id="15" w:name="_Toc32569"/>
+      <w:bookmarkStart w:id="16" w:name="_Toc24718"/>
+      <w:bookmarkStart w:id="17" w:name="_Toc15799"/>
+      <w:bookmarkStart w:id="18" w:name="_Toc127971475"/>
+      <w:bookmarkStart w:id="19" w:name="_Toc24559"/>
       <w:r>
         <w:rPr>
           <w:rFonts w:cs="Times New Roman"/>
@@ -2492,9 +2492,9 @@
           <w:szCs w:val="26"/>
         </w:rPr>
       </w:pPr>
-      <w:bookmarkStart w:id="20" w:name="_Toc5262"/>
-      <w:bookmarkStart w:id="21" w:name="_Toc21081"/>
-      <w:bookmarkStart w:id="22" w:name="_Toc9194"/>
+      <w:bookmarkStart w:id="20" w:name="_Toc21081"/>
+      <w:bookmarkStart w:id="21" w:name="_Toc9194"/>
+      <w:bookmarkStart w:id="22" w:name="_Toc5262"/>
       <w:bookmarkStart w:id="23" w:name="_Toc3839"/>
       <w:bookmarkStart w:id="24" w:name="_Toc127971476"/>
       <w:r>
@@ -2527,8 +2527,8 @@
         </w:rPr>
       </w:pPr>
       <w:bookmarkStart w:id="25" w:name="_Toc26472"/>
-      <w:bookmarkStart w:id="26" w:name="_Toc8189"/>
-      <w:bookmarkStart w:id="27" w:name="_Toc4543"/>
+      <w:bookmarkStart w:id="26" w:name="_Toc4543"/>
+      <w:bookmarkStart w:id="27" w:name="_Toc8189"/>
       <w:bookmarkStart w:id="28" w:name="_Toc11807"/>
       <w:r>
         <w:rPr>
@@ -3945,8 +3945,8 @@
         <w:ind w:left="1078" w:right="0" w:hanging="851"/>
       </w:pPr>
       <w:bookmarkStart w:id="30" w:name="_Toc2410"/>
-      <w:bookmarkStart w:id="31" w:name="_Toc32152"/>
-      <w:bookmarkStart w:id="32" w:name="_Toc12536"/>
+      <w:bookmarkStart w:id="31" w:name="_Toc12536"/>
+      <w:bookmarkStart w:id="32" w:name="_Toc32152"/>
       <w:bookmarkStart w:id="33" w:name="_Toc13193"/>
       <w:r>
         <w:rPr>
@@ -4149,9 +4149,9 @@
         </w:rPr>
       </w:pPr>
       <w:bookmarkStart w:id="35" w:name="_Toc26732"/>
-      <w:bookmarkStart w:id="36" w:name="_Toc29387"/>
-      <w:bookmarkStart w:id="37" w:name="_Toc1611"/>
-      <w:bookmarkStart w:id="38" w:name="_Toc17063"/>
+      <w:bookmarkStart w:id="36" w:name="_Toc17063"/>
+      <w:bookmarkStart w:id="37" w:name="_Toc29387"/>
+      <w:bookmarkStart w:id="38" w:name="_Toc1611"/>
       <w:r>
         <w:rPr>
           <w:rFonts w:eastAsia="Times New Roman" w:cs="Times New Roman"/>
@@ -6980,11 +6980,11 @@
       </w:r>
       <w:bookmarkStart w:id="39" w:name="_Toc5442_Copy_1"/>
       <w:bookmarkEnd w:id="39"/>
-      <w:bookmarkStart w:id="40" w:name="_Toc28376_Copy_1"/>
+      <w:bookmarkStart w:id="40" w:name="_Toc30056_Copy_1"/>
       <w:bookmarkEnd w:id="40"/>
-      <w:bookmarkStart w:id="41" w:name="_Toc30056_Copy_1"/>
+      <w:bookmarkStart w:id="41" w:name="_Toc16474_Copy_1"/>
       <w:bookmarkEnd w:id="41"/>
-      <w:bookmarkStart w:id="42" w:name="_Toc16474_Copy_1"/>
+      <w:bookmarkStart w:id="42" w:name="_Toc28376_Copy_1"/>
       <w:bookmarkEnd w:id="42"/>
       <w:r>
         <w:rPr>
@@ -10104,8 +10104,6 @@
         </w:rPr>
         <w:t>Header có Authorization: Bearer &lt;token&gt;</w:t>
       </w:r>
-      <w:bookmarkStart w:id="105" w:name="_GoBack"/>
-      <w:bookmarkEnd w:id="105"/>
     </w:p>
     <w:p>
       <w:pPr>
@@ -10209,6 +10207,3636 @@
         </w:rPr>
         <w:t>Tìm kiếm và lọc công việc</w:t>
       </w:r>
+    </w:p>
+    <w:p>
+      <w:pPr>
+        <w:pStyle w:val="4"/>
+        <w:numPr>
+          <w:ilvl w:val="2"/>
+          <w:numId w:val="0"/>
+        </w:numPr>
+        <w:tabs>
+          <w:tab w:val="clear" w:pos="1440"/>
+        </w:tabs>
+        <w:ind w:right="0" w:rightChars="0"/>
+        <w:outlineLvl w:val="2"/>
+      </w:pPr>
+      <w:r>
+        <w:rPr>
+          <w:rFonts w:hint="default"/>
+          <w:lang w:val="en-US"/>
+        </w:rPr>
+        <w:t xml:space="preserve">2.3.1. </w:t>
+      </w:r>
+      <w:r>
+        <w:t>Lấy danh sách công việc (có lọc theo từ khóa, vị trí, mức lương, loại công việc, công ty…)</w:t>
+      </w:r>
+    </w:p>
+    <w:p>
+      <w:pPr>
+        <w:pStyle w:val="4"/>
+        <w:numPr>
+          <w:ilvl w:val="2"/>
+          <w:numId w:val="0"/>
+        </w:numPr>
+        <w:tabs>
+          <w:tab w:val="clear" w:pos="1440"/>
+        </w:tabs>
+        <w:ind w:right="0" w:rightChars="0"/>
+        <w:outlineLvl w:val="2"/>
+        <w:rPr>
+          <w:rFonts w:hint="default"/>
+          <w:b/>
+          <w:bCs/>
+          <w:lang w:val="en-US"/>
+        </w:rPr>
+      </w:pPr>
+      <w:r>
+        <w:rPr>
+          <w:b/>
+          <w:bCs/>
+        </w:rPr>
+        <w:t>API:</w:t>
+      </w:r>
+      <w:r>
+        <w:rPr>
+          <w:rFonts w:hint="default"/>
+          <w:b/>
+          <w:bCs/>
+          <w:lang w:val="en-US"/>
+        </w:rPr>
+        <w:t xml:space="preserve"> </w:t>
+      </w:r>
+      <w:r>
+        <w:t>Lấy danh sách công việc (có lọc theo từ khóa, vị trí, mức lương, loại công việc, công ty…)</w:t>
+      </w:r>
+    </w:p>
+    <w:p>
+      <w:pPr>
+        <w:rPr>
+          <w:rFonts w:hint="default"/>
+          <w:b/>
+          <w:bCs/>
+          <w:lang w:val="en-US"/>
+        </w:rPr>
+      </w:pPr>
+      <w:r>
+        <w:rPr>
+          <w:b/>
+          <w:bCs/>
+        </w:rPr>
+        <w:t>URL:</w:t>
+      </w:r>
+      <w:r>
+        <w:rPr>
+          <w:b w:val="0"/>
+          <w:bCs w:val="0"/>
+        </w:rPr>
+        <w:t xml:space="preserve"> </w:t>
+      </w:r>
+    </w:p>
+    <w:p>
+      <w:pPr>
+        <w:rPr>
+          <w:rFonts w:hint="default"/>
+          <w:b w:val="0"/>
+          <w:bCs w:val="0"/>
+          <w:lang w:val="en-US"/>
+        </w:rPr>
+      </w:pPr>
+      <w:r>
+        <w:rPr>
+          <w:b/>
+          <w:bCs/>
+        </w:rPr>
+        <w:t xml:space="preserve">Phương thức: </w:t>
+      </w:r>
+    </w:p>
+    <w:p>
+      <w:pPr>
+        <w:rPr>
+          <w:rFonts w:hint="default"/>
+          <w:b w:val="0"/>
+          <w:bCs w:val="0"/>
+          <w:lang w:val="en-US"/>
+        </w:rPr>
+      </w:pPr>
+      <w:r>
+        <w:rPr>
+          <w:b/>
+          <w:bCs/>
+        </w:rPr>
+        <w:t>Mô tả:</w:t>
+      </w:r>
+      <w:r>
+        <w:rPr>
+          <w:rFonts w:hint="default"/>
+          <w:b/>
+          <w:bCs/>
+          <w:lang w:val="en-US"/>
+        </w:rPr>
+        <w:t xml:space="preserve"> </w:t>
+      </w:r>
+      <w:r>
+        <w:rPr>
+          <w:rFonts w:hint="default"/>
+          <w:b w:val="0"/>
+          <w:bCs w:val="0"/>
+          <w:lang w:val="en-US"/>
+        </w:rPr>
+        <w:t>Khi người dùng đăng nhập với vai trò là người dùng, họ có thể lọc các công việc theo từ khóa, vị trí, mức lương, loại công việc, công ty.</w:t>
+      </w:r>
+    </w:p>
+    <w:p>
+      <w:pPr>
+        <w:rPr>
+          <w:b/>
+          <w:bCs/>
+        </w:rPr>
+      </w:pPr>
+      <w:r>
+        <w:rPr>
+          <w:b/>
+          <w:bCs/>
+        </w:rPr>
+        <w:t>Request:</w:t>
+      </w:r>
+    </w:p>
+    <w:p>
+      <w:pPr>
+        <w:rPr>
+          <w:rFonts w:hint="default"/>
+          <w:b/>
+          <w:bCs/>
+          <w:lang w:val="en-US"/>
+        </w:rPr>
+      </w:pPr>
+      <w:r>
+        <w:rPr>
+          <w:b/>
+          <w:bCs/>
+        </w:rPr>
+        <w:t>Response:</w:t>
+      </w:r>
+    </w:p>
+    <w:p>
+      <w:pPr>
+        <w:pStyle w:val="4"/>
+        <w:numPr>
+          <w:ilvl w:val="2"/>
+          <w:numId w:val="0"/>
+        </w:numPr>
+        <w:tabs>
+          <w:tab w:val="clear" w:pos="1440"/>
+        </w:tabs>
+        <w:ind w:right="0" w:rightChars="0"/>
+        <w:outlineLvl w:val="2"/>
+      </w:pPr>
+      <w:r>
+        <w:rPr>
+          <w:rFonts w:hint="default"/>
+          <w:lang w:val="en-US"/>
+        </w:rPr>
+        <w:t xml:space="preserve">2.3.2. </w:t>
+      </w:r>
+      <w:r>
+        <w:t>Chi tiết một việc làm cụ thể</w:t>
+      </w:r>
+    </w:p>
+    <w:p>
+      <w:pPr>
+        <w:pStyle w:val="4"/>
+        <w:numPr>
+          <w:ilvl w:val="2"/>
+          <w:numId w:val="0"/>
+        </w:numPr>
+        <w:tabs>
+          <w:tab w:val="clear" w:pos="1440"/>
+        </w:tabs>
+        <w:ind w:right="0" w:rightChars="0"/>
+        <w:outlineLvl w:val="2"/>
+        <w:rPr>
+          <w:rFonts w:hint="default"/>
+          <w:b/>
+          <w:bCs/>
+          <w:lang w:val="en-US"/>
+        </w:rPr>
+      </w:pPr>
+      <w:r>
+        <w:rPr>
+          <w:b/>
+          <w:bCs/>
+        </w:rPr>
+        <w:t>API:</w:t>
+      </w:r>
+      <w:r>
+        <w:rPr>
+          <w:rFonts w:hint="default"/>
+          <w:b/>
+          <w:bCs/>
+          <w:lang w:val="en-US"/>
+        </w:rPr>
+        <w:t xml:space="preserve"> </w:t>
+      </w:r>
+      <w:r>
+        <w:t>Chi tiết một việc làm cụ thể</w:t>
+      </w:r>
+    </w:p>
+    <w:p>
+      <w:pPr>
+        <w:rPr>
+          <w:rFonts w:hint="default"/>
+          <w:b/>
+          <w:bCs/>
+          <w:lang w:val="en-US"/>
+        </w:rPr>
+      </w:pPr>
+      <w:r>
+        <w:rPr>
+          <w:b/>
+          <w:bCs/>
+        </w:rPr>
+        <w:t>URL:</w:t>
+      </w:r>
+      <w:r>
+        <w:rPr>
+          <w:b w:val="0"/>
+          <w:bCs w:val="0"/>
+        </w:rPr>
+        <w:t xml:space="preserve"> </w:t>
+      </w:r>
+    </w:p>
+    <w:p>
+      <w:pPr>
+        <w:rPr>
+          <w:rFonts w:hint="default"/>
+          <w:b w:val="0"/>
+          <w:bCs w:val="0"/>
+          <w:lang w:val="en-US"/>
+        </w:rPr>
+      </w:pPr>
+      <w:r>
+        <w:rPr>
+          <w:b/>
+          <w:bCs/>
+        </w:rPr>
+        <w:t xml:space="preserve">Phương thức: </w:t>
+      </w:r>
+    </w:p>
+    <w:p>
+      <w:pPr>
+        <w:rPr>
+          <w:rFonts w:hint="default"/>
+          <w:b w:val="0"/>
+          <w:bCs w:val="0"/>
+          <w:lang w:val="en-US"/>
+        </w:rPr>
+      </w:pPr>
+      <w:r>
+        <w:rPr>
+          <w:b/>
+          <w:bCs/>
+        </w:rPr>
+        <w:t>Mô tả:</w:t>
+      </w:r>
+      <w:r>
+        <w:rPr>
+          <w:rFonts w:hint="default"/>
+          <w:b/>
+          <w:bCs/>
+          <w:lang w:val="en-US"/>
+        </w:rPr>
+        <w:t xml:space="preserve"> </w:t>
+      </w:r>
+      <w:r>
+        <w:rPr>
+          <w:rFonts w:hint="default"/>
+          <w:b w:val="0"/>
+          <w:bCs w:val="0"/>
+          <w:lang w:val="en-US"/>
+        </w:rPr>
+        <w:t>Khi người dùng đăng nhập với vai trò là người dùng, truy cập vào một công việc và xem được chi tiết công việc đó.</w:t>
+      </w:r>
+    </w:p>
+    <w:p>
+      <w:pPr>
+        <w:rPr>
+          <w:b/>
+          <w:bCs/>
+        </w:rPr>
+      </w:pPr>
+      <w:r>
+        <w:rPr>
+          <w:b/>
+          <w:bCs/>
+        </w:rPr>
+        <w:t>Request:</w:t>
+      </w:r>
+    </w:p>
+    <w:p>
+      <w:r>
+        <w:rPr>
+          <w:b/>
+          <w:bCs/>
+        </w:rPr>
+        <w:t>Response:</w:t>
+      </w:r>
+    </w:p>
+    <w:p>
+      <w:pPr>
+        <w:pStyle w:val="4"/>
+        <w:numPr>
+          <w:ilvl w:val="2"/>
+          <w:numId w:val="0"/>
+        </w:numPr>
+        <w:tabs>
+          <w:tab w:val="clear" w:pos="1440"/>
+        </w:tabs>
+        <w:ind w:right="0" w:rightChars="0"/>
+        <w:outlineLvl w:val="2"/>
+      </w:pPr>
+      <w:r>
+        <w:rPr>
+          <w:rFonts w:hint="default"/>
+          <w:lang w:val="en-US"/>
+        </w:rPr>
+        <w:t xml:space="preserve">2.3.3. </w:t>
+      </w:r>
+      <w:r>
+        <w:t>API gợi ý công việc dựa trên hồ sơ người dùng</w:t>
+      </w:r>
+    </w:p>
+    <w:p>
+      <w:pPr>
+        <w:pStyle w:val="3"/>
+        <w:ind w:left="567" w:hanging="567"/>
+        <w:outlineLvl w:val="0"/>
+        <w:rPr>
+          <w:rFonts w:ascii="Times New Roman" w:hAnsi="Times New Roman" w:cs="Times New Roman"/>
+          <w:sz w:val="26"/>
+          <w:szCs w:val="26"/>
+          <w:lang w:val="vi-VN"/>
+        </w:rPr>
+      </w:pPr>
+      <w:r>
+        <w:rPr>
+          <w:rFonts w:cs="Times New Roman"/>
+          <w:sz w:val="26"/>
+          <w:szCs w:val="26"/>
+          <w:lang w:val="vi-VN"/>
+        </w:rPr>
+        <w:t>Quản lý quy trình ứng tuyển</w:t>
+      </w:r>
+    </w:p>
+    <w:p>
+      <w:pPr>
+        <w:pStyle w:val="4"/>
+        <w:numPr>
+          <w:ilvl w:val="2"/>
+          <w:numId w:val="0"/>
+        </w:numPr>
+        <w:tabs>
+          <w:tab w:val="clear" w:pos="1440"/>
+        </w:tabs>
+        <w:ind w:right="0" w:rightChars="0"/>
+        <w:outlineLvl w:val="2"/>
+      </w:pPr>
+      <w:r>
+        <w:rPr>
+          <w:rFonts w:hint="default"/>
+          <w:lang w:val="en-US"/>
+        </w:rPr>
+        <w:t xml:space="preserve">2.4.1. </w:t>
+      </w:r>
+      <w:r>
+        <w:t>Lấy danh sách đơn ứng tuyển của người dùng hoặc nhà tuyển dụng (tùy vai trò)</w:t>
+      </w:r>
+    </w:p>
+    <w:p>
+      <w:pPr>
+        <w:pStyle w:val="4"/>
+        <w:widowControl/>
+        <w:numPr>
+          <w:ilvl w:val="2"/>
+          <w:numId w:val="0"/>
+        </w:numPr>
+        <w:tabs>
+          <w:tab w:val="clear" w:pos="1440"/>
+        </w:tabs>
+        <w:ind w:right="0" w:rightChars="0"/>
+        <w:outlineLvl w:val="2"/>
+        <w:rPr>
+          <w:rFonts w:hint="default" w:ascii="Times New Roman" w:hAnsi="Times New Roman" w:eastAsia="黑体" w:cs="Times New Roman"/>
+          <w:b/>
+          <w:bCs/>
+          <w:kern w:val="0"/>
+          <w:sz w:val="26"/>
+          <w:szCs w:val="26"/>
+        </w:rPr>
+      </w:pPr>
+      <w:r>
+        <w:rPr>
+          <w:rFonts w:hint="default" w:ascii="Times New Roman" w:hAnsi="Times New Roman" w:eastAsia="黑体" w:cs="Times New Roman"/>
+          <w:b/>
+          <w:bCs/>
+          <w:kern w:val="0"/>
+          <w:sz w:val="26"/>
+          <w:szCs w:val="26"/>
+        </w:rPr>
+        <w:t xml:space="preserve">API: </w:t>
+      </w:r>
+      <w:r>
+        <w:t>Lấy danh sách đơn ứng tuyển của người dùng hoặc nhà tuyển dụng (tùy vai trò)</w:t>
+      </w:r>
+    </w:p>
+    <w:p>
+      <w:pPr>
+        <w:keepNext w:val="0"/>
+        <w:keepLines w:val="0"/>
+        <w:widowControl/>
+        <w:suppressLineNumbers w:val="0"/>
+        <w:suppressAutoHyphens/>
+        <w:spacing w:before="0" w:beforeAutospacing="0" w:after="120" w:afterAutospacing="0" w:line="360" w:lineRule="auto"/>
+        <w:ind w:left="0" w:right="0"/>
+        <w:jc w:val="left"/>
+        <w:rPr>
+          <w:rFonts w:hint="default" w:ascii="Times New Roman" w:hAnsi="Times New Roman" w:eastAsia="Calibri" w:cs="黑体"/>
+          <w:b/>
+          <w:bCs/>
+          <w:kern w:val="0"/>
+          <w:sz w:val="26"/>
+          <w:szCs w:val="26"/>
+        </w:rPr>
+      </w:pPr>
+      <w:r>
+        <w:rPr>
+          <w:rFonts w:hint="default" w:ascii="Times New Roman" w:hAnsi="Times New Roman" w:eastAsia="Calibri" w:cs="黑体"/>
+          <w:b/>
+          <w:bCs/>
+          <w:color w:val="auto"/>
+          <w:kern w:val="0"/>
+          <w:sz w:val="26"/>
+          <w:szCs w:val="26"/>
+          <w:lang w:val="en-US" w:eastAsia="zh-CN" w:bidi="ar"/>
+        </w:rPr>
+        <w:t>URL:</w:t>
+      </w:r>
+      <w:r>
+        <w:rPr>
+          <w:rFonts w:hint="default" w:ascii="Times New Roman" w:hAnsi="Times New Roman" w:eastAsia="Calibri" w:cs="黑体"/>
+          <w:b w:val="0"/>
+          <w:bCs w:val="0"/>
+          <w:color w:val="auto"/>
+          <w:kern w:val="0"/>
+          <w:sz w:val="26"/>
+          <w:szCs w:val="26"/>
+          <w:lang w:val="en-US" w:eastAsia="zh-CN" w:bidi="ar"/>
+        </w:rPr>
+        <w:t xml:space="preserve"> </w:t>
+      </w:r>
+      <w:r>
+        <w:rPr>
+          <w:rFonts w:hint="default" w:eastAsia="Calibri"/>
+          <w:b w:val="0"/>
+          <w:bCs w:val="0"/>
+          <w:color w:val="auto"/>
+          <w:kern w:val="0"/>
+          <w:sz w:val="26"/>
+          <w:szCs w:val="26"/>
+          <w:lang w:val="en-US" w:eastAsia="zh-CN"/>
+        </w:rPr>
+        <w:t>/applications/</w:t>
+      </w:r>
+    </w:p>
+    <w:p>
+      <w:pPr>
+        <w:keepNext w:val="0"/>
+        <w:keepLines w:val="0"/>
+        <w:widowControl/>
+        <w:suppressLineNumbers w:val="0"/>
+        <w:suppressAutoHyphens/>
+        <w:spacing w:before="0" w:beforeAutospacing="0" w:after="120" w:afterAutospacing="0" w:line="360" w:lineRule="auto"/>
+        <w:ind w:left="0" w:right="0"/>
+        <w:jc w:val="left"/>
+        <w:rPr>
+          <w:rFonts w:hint="default" w:ascii="Times New Roman" w:hAnsi="Times New Roman" w:eastAsia="Calibri" w:cs="黑体"/>
+          <w:b w:val="0"/>
+          <w:bCs w:val="0"/>
+          <w:kern w:val="0"/>
+          <w:sz w:val="26"/>
+          <w:szCs w:val="26"/>
+          <w:lang w:val="en-US"/>
+        </w:rPr>
+      </w:pPr>
+      <w:r>
+        <w:rPr>
+          <w:rFonts w:hint="default" w:ascii="Times New Roman" w:hAnsi="Times New Roman" w:eastAsia="Calibri" w:cs="黑体"/>
+          <w:b/>
+          <w:bCs/>
+          <w:color w:val="auto"/>
+          <w:kern w:val="0"/>
+          <w:sz w:val="26"/>
+          <w:szCs w:val="26"/>
+          <w:lang w:val="en-US" w:eastAsia="zh-CN" w:bidi="ar"/>
+        </w:rPr>
+        <w:t xml:space="preserve">Phương thức: </w:t>
+      </w:r>
+      <w:r>
+        <w:rPr>
+          <w:rFonts w:hint="default" w:eastAsia="Calibri" w:cs="黑体"/>
+          <w:b/>
+          <w:bCs/>
+          <w:color w:val="auto"/>
+          <w:kern w:val="0"/>
+          <w:sz w:val="26"/>
+          <w:szCs w:val="26"/>
+          <w:lang w:val="en-US" w:eastAsia="zh-CN" w:bidi="ar"/>
+        </w:rPr>
+        <w:t>GET</w:t>
+      </w:r>
+    </w:p>
+    <w:p>
+      <w:pPr>
+        <w:keepNext w:val="0"/>
+        <w:keepLines w:val="0"/>
+        <w:widowControl/>
+        <w:suppressLineNumbers w:val="0"/>
+        <w:suppressAutoHyphens/>
+        <w:spacing w:before="0" w:beforeAutospacing="0" w:after="120" w:afterAutospacing="0" w:line="360" w:lineRule="auto"/>
+        <w:ind w:left="0" w:right="0"/>
+        <w:jc w:val="left"/>
+        <w:rPr>
+          <w:rFonts w:hint="default" w:ascii="Times New Roman" w:hAnsi="Times New Roman" w:eastAsia="Calibri" w:cs="黑体"/>
+          <w:b w:val="0"/>
+          <w:bCs w:val="0"/>
+          <w:kern w:val="0"/>
+          <w:sz w:val="26"/>
+          <w:szCs w:val="26"/>
+          <w:lang w:val="en-US"/>
+        </w:rPr>
+      </w:pPr>
+      <w:r>
+        <w:rPr>
+          <w:rFonts w:hint="default" w:ascii="Times New Roman" w:hAnsi="Times New Roman" w:eastAsia="Calibri" w:cs="黑体"/>
+          <w:b/>
+          <w:bCs/>
+          <w:color w:val="auto"/>
+          <w:kern w:val="0"/>
+          <w:sz w:val="26"/>
+          <w:szCs w:val="26"/>
+          <w:lang w:val="en-US" w:eastAsia="zh-CN" w:bidi="ar"/>
+        </w:rPr>
+        <w:t>Mô tả:</w:t>
+      </w:r>
+      <w:r>
+        <w:rPr>
+          <w:rFonts w:hint="default" w:eastAsia="Calibri" w:cs="黑体"/>
+          <w:b w:val="0"/>
+          <w:bCs w:val="0"/>
+          <w:color w:val="auto"/>
+          <w:kern w:val="0"/>
+          <w:sz w:val="26"/>
+          <w:szCs w:val="26"/>
+          <w:lang w:val="en-US" w:eastAsia="zh-CN" w:bidi="ar"/>
+        </w:rPr>
+        <w:t xml:space="preserve"> Khi người dùng đăng nhập với vai trò là nhà tuyển dụng hoặc người tìm việc thì họ có thể xem được truy cập các đơn ứng tuyển tương ứng với quyền của từng vai trò.</w:t>
+      </w:r>
+    </w:p>
+    <w:p>
+      <w:pPr>
+        <w:keepNext w:val="0"/>
+        <w:keepLines w:val="0"/>
+        <w:widowControl/>
+        <w:suppressLineNumbers w:val="0"/>
+        <w:suppressAutoHyphens/>
+        <w:spacing w:before="0" w:beforeAutospacing="0" w:after="120" w:afterAutospacing="0" w:line="360" w:lineRule="auto"/>
+        <w:ind w:left="0" w:right="0"/>
+        <w:jc w:val="left"/>
+        <w:rPr>
+          <w:rFonts w:hint="default" w:ascii="Times New Roman" w:hAnsi="Times New Roman" w:eastAsia="Calibri" w:cs="黑体"/>
+          <w:b/>
+          <w:bCs/>
+          <w:kern w:val="0"/>
+          <w:sz w:val="26"/>
+          <w:szCs w:val="26"/>
+          <w:lang w:val="en-US"/>
+        </w:rPr>
+      </w:pPr>
+      <w:r>
+        <w:rPr>
+          <w:rFonts w:hint="default" w:ascii="Times New Roman" w:hAnsi="Times New Roman" w:eastAsia="Calibri" w:cs="黑体"/>
+          <w:b/>
+          <w:bCs/>
+          <w:color w:val="auto"/>
+          <w:kern w:val="0"/>
+          <w:sz w:val="26"/>
+          <w:szCs w:val="26"/>
+          <w:lang w:val="en-US" w:eastAsia="zh-CN" w:bidi="ar"/>
+        </w:rPr>
+        <w:t>Request:</w:t>
+      </w:r>
+      <w:r>
+        <w:rPr>
+          <w:rFonts w:hint="default" w:eastAsia="Calibri" w:cs="黑体"/>
+          <w:b/>
+          <w:bCs/>
+          <w:color w:val="auto"/>
+          <w:kern w:val="0"/>
+          <w:sz w:val="26"/>
+          <w:szCs w:val="26"/>
+          <w:lang w:val="en-US" w:eastAsia="zh-CN" w:bidi="ar"/>
+        </w:rPr>
+        <w:t xml:space="preserve"> </w:t>
+      </w:r>
+      <w:r>
+        <w:rPr>
+          <w:rFonts w:hint="default"/>
+          <w:b w:val="0"/>
+          <w:bCs w:val="0"/>
+        </w:rPr>
+        <w:t>Header có Authorization: Bearer &lt;token&gt;</w:t>
+      </w:r>
+    </w:p>
+    <w:p>
+      <w:pPr>
+        <w:keepNext w:val="0"/>
+        <w:keepLines w:val="0"/>
+        <w:widowControl/>
+        <w:suppressLineNumbers w:val="0"/>
+        <w:suppressAutoHyphens/>
+        <w:spacing w:before="0" w:beforeAutospacing="0" w:after="120" w:afterAutospacing="0" w:line="360" w:lineRule="auto"/>
+        <w:ind w:left="0" w:right="0"/>
+        <w:jc w:val="left"/>
+      </w:pPr>
+      <w:r>
+        <w:rPr>
+          <w:rFonts w:hint="default" w:ascii="Times New Roman" w:hAnsi="Times New Roman" w:eastAsia="Calibri" w:cs="黑体"/>
+          <w:b/>
+          <w:bCs/>
+          <w:color w:val="auto"/>
+          <w:kern w:val="0"/>
+          <w:sz w:val="26"/>
+          <w:szCs w:val="26"/>
+          <w:lang w:val="en-US" w:eastAsia="zh-CN" w:bidi="ar"/>
+        </w:rPr>
+        <w:t>Response:</w:t>
+      </w:r>
+    </w:p>
+    <w:p>
+      <w:pPr>
+        <w:rPr>
+          <w:rFonts w:hint="default"/>
+        </w:rPr>
+      </w:pPr>
+      <w:r>
+        <w:rPr>
+          <w:rFonts w:hint="default"/>
+        </w:rPr>
+        <w:t>{</w:t>
+      </w:r>
+    </w:p>
+    <w:p>
+      <w:pPr>
+        <w:rPr>
+          <w:rFonts w:hint="default"/>
+        </w:rPr>
+      </w:pPr>
+      <w:r>
+        <w:rPr>
+          <w:rFonts w:hint="default"/>
+        </w:rPr>
+        <w:t xml:space="preserve">        "id": 1,</w:t>
+      </w:r>
+    </w:p>
+    <w:p>
+      <w:pPr>
+        <w:rPr>
+          <w:rFonts w:hint="default"/>
+        </w:rPr>
+      </w:pPr>
+      <w:r>
+        <w:rPr>
+          <w:rFonts w:hint="default"/>
+        </w:rPr>
+        <w:t xml:space="preserve">        "my_user": 2,</w:t>
+      </w:r>
+    </w:p>
+    <w:p>
+      <w:pPr>
+        <w:rPr>
+          <w:rFonts w:hint="default"/>
+        </w:rPr>
+      </w:pPr>
+      <w:r>
+        <w:rPr>
+          <w:rFonts w:hint="default"/>
+        </w:rPr>
+        <w:t xml:space="preserve">        "job_posting": "24da05ff-6666-4056-a8ba-5872af6822b8",</w:t>
+      </w:r>
+    </w:p>
+    <w:p>
+      <w:pPr>
+        <w:rPr>
+          <w:rFonts w:hint="default"/>
+        </w:rPr>
+      </w:pPr>
+      <w:r>
+        <w:rPr>
+          <w:rFonts w:hint="default"/>
+        </w:rPr>
+        <w:t xml:space="preserve">        "cv": 11,</w:t>
+      </w:r>
+    </w:p>
+    <w:p>
+      <w:pPr>
+        <w:rPr>
+          <w:rFonts w:hint="default"/>
+        </w:rPr>
+      </w:pPr>
+      <w:r>
+        <w:rPr>
+          <w:rFonts w:hint="default"/>
+        </w:rPr>
+        <w:t xml:space="preserve">        "status": "Applied",</w:t>
+      </w:r>
+    </w:p>
+    <w:p>
+      <w:pPr>
+        <w:rPr>
+          <w:rFonts w:hint="default"/>
+        </w:rPr>
+      </w:pPr>
+      <w:r>
+        <w:rPr>
+          <w:rFonts w:hint="default"/>
+        </w:rPr>
+        <w:t xml:space="preserve">        "cover_letter": "Tôi muốn Apply vào vị trí tiền đạo này, tôi là Luka Modric",</w:t>
+      </w:r>
+    </w:p>
+    <w:p>
+      <w:pPr>
+        <w:rPr>
+          <w:rFonts w:hint="default"/>
+        </w:rPr>
+      </w:pPr>
+      <w:r>
+        <w:rPr>
+          <w:rFonts w:hint="default"/>
+        </w:rPr>
+        <w:t xml:space="preserve">        "created_at": "2025-05-27T10:09:41.574595Z",</w:t>
+      </w:r>
+    </w:p>
+    <w:p>
+      <w:pPr>
+        <w:rPr>
+          <w:rFonts w:hint="default"/>
+        </w:rPr>
+      </w:pPr>
+      <w:r>
+        <w:rPr>
+          <w:rFonts w:hint="default"/>
+        </w:rPr>
+        <w:t xml:space="preserve">        "updated_at": "2025-05-27T10:09:41.574625Z",</w:t>
+      </w:r>
+    </w:p>
+    <w:p>
+      <w:pPr>
+        <w:rPr>
+          <w:rFonts w:hint="default"/>
+        </w:rPr>
+      </w:pPr>
+      <w:r>
+        <w:rPr>
+          <w:rFonts w:hint="default"/>
+        </w:rPr>
+        <w:t xml:space="preserve">        "job_posting_title": "Chúng tôi cần tuyển tiền đạo hàng đầu nước Anh",</w:t>
+      </w:r>
+    </w:p>
+    <w:p>
+      <w:pPr>
+        <w:rPr>
+          <w:rFonts w:hint="default"/>
+        </w:rPr>
+      </w:pPr>
+      <w:r>
+        <w:rPr>
+          <w:rFonts w:hint="default"/>
+        </w:rPr>
+        <w:t xml:space="preserve">        "job_seeker_username": "JobSeeker1",</w:t>
+      </w:r>
+    </w:p>
+    <w:p>
+      <w:pPr>
+        <w:rPr>
+          <w:rFonts w:hint="default"/>
+        </w:rPr>
+      </w:pPr>
+      <w:r>
+        <w:rPr>
+          <w:rFonts w:hint="default"/>
+        </w:rPr>
+        <w:t xml:space="preserve">        "cv_url": "https://res.cloudinary.com/dlysaj8pb/raw/upload/v1747473275/cvs/bsizardotlhvf3zp4kjz.png",</w:t>
+      </w:r>
+    </w:p>
+    <w:p>
+      <w:pPr>
+        <w:rPr>
+          <w:rFonts w:hint="default"/>
+        </w:rPr>
+      </w:pPr>
+      <w:r>
+        <w:rPr>
+          <w:rFonts w:hint="default"/>
+        </w:rPr>
+        <w:t xml:space="preserve">        "recruiter_company": "Công ty Bóng đá hàng đầu trời Âu"</w:t>
+      </w:r>
+    </w:p>
+    <w:p>
+      <w:r>
+        <w:rPr>
+          <w:rFonts w:hint="default"/>
+        </w:rPr>
+        <w:t xml:space="preserve">    }</w:t>
+      </w:r>
+    </w:p>
+    <w:p>
+      <w:pPr>
+        <w:pStyle w:val="4"/>
+        <w:numPr>
+          <w:ilvl w:val="2"/>
+          <w:numId w:val="0"/>
+        </w:numPr>
+        <w:tabs>
+          <w:tab w:val="clear" w:pos="1440"/>
+        </w:tabs>
+        <w:ind w:right="0" w:rightChars="0"/>
+        <w:outlineLvl w:val="2"/>
+      </w:pPr>
+      <w:r>
+        <w:rPr>
+          <w:rFonts w:hint="default"/>
+          <w:lang w:val="en-US"/>
+        </w:rPr>
+        <w:t xml:space="preserve">2.4.2. </w:t>
+      </w:r>
+      <w:r>
+        <w:t>Tạo đơn ứng tuyển cho việc làm mới (CV, thư xin việc)</w:t>
+      </w:r>
+    </w:p>
+    <w:p>
+      <w:pPr>
+        <w:pStyle w:val="4"/>
+        <w:widowControl/>
+        <w:numPr>
+          <w:ilvl w:val="2"/>
+          <w:numId w:val="0"/>
+        </w:numPr>
+        <w:tabs>
+          <w:tab w:val="clear" w:pos="1440"/>
+        </w:tabs>
+        <w:ind w:right="0" w:rightChars="0"/>
+        <w:outlineLvl w:val="2"/>
+        <w:rPr>
+          <w:rFonts w:hint="default" w:ascii="Times New Roman" w:hAnsi="Times New Roman" w:eastAsia="黑体" w:cs="Times New Roman"/>
+          <w:b/>
+          <w:bCs/>
+          <w:kern w:val="0"/>
+          <w:sz w:val="26"/>
+          <w:szCs w:val="26"/>
+        </w:rPr>
+      </w:pPr>
+      <w:r>
+        <w:rPr>
+          <w:rFonts w:hint="default" w:ascii="Times New Roman" w:hAnsi="Times New Roman" w:eastAsia="黑体" w:cs="Times New Roman"/>
+          <w:b/>
+          <w:bCs/>
+          <w:kern w:val="0"/>
+          <w:sz w:val="26"/>
+          <w:szCs w:val="26"/>
+        </w:rPr>
+        <w:t xml:space="preserve">API: </w:t>
+      </w:r>
+      <w:r>
+        <w:t>Tạo đơn ứng tuyển cho việc làm mới (CV, thư xin việc)</w:t>
+      </w:r>
+    </w:p>
+    <w:p>
+      <w:pPr>
+        <w:keepNext w:val="0"/>
+        <w:keepLines w:val="0"/>
+        <w:widowControl/>
+        <w:suppressLineNumbers w:val="0"/>
+        <w:suppressAutoHyphens/>
+        <w:spacing w:before="0" w:beforeAutospacing="0" w:after="120" w:afterAutospacing="0" w:line="360" w:lineRule="auto"/>
+        <w:ind w:left="0" w:right="0"/>
+        <w:jc w:val="left"/>
+        <w:rPr>
+          <w:rFonts w:hint="default" w:ascii="Times New Roman" w:hAnsi="Times New Roman" w:eastAsia="Calibri" w:cs="黑体"/>
+          <w:b/>
+          <w:bCs/>
+          <w:kern w:val="0"/>
+          <w:sz w:val="26"/>
+          <w:szCs w:val="26"/>
+          <w:lang w:val="en-US"/>
+        </w:rPr>
+      </w:pPr>
+      <w:r>
+        <w:rPr>
+          <w:rFonts w:hint="default" w:ascii="Times New Roman" w:hAnsi="Times New Roman" w:eastAsia="Calibri" w:cs="黑体"/>
+          <w:b/>
+          <w:bCs/>
+          <w:color w:val="auto"/>
+          <w:kern w:val="0"/>
+          <w:sz w:val="26"/>
+          <w:szCs w:val="26"/>
+          <w:lang w:val="en-US" w:eastAsia="zh-CN" w:bidi="ar"/>
+        </w:rPr>
+        <w:t>URL:</w:t>
+      </w:r>
+      <w:r>
+        <w:rPr>
+          <w:rFonts w:hint="default" w:eastAsia="Calibri" w:cs="黑体"/>
+          <w:b/>
+          <w:bCs/>
+          <w:color w:val="auto"/>
+          <w:kern w:val="0"/>
+          <w:sz w:val="26"/>
+          <w:szCs w:val="26"/>
+          <w:lang w:val="en-US" w:eastAsia="zh-CN" w:bidi="ar"/>
+        </w:rPr>
+        <w:t xml:space="preserve"> </w:t>
+      </w:r>
+      <w:r>
+        <w:rPr>
+          <w:rFonts w:hint="default" w:eastAsia="Calibri"/>
+          <w:b w:val="0"/>
+          <w:bCs w:val="0"/>
+          <w:color w:val="auto"/>
+          <w:kern w:val="0"/>
+          <w:sz w:val="26"/>
+          <w:szCs w:val="26"/>
+          <w:lang w:val="en-US" w:eastAsia="zh-CN"/>
+        </w:rPr>
+        <w:t>/applications/</w:t>
+      </w:r>
+    </w:p>
+    <w:p>
+      <w:pPr>
+        <w:keepNext w:val="0"/>
+        <w:keepLines w:val="0"/>
+        <w:widowControl/>
+        <w:suppressLineNumbers w:val="0"/>
+        <w:suppressAutoHyphens/>
+        <w:spacing w:before="0" w:beforeAutospacing="0" w:after="120" w:afterAutospacing="0" w:line="360" w:lineRule="auto"/>
+        <w:ind w:left="0" w:right="0"/>
+        <w:jc w:val="left"/>
+        <w:rPr>
+          <w:rFonts w:hint="default" w:ascii="Times New Roman" w:hAnsi="Times New Roman" w:eastAsia="Calibri" w:cs="黑体"/>
+          <w:b w:val="0"/>
+          <w:bCs w:val="0"/>
+          <w:kern w:val="0"/>
+          <w:sz w:val="26"/>
+          <w:szCs w:val="26"/>
+          <w:lang w:val="en-US"/>
+        </w:rPr>
+      </w:pPr>
+      <w:r>
+        <w:rPr>
+          <w:rFonts w:hint="default" w:ascii="Times New Roman" w:hAnsi="Times New Roman" w:eastAsia="Calibri" w:cs="黑体"/>
+          <w:b/>
+          <w:bCs/>
+          <w:color w:val="auto"/>
+          <w:kern w:val="0"/>
+          <w:sz w:val="26"/>
+          <w:szCs w:val="26"/>
+          <w:lang w:val="en-US" w:eastAsia="zh-CN" w:bidi="ar"/>
+        </w:rPr>
+        <w:t xml:space="preserve">Phương thức: </w:t>
+      </w:r>
+      <w:r>
+        <w:rPr>
+          <w:rFonts w:hint="default" w:eastAsia="Calibri" w:cs="黑体"/>
+          <w:b/>
+          <w:bCs/>
+          <w:color w:val="auto"/>
+          <w:kern w:val="0"/>
+          <w:sz w:val="26"/>
+          <w:szCs w:val="26"/>
+          <w:lang w:val="en-US" w:eastAsia="zh-CN" w:bidi="ar"/>
+        </w:rPr>
+        <w:t>POST</w:t>
+      </w:r>
+    </w:p>
+    <w:p>
+      <w:pPr>
+        <w:keepNext w:val="0"/>
+        <w:keepLines w:val="0"/>
+        <w:widowControl/>
+        <w:suppressLineNumbers w:val="0"/>
+        <w:suppressAutoHyphens/>
+        <w:spacing w:before="0" w:beforeAutospacing="0" w:after="120" w:afterAutospacing="0" w:line="360" w:lineRule="auto"/>
+        <w:ind w:left="0" w:right="0"/>
+        <w:jc w:val="left"/>
+        <w:rPr>
+          <w:rFonts w:hint="default" w:ascii="Times New Roman" w:hAnsi="Times New Roman" w:eastAsia="Calibri" w:cs="黑体"/>
+          <w:b w:val="0"/>
+          <w:bCs w:val="0"/>
+          <w:kern w:val="0"/>
+          <w:sz w:val="26"/>
+          <w:szCs w:val="26"/>
+          <w:lang w:val="en-US"/>
+        </w:rPr>
+      </w:pPr>
+      <w:r>
+        <w:rPr>
+          <w:rFonts w:hint="default" w:ascii="Times New Roman" w:hAnsi="Times New Roman" w:eastAsia="Calibri" w:cs="黑体"/>
+          <w:b/>
+          <w:bCs/>
+          <w:color w:val="auto"/>
+          <w:kern w:val="0"/>
+          <w:sz w:val="26"/>
+          <w:szCs w:val="26"/>
+          <w:lang w:val="en-US" w:eastAsia="zh-CN" w:bidi="ar"/>
+        </w:rPr>
+        <w:t xml:space="preserve">Mô tả: </w:t>
+      </w:r>
+      <w:r>
+        <w:rPr>
+          <w:rFonts w:hint="default" w:ascii="Times New Roman" w:hAnsi="Times New Roman" w:eastAsia="Calibri" w:cs="黑体"/>
+          <w:b w:val="0"/>
+          <w:bCs w:val="0"/>
+          <w:color w:val="auto"/>
+          <w:kern w:val="0"/>
+          <w:sz w:val="26"/>
+          <w:szCs w:val="26"/>
+          <w:lang w:val="en-US" w:eastAsia="zh-CN" w:bidi="ar"/>
+        </w:rPr>
+        <w:t xml:space="preserve">Khi người dùng đăng nhập với vai trò là </w:t>
+      </w:r>
+      <w:r>
+        <w:rPr>
+          <w:rFonts w:hint="default" w:eastAsia="Calibri" w:cs="黑体"/>
+          <w:b w:val="0"/>
+          <w:bCs w:val="0"/>
+          <w:color w:val="auto"/>
+          <w:kern w:val="0"/>
+          <w:sz w:val="26"/>
+          <w:szCs w:val="26"/>
+          <w:lang w:val="en-US" w:eastAsia="zh-CN" w:bidi="ar"/>
+        </w:rPr>
+        <w:t>người tìm việc</w:t>
+      </w:r>
+      <w:r>
+        <w:rPr>
+          <w:rFonts w:hint="default" w:ascii="Times New Roman" w:hAnsi="Times New Roman" w:eastAsia="Calibri" w:cs="黑体"/>
+          <w:b w:val="0"/>
+          <w:bCs w:val="0"/>
+          <w:color w:val="auto"/>
+          <w:kern w:val="0"/>
+          <w:sz w:val="26"/>
+          <w:szCs w:val="26"/>
+          <w:lang w:val="en-US" w:eastAsia="zh-CN" w:bidi="ar"/>
+        </w:rPr>
+        <w:t xml:space="preserve">, họ có thể </w:t>
+      </w:r>
+      <w:r>
+        <w:rPr>
+          <w:rFonts w:hint="default" w:eastAsia="Calibri" w:cs="黑体"/>
+          <w:b w:val="0"/>
+          <w:bCs w:val="0"/>
+          <w:color w:val="auto"/>
+          <w:kern w:val="0"/>
+          <w:sz w:val="26"/>
+          <w:szCs w:val="26"/>
+          <w:lang w:val="en-US" w:eastAsia="zh-CN" w:bidi="ar"/>
+        </w:rPr>
+        <w:t>ứng tuyển vào một công việc bằng cách apply vào công việc đó có kèm theo CV của mình.</w:t>
+      </w:r>
+    </w:p>
+    <w:p>
+      <w:pPr>
+        <w:rPr>
+          <w:rFonts w:hint="default"/>
+          <w:b w:val="0"/>
+          <w:bCs w:val="0"/>
+        </w:rPr>
+      </w:pPr>
+      <w:r>
+        <w:rPr>
+          <w:rFonts w:hint="default" w:ascii="Times New Roman" w:hAnsi="Times New Roman" w:eastAsia="Calibri" w:cs="黑体"/>
+          <w:b/>
+          <w:bCs/>
+          <w:color w:val="auto"/>
+          <w:kern w:val="0"/>
+          <w:sz w:val="26"/>
+          <w:szCs w:val="26"/>
+          <w:lang w:val="en-US" w:eastAsia="zh-CN" w:bidi="ar"/>
+        </w:rPr>
+        <w:t>Request:</w:t>
+      </w:r>
+      <w:r>
+        <w:rPr>
+          <w:rFonts w:hint="default" w:eastAsia="Calibri" w:cs="黑体"/>
+          <w:b/>
+          <w:bCs/>
+          <w:color w:val="auto"/>
+          <w:kern w:val="0"/>
+          <w:sz w:val="26"/>
+          <w:szCs w:val="26"/>
+          <w:lang w:val="en-US" w:eastAsia="zh-CN" w:bidi="ar"/>
+        </w:rPr>
+        <w:t xml:space="preserve"> </w:t>
+      </w:r>
+      <w:r>
+        <w:rPr>
+          <w:rFonts w:hint="default"/>
+          <w:b w:val="0"/>
+          <w:bCs w:val="0"/>
+        </w:rPr>
+        <w:t>Header có Authorization: Bearer &lt;token&gt;</w:t>
+      </w:r>
+    </w:p>
+    <w:p>
+      <w:pPr>
+        <w:keepNext w:val="0"/>
+        <w:keepLines w:val="0"/>
+        <w:widowControl/>
+        <w:suppressLineNumbers w:val="0"/>
+        <w:suppressAutoHyphens/>
+        <w:spacing w:before="0" w:beforeAutospacing="0" w:after="120" w:afterAutospacing="0" w:line="360" w:lineRule="auto"/>
+        <w:ind w:left="0" w:right="0"/>
+        <w:jc w:val="left"/>
+        <w:rPr>
+          <w:rFonts w:hint="default"/>
+        </w:rPr>
+      </w:pPr>
+      <w:r>
+        <w:rPr>
+          <w:rFonts w:hint="default"/>
+        </w:rPr>
+        <w:t>{</w:t>
+      </w:r>
+    </w:p>
+    <w:p>
+      <w:pPr>
+        <w:keepNext w:val="0"/>
+        <w:keepLines w:val="0"/>
+        <w:widowControl/>
+        <w:suppressLineNumbers w:val="0"/>
+        <w:suppressAutoHyphens/>
+        <w:spacing w:before="0" w:beforeAutospacing="0" w:after="120" w:afterAutospacing="0" w:line="360" w:lineRule="auto"/>
+        <w:ind w:left="0" w:right="0"/>
+        <w:jc w:val="left"/>
+        <w:rPr>
+          <w:rFonts w:hint="default"/>
+        </w:rPr>
+      </w:pPr>
+      <w:r>
+        <w:rPr>
+          <w:rFonts w:hint="default"/>
+        </w:rPr>
+        <w:t xml:space="preserve">    "job_posting": "24da05ff66664056a8ba5872af6822b8",</w:t>
+      </w:r>
+    </w:p>
+    <w:p>
+      <w:pPr>
+        <w:keepNext w:val="0"/>
+        <w:keepLines w:val="0"/>
+        <w:widowControl/>
+        <w:suppressLineNumbers w:val="0"/>
+        <w:suppressAutoHyphens/>
+        <w:spacing w:before="0" w:beforeAutospacing="0" w:after="120" w:afterAutospacing="0" w:line="360" w:lineRule="auto"/>
+        <w:ind w:left="0" w:right="0"/>
+        <w:jc w:val="left"/>
+        <w:rPr>
+          <w:rFonts w:hint="default"/>
+        </w:rPr>
+      </w:pPr>
+      <w:r>
+        <w:rPr>
+          <w:rFonts w:hint="default"/>
+        </w:rPr>
+        <w:t xml:space="preserve">    "cv": "21",</w:t>
+      </w:r>
+    </w:p>
+    <w:p>
+      <w:pPr>
+        <w:keepNext w:val="0"/>
+        <w:keepLines w:val="0"/>
+        <w:widowControl/>
+        <w:suppressLineNumbers w:val="0"/>
+        <w:suppressAutoHyphens/>
+        <w:spacing w:before="0" w:beforeAutospacing="0" w:after="120" w:afterAutospacing="0" w:line="360" w:lineRule="auto"/>
+        <w:ind w:left="0" w:right="0"/>
+        <w:jc w:val="left"/>
+        <w:rPr>
+          <w:rFonts w:hint="default"/>
+        </w:rPr>
+      </w:pPr>
+      <w:r>
+        <w:rPr>
+          <w:rFonts w:hint="default"/>
+        </w:rPr>
+        <w:t xml:space="preserve">    "cover_letter": "Đây là CV của Nguyễn Tấn Lộc muốn Apply vào công việc này"</w:t>
+      </w:r>
+    </w:p>
+    <w:p>
+      <w:pPr>
+        <w:keepNext w:val="0"/>
+        <w:keepLines w:val="0"/>
+        <w:widowControl/>
+        <w:suppressLineNumbers w:val="0"/>
+        <w:suppressAutoHyphens/>
+        <w:spacing w:before="0" w:beforeAutospacing="0" w:after="120" w:afterAutospacing="0" w:line="360" w:lineRule="auto"/>
+        <w:ind w:left="0" w:right="0"/>
+        <w:jc w:val="left"/>
+        <w:rPr>
+          <w:rFonts w:hint="default"/>
+        </w:rPr>
+      </w:pPr>
+      <w:r>
+        <w:rPr>
+          <w:rFonts w:hint="default"/>
+        </w:rPr>
+        <w:t>}</w:t>
+      </w:r>
+    </w:p>
+    <w:p>
+      <w:pPr>
+        <w:keepNext w:val="0"/>
+        <w:keepLines w:val="0"/>
+        <w:widowControl/>
+        <w:suppressLineNumbers w:val="0"/>
+        <w:suppressAutoHyphens/>
+        <w:spacing w:before="0" w:beforeAutospacing="0" w:after="120" w:afterAutospacing="0" w:line="360" w:lineRule="auto"/>
+        <w:ind w:left="0" w:right="0"/>
+        <w:jc w:val="left"/>
+        <w:rPr>
+          <w:rFonts w:hint="default" w:ascii="Times New Roman" w:hAnsi="Times New Roman" w:eastAsia="Calibri" w:cs="黑体"/>
+          <w:b/>
+          <w:bCs/>
+          <w:color w:val="auto"/>
+          <w:kern w:val="0"/>
+          <w:sz w:val="26"/>
+          <w:szCs w:val="26"/>
+          <w:lang w:val="en-US" w:eastAsia="zh-CN" w:bidi="ar"/>
+        </w:rPr>
+      </w:pPr>
+      <w:r>
+        <w:rPr>
+          <w:rFonts w:hint="default" w:ascii="Times New Roman" w:hAnsi="Times New Roman" w:eastAsia="Calibri" w:cs="黑体"/>
+          <w:b/>
+          <w:bCs/>
+          <w:color w:val="auto"/>
+          <w:kern w:val="0"/>
+          <w:sz w:val="26"/>
+          <w:szCs w:val="26"/>
+          <w:lang w:val="en-US" w:eastAsia="zh-CN" w:bidi="ar"/>
+        </w:rPr>
+        <w:t>Response:</w:t>
+      </w:r>
+    </w:p>
+    <w:p>
+      <w:pPr>
+        <w:keepNext w:val="0"/>
+        <w:keepLines w:val="0"/>
+        <w:widowControl/>
+        <w:suppressLineNumbers w:val="0"/>
+        <w:suppressAutoHyphens/>
+        <w:spacing w:before="0" w:beforeAutospacing="0" w:after="120" w:afterAutospacing="0" w:line="360" w:lineRule="auto"/>
+        <w:ind w:left="0" w:right="0"/>
+        <w:jc w:val="left"/>
+        <w:rPr>
+          <w:rFonts w:hint="default" w:ascii="Times New Roman" w:hAnsi="Times New Roman" w:eastAsia="Calibri"/>
+          <w:b w:val="0"/>
+          <w:bCs w:val="0"/>
+          <w:color w:val="auto"/>
+          <w:kern w:val="0"/>
+          <w:sz w:val="26"/>
+          <w:szCs w:val="26"/>
+          <w:lang w:val="en-US" w:eastAsia="zh-CN"/>
+        </w:rPr>
+      </w:pPr>
+      <w:r>
+        <w:rPr>
+          <w:rFonts w:hint="default" w:ascii="Times New Roman" w:hAnsi="Times New Roman" w:eastAsia="Calibri"/>
+          <w:b w:val="0"/>
+          <w:bCs w:val="0"/>
+          <w:color w:val="auto"/>
+          <w:kern w:val="0"/>
+          <w:sz w:val="26"/>
+          <w:szCs w:val="26"/>
+          <w:lang w:val="en-US" w:eastAsia="zh-CN"/>
+        </w:rPr>
+        <w:t>{</w:t>
+      </w:r>
+    </w:p>
+    <w:p>
+      <w:pPr>
+        <w:keepNext w:val="0"/>
+        <w:keepLines w:val="0"/>
+        <w:widowControl/>
+        <w:suppressLineNumbers w:val="0"/>
+        <w:suppressAutoHyphens/>
+        <w:spacing w:before="0" w:beforeAutospacing="0" w:after="120" w:afterAutospacing="0" w:line="360" w:lineRule="auto"/>
+        <w:ind w:left="0" w:right="0"/>
+        <w:jc w:val="left"/>
+        <w:rPr>
+          <w:rFonts w:hint="default" w:ascii="Times New Roman" w:hAnsi="Times New Roman" w:eastAsia="Calibri"/>
+          <w:b w:val="0"/>
+          <w:bCs w:val="0"/>
+          <w:color w:val="auto"/>
+          <w:kern w:val="0"/>
+          <w:sz w:val="26"/>
+          <w:szCs w:val="26"/>
+          <w:lang w:val="en-US" w:eastAsia="zh-CN"/>
+        </w:rPr>
+      </w:pPr>
+      <w:r>
+        <w:rPr>
+          <w:rFonts w:hint="default" w:ascii="Times New Roman" w:hAnsi="Times New Roman" w:eastAsia="Calibri"/>
+          <w:b w:val="0"/>
+          <w:bCs w:val="0"/>
+          <w:color w:val="auto"/>
+          <w:kern w:val="0"/>
+          <w:sz w:val="26"/>
+          <w:szCs w:val="26"/>
+          <w:lang w:val="en-US" w:eastAsia="zh-CN"/>
+        </w:rPr>
+        <w:t xml:space="preserve">    "id": 2,</w:t>
+      </w:r>
+    </w:p>
+    <w:p>
+      <w:pPr>
+        <w:keepNext w:val="0"/>
+        <w:keepLines w:val="0"/>
+        <w:widowControl/>
+        <w:suppressLineNumbers w:val="0"/>
+        <w:suppressAutoHyphens/>
+        <w:spacing w:before="0" w:beforeAutospacing="0" w:after="120" w:afterAutospacing="0" w:line="360" w:lineRule="auto"/>
+        <w:ind w:left="0" w:right="0"/>
+        <w:jc w:val="left"/>
+        <w:rPr>
+          <w:rFonts w:hint="default" w:ascii="Times New Roman" w:hAnsi="Times New Roman" w:eastAsia="Calibri"/>
+          <w:b w:val="0"/>
+          <w:bCs w:val="0"/>
+          <w:color w:val="auto"/>
+          <w:kern w:val="0"/>
+          <w:sz w:val="26"/>
+          <w:szCs w:val="26"/>
+          <w:lang w:val="en-US" w:eastAsia="zh-CN"/>
+        </w:rPr>
+      </w:pPr>
+      <w:r>
+        <w:rPr>
+          <w:rFonts w:hint="default" w:ascii="Times New Roman" w:hAnsi="Times New Roman" w:eastAsia="Calibri"/>
+          <w:b w:val="0"/>
+          <w:bCs w:val="0"/>
+          <w:color w:val="auto"/>
+          <w:kern w:val="0"/>
+          <w:sz w:val="26"/>
+          <w:szCs w:val="26"/>
+          <w:lang w:val="en-US" w:eastAsia="zh-CN"/>
+        </w:rPr>
+        <w:t xml:space="preserve">    "my_user": 2,</w:t>
+      </w:r>
+    </w:p>
+    <w:p>
+      <w:pPr>
+        <w:keepNext w:val="0"/>
+        <w:keepLines w:val="0"/>
+        <w:widowControl/>
+        <w:suppressLineNumbers w:val="0"/>
+        <w:suppressAutoHyphens/>
+        <w:spacing w:before="0" w:beforeAutospacing="0" w:after="120" w:afterAutospacing="0" w:line="360" w:lineRule="auto"/>
+        <w:ind w:left="0" w:right="0"/>
+        <w:jc w:val="left"/>
+        <w:rPr>
+          <w:rFonts w:hint="default" w:ascii="Times New Roman" w:hAnsi="Times New Roman" w:eastAsia="Calibri"/>
+          <w:b w:val="0"/>
+          <w:bCs w:val="0"/>
+          <w:color w:val="auto"/>
+          <w:kern w:val="0"/>
+          <w:sz w:val="26"/>
+          <w:szCs w:val="26"/>
+          <w:lang w:val="en-US" w:eastAsia="zh-CN"/>
+        </w:rPr>
+      </w:pPr>
+      <w:r>
+        <w:rPr>
+          <w:rFonts w:hint="default" w:ascii="Times New Roman" w:hAnsi="Times New Roman" w:eastAsia="Calibri"/>
+          <w:b w:val="0"/>
+          <w:bCs w:val="0"/>
+          <w:color w:val="auto"/>
+          <w:kern w:val="0"/>
+          <w:sz w:val="26"/>
+          <w:szCs w:val="26"/>
+          <w:lang w:val="en-US" w:eastAsia="zh-CN"/>
+        </w:rPr>
+        <w:t xml:space="preserve">    "job_posting": "24da05ff-6666-4056-a8ba-5872af6822b8",</w:t>
+      </w:r>
+    </w:p>
+    <w:p>
+      <w:pPr>
+        <w:keepNext w:val="0"/>
+        <w:keepLines w:val="0"/>
+        <w:widowControl/>
+        <w:suppressLineNumbers w:val="0"/>
+        <w:suppressAutoHyphens/>
+        <w:spacing w:before="0" w:beforeAutospacing="0" w:after="120" w:afterAutospacing="0" w:line="360" w:lineRule="auto"/>
+        <w:ind w:left="0" w:right="0"/>
+        <w:jc w:val="left"/>
+        <w:rPr>
+          <w:rFonts w:hint="default" w:ascii="Times New Roman" w:hAnsi="Times New Roman" w:eastAsia="Calibri"/>
+          <w:b w:val="0"/>
+          <w:bCs w:val="0"/>
+          <w:color w:val="auto"/>
+          <w:kern w:val="0"/>
+          <w:sz w:val="26"/>
+          <w:szCs w:val="26"/>
+          <w:lang w:val="en-US" w:eastAsia="zh-CN"/>
+        </w:rPr>
+      </w:pPr>
+      <w:r>
+        <w:rPr>
+          <w:rFonts w:hint="default" w:ascii="Times New Roman" w:hAnsi="Times New Roman" w:eastAsia="Calibri"/>
+          <w:b w:val="0"/>
+          <w:bCs w:val="0"/>
+          <w:color w:val="auto"/>
+          <w:kern w:val="0"/>
+          <w:sz w:val="26"/>
+          <w:szCs w:val="26"/>
+          <w:lang w:val="en-US" w:eastAsia="zh-CN"/>
+        </w:rPr>
+        <w:t xml:space="preserve">    "cv": 21,</w:t>
+      </w:r>
+    </w:p>
+    <w:p>
+      <w:pPr>
+        <w:keepNext w:val="0"/>
+        <w:keepLines w:val="0"/>
+        <w:widowControl/>
+        <w:suppressLineNumbers w:val="0"/>
+        <w:suppressAutoHyphens/>
+        <w:spacing w:before="0" w:beforeAutospacing="0" w:after="120" w:afterAutospacing="0" w:line="360" w:lineRule="auto"/>
+        <w:ind w:left="0" w:right="0"/>
+        <w:jc w:val="left"/>
+        <w:rPr>
+          <w:rFonts w:hint="default" w:ascii="Times New Roman" w:hAnsi="Times New Roman" w:eastAsia="Calibri"/>
+          <w:b w:val="0"/>
+          <w:bCs w:val="0"/>
+          <w:color w:val="auto"/>
+          <w:kern w:val="0"/>
+          <w:sz w:val="26"/>
+          <w:szCs w:val="26"/>
+          <w:lang w:val="en-US" w:eastAsia="zh-CN"/>
+        </w:rPr>
+      </w:pPr>
+      <w:r>
+        <w:rPr>
+          <w:rFonts w:hint="default" w:ascii="Times New Roman" w:hAnsi="Times New Roman" w:eastAsia="Calibri"/>
+          <w:b w:val="0"/>
+          <w:bCs w:val="0"/>
+          <w:color w:val="auto"/>
+          <w:kern w:val="0"/>
+          <w:sz w:val="26"/>
+          <w:szCs w:val="26"/>
+          <w:lang w:val="en-US" w:eastAsia="zh-CN"/>
+        </w:rPr>
+        <w:t xml:space="preserve">    "status": "Applied",</w:t>
+      </w:r>
+    </w:p>
+    <w:p>
+      <w:pPr>
+        <w:keepNext w:val="0"/>
+        <w:keepLines w:val="0"/>
+        <w:widowControl/>
+        <w:suppressLineNumbers w:val="0"/>
+        <w:suppressAutoHyphens/>
+        <w:spacing w:before="0" w:beforeAutospacing="0" w:after="120" w:afterAutospacing="0" w:line="360" w:lineRule="auto"/>
+        <w:ind w:left="0" w:right="0"/>
+        <w:jc w:val="left"/>
+        <w:rPr>
+          <w:rFonts w:hint="default" w:ascii="Times New Roman" w:hAnsi="Times New Roman" w:eastAsia="Calibri"/>
+          <w:b w:val="0"/>
+          <w:bCs w:val="0"/>
+          <w:color w:val="auto"/>
+          <w:kern w:val="0"/>
+          <w:sz w:val="26"/>
+          <w:szCs w:val="26"/>
+          <w:lang w:val="en-US" w:eastAsia="zh-CN"/>
+        </w:rPr>
+      </w:pPr>
+      <w:r>
+        <w:rPr>
+          <w:rFonts w:hint="default" w:ascii="Times New Roman" w:hAnsi="Times New Roman" w:eastAsia="Calibri"/>
+          <w:b w:val="0"/>
+          <w:bCs w:val="0"/>
+          <w:color w:val="auto"/>
+          <w:kern w:val="0"/>
+          <w:sz w:val="26"/>
+          <w:szCs w:val="26"/>
+          <w:lang w:val="en-US" w:eastAsia="zh-CN"/>
+        </w:rPr>
+        <w:t xml:space="preserve">    "cover_letter": "Đây là CV của Nguyễn Tấn Lộc muốn Apply vào công việc này",</w:t>
+      </w:r>
+    </w:p>
+    <w:p>
+      <w:pPr>
+        <w:keepNext w:val="0"/>
+        <w:keepLines w:val="0"/>
+        <w:widowControl/>
+        <w:suppressLineNumbers w:val="0"/>
+        <w:suppressAutoHyphens/>
+        <w:spacing w:before="0" w:beforeAutospacing="0" w:after="120" w:afterAutospacing="0" w:line="360" w:lineRule="auto"/>
+        <w:ind w:left="0" w:right="0"/>
+        <w:jc w:val="left"/>
+        <w:rPr>
+          <w:rFonts w:hint="default" w:ascii="Times New Roman" w:hAnsi="Times New Roman" w:eastAsia="Calibri"/>
+          <w:b w:val="0"/>
+          <w:bCs w:val="0"/>
+          <w:color w:val="auto"/>
+          <w:kern w:val="0"/>
+          <w:sz w:val="26"/>
+          <w:szCs w:val="26"/>
+          <w:lang w:val="en-US" w:eastAsia="zh-CN"/>
+        </w:rPr>
+      </w:pPr>
+      <w:r>
+        <w:rPr>
+          <w:rFonts w:hint="default" w:ascii="Times New Roman" w:hAnsi="Times New Roman" w:eastAsia="Calibri"/>
+          <w:b w:val="0"/>
+          <w:bCs w:val="0"/>
+          <w:color w:val="auto"/>
+          <w:kern w:val="0"/>
+          <w:sz w:val="26"/>
+          <w:szCs w:val="26"/>
+          <w:lang w:val="en-US" w:eastAsia="zh-CN"/>
+        </w:rPr>
+        <w:t xml:space="preserve">    "created_at": "2025-05-27T14:42:11.470749Z",</w:t>
+      </w:r>
+    </w:p>
+    <w:p>
+      <w:pPr>
+        <w:keepNext w:val="0"/>
+        <w:keepLines w:val="0"/>
+        <w:widowControl/>
+        <w:suppressLineNumbers w:val="0"/>
+        <w:suppressAutoHyphens/>
+        <w:spacing w:before="0" w:beforeAutospacing="0" w:after="120" w:afterAutospacing="0" w:line="360" w:lineRule="auto"/>
+        <w:ind w:left="0" w:right="0"/>
+        <w:jc w:val="left"/>
+        <w:rPr>
+          <w:rFonts w:hint="default" w:ascii="Times New Roman" w:hAnsi="Times New Roman" w:eastAsia="Calibri"/>
+          <w:b w:val="0"/>
+          <w:bCs w:val="0"/>
+          <w:color w:val="auto"/>
+          <w:kern w:val="0"/>
+          <w:sz w:val="26"/>
+          <w:szCs w:val="26"/>
+          <w:lang w:val="en-US" w:eastAsia="zh-CN"/>
+        </w:rPr>
+      </w:pPr>
+      <w:r>
+        <w:rPr>
+          <w:rFonts w:hint="default" w:ascii="Times New Roman" w:hAnsi="Times New Roman" w:eastAsia="Calibri"/>
+          <w:b w:val="0"/>
+          <w:bCs w:val="0"/>
+          <w:color w:val="auto"/>
+          <w:kern w:val="0"/>
+          <w:sz w:val="26"/>
+          <w:szCs w:val="26"/>
+          <w:lang w:val="en-US" w:eastAsia="zh-CN"/>
+        </w:rPr>
+        <w:t xml:space="preserve">    "updated_at": "2025-05-27T14:42:11.470783Z",</w:t>
+      </w:r>
+    </w:p>
+    <w:p>
+      <w:pPr>
+        <w:keepNext w:val="0"/>
+        <w:keepLines w:val="0"/>
+        <w:widowControl/>
+        <w:suppressLineNumbers w:val="0"/>
+        <w:suppressAutoHyphens/>
+        <w:spacing w:before="0" w:beforeAutospacing="0" w:after="120" w:afterAutospacing="0" w:line="360" w:lineRule="auto"/>
+        <w:ind w:left="0" w:right="0"/>
+        <w:jc w:val="left"/>
+        <w:rPr>
+          <w:rFonts w:hint="default" w:ascii="Times New Roman" w:hAnsi="Times New Roman" w:eastAsia="Calibri"/>
+          <w:b w:val="0"/>
+          <w:bCs w:val="0"/>
+          <w:color w:val="auto"/>
+          <w:kern w:val="0"/>
+          <w:sz w:val="26"/>
+          <w:szCs w:val="26"/>
+          <w:lang w:val="en-US" w:eastAsia="zh-CN"/>
+        </w:rPr>
+      </w:pPr>
+      <w:r>
+        <w:rPr>
+          <w:rFonts w:hint="default" w:ascii="Times New Roman" w:hAnsi="Times New Roman" w:eastAsia="Calibri"/>
+          <w:b w:val="0"/>
+          <w:bCs w:val="0"/>
+          <w:color w:val="auto"/>
+          <w:kern w:val="0"/>
+          <w:sz w:val="26"/>
+          <w:szCs w:val="26"/>
+          <w:lang w:val="en-US" w:eastAsia="zh-CN"/>
+        </w:rPr>
+        <w:t xml:space="preserve">    "job_posting_title": "Chúng tôi cần tuyển tiền đạo hàng đầu nước Anh",</w:t>
+      </w:r>
+    </w:p>
+    <w:p>
+      <w:pPr>
+        <w:keepNext w:val="0"/>
+        <w:keepLines w:val="0"/>
+        <w:widowControl/>
+        <w:suppressLineNumbers w:val="0"/>
+        <w:suppressAutoHyphens/>
+        <w:spacing w:before="0" w:beforeAutospacing="0" w:after="120" w:afterAutospacing="0" w:line="360" w:lineRule="auto"/>
+        <w:ind w:left="0" w:right="0"/>
+        <w:jc w:val="left"/>
+        <w:rPr>
+          <w:rFonts w:hint="default" w:ascii="Times New Roman" w:hAnsi="Times New Roman" w:eastAsia="Calibri"/>
+          <w:b w:val="0"/>
+          <w:bCs w:val="0"/>
+          <w:color w:val="auto"/>
+          <w:kern w:val="0"/>
+          <w:sz w:val="26"/>
+          <w:szCs w:val="26"/>
+          <w:lang w:val="en-US" w:eastAsia="zh-CN"/>
+        </w:rPr>
+      </w:pPr>
+      <w:r>
+        <w:rPr>
+          <w:rFonts w:hint="default" w:ascii="Times New Roman" w:hAnsi="Times New Roman" w:eastAsia="Calibri"/>
+          <w:b w:val="0"/>
+          <w:bCs w:val="0"/>
+          <w:color w:val="auto"/>
+          <w:kern w:val="0"/>
+          <w:sz w:val="26"/>
+          <w:szCs w:val="26"/>
+          <w:lang w:val="en-US" w:eastAsia="zh-CN"/>
+        </w:rPr>
+        <w:t xml:space="preserve">    "job_seeker_username": "JobSeeker1",</w:t>
+      </w:r>
+    </w:p>
+    <w:p>
+      <w:pPr>
+        <w:keepNext w:val="0"/>
+        <w:keepLines w:val="0"/>
+        <w:widowControl/>
+        <w:suppressLineNumbers w:val="0"/>
+        <w:suppressAutoHyphens/>
+        <w:spacing w:before="0" w:beforeAutospacing="0" w:after="120" w:afterAutospacing="0" w:line="360" w:lineRule="auto"/>
+        <w:ind w:left="0" w:right="0"/>
+        <w:jc w:val="left"/>
+        <w:rPr>
+          <w:rFonts w:hint="default" w:ascii="Times New Roman" w:hAnsi="Times New Roman" w:eastAsia="Calibri"/>
+          <w:b w:val="0"/>
+          <w:bCs w:val="0"/>
+          <w:color w:val="auto"/>
+          <w:kern w:val="0"/>
+          <w:sz w:val="26"/>
+          <w:szCs w:val="26"/>
+          <w:lang w:val="en-US" w:eastAsia="zh-CN"/>
+        </w:rPr>
+      </w:pPr>
+      <w:r>
+        <w:rPr>
+          <w:rFonts w:hint="default" w:ascii="Times New Roman" w:hAnsi="Times New Roman" w:eastAsia="Calibri"/>
+          <w:b w:val="0"/>
+          <w:bCs w:val="0"/>
+          <w:color w:val="auto"/>
+          <w:kern w:val="0"/>
+          <w:sz w:val="26"/>
+          <w:szCs w:val="26"/>
+          <w:lang w:val="en-US" w:eastAsia="zh-CN"/>
+        </w:rPr>
+        <w:t xml:space="preserve">    "cv_url": "https://res.cloudinary.com/dlysaj8pb/raw/upload/v1747585614/cvs/rg4qmz598e3zitbqwrkc.png",</w:t>
+      </w:r>
+    </w:p>
+    <w:p>
+      <w:pPr>
+        <w:keepNext w:val="0"/>
+        <w:keepLines w:val="0"/>
+        <w:widowControl/>
+        <w:suppressLineNumbers w:val="0"/>
+        <w:suppressAutoHyphens/>
+        <w:spacing w:before="0" w:beforeAutospacing="0" w:after="120" w:afterAutospacing="0" w:line="360" w:lineRule="auto"/>
+        <w:ind w:left="0" w:right="0"/>
+        <w:jc w:val="left"/>
+        <w:rPr>
+          <w:rFonts w:hint="default" w:ascii="Times New Roman" w:hAnsi="Times New Roman" w:eastAsia="Calibri"/>
+          <w:b w:val="0"/>
+          <w:bCs w:val="0"/>
+          <w:color w:val="auto"/>
+          <w:kern w:val="0"/>
+          <w:sz w:val="26"/>
+          <w:szCs w:val="26"/>
+          <w:lang w:val="en-US" w:eastAsia="zh-CN"/>
+        </w:rPr>
+      </w:pPr>
+      <w:r>
+        <w:rPr>
+          <w:rFonts w:hint="default" w:ascii="Times New Roman" w:hAnsi="Times New Roman" w:eastAsia="Calibri"/>
+          <w:b w:val="0"/>
+          <w:bCs w:val="0"/>
+          <w:color w:val="auto"/>
+          <w:kern w:val="0"/>
+          <w:sz w:val="26"/>
+          <w:szCs w:val="26"/>
+          <w:lang w:val="en-US" w:eastAsia="zh-CN"/>
+        </w:rPr>
+        <w:t xml:space="preserve">    "recruiter_company": "Công ty Bóng đá hàng đầu trời Âu"</w:t>
+      </w:r>
+    </w:p>
+    <w:p>
+      <w:pPr>
+        <w:keepNext w:val="0"/>
+        <w:keepLines w:val="0"/>
+        <w:widowControl/>
+        <w:suppressLineNumbers w:val="0"/>
+        <w:suppressAutoHyphens/>
+        <w:spacing w:before="0" w:beforeAutospacing="0" w:after="120" w:afterAutospacing="0" w:line="360" w:lineRule="auto"/>
+        <w:ind w:left="0" w:right="0"/>
+        <w:jc w:val="left"/>
+        <w:rPr>
+          <w:rFonts w:hint="default" w:ascii="Times New Roman" w:hAnsi="Times New Roman" w:eastAsia="Calibri" w:cs="黑体"/>
+          <w:b/>
+          <w:bCs/>
+          <w:color w:val="auto"/>
+          <w:kern w:val="0"/>
+          <w:sz w:val="26"/>
+          <w:szCs w:val="26"/>
+          <w:lang w:val="en-US" w:eastAsia="zh-CN" w:bidi="ar"/>
+        </w:rPr>
+      </w:pPr>
+      <w:r>
+        <w:rPr>
+          <w:rFonts w:hint="default" w:ascii="Times New Roman" w:hAnsi="Times New Roman" w:eastAsia="Calibri"/>
+          <w:b w:val="0"/>
+          <w:bCs w:val="0"/>
+          <w:color w:val="auto"/>
+          <w:kern w:val="0"/>
+          <w:sz w:val="26"/>
+          <w:szCs w:val="26"/>
+          <w:lang w:val="en-US" w:eastAsia="zh-CN"/>
+        </w:rPr>
+        <w:t>}</w:t>
+      </w:r>
+    </w:p>
+    <w:p>
+      <w:pPr>
+        <w:pStyle w:val="4"/>
+        <w:numPr>
+          <w:ilvl w:val="2"/>
+          <w:numId w:val="0"/>
+        </w:numPr>
+        <w:tabs>
+          <w:tab w:val="clear" w:pos="1440"/>
+        </w:tabs>
+        <w:ind w:right="0" w:rightChars="0"/>
+        <w:outlineLvl w:val="2"/>
+      </w:pPr>
+      <w:r>
+        <w:rPr>
+          <w:rFonts w:hint="default"/>
+          <w:lang w:val="en-US"/>
+        </w:rPr>
+        <w:t xml:space="preserve">2.4.3. </w:t>
+      </w:r>
+      <w:r>
+        <w:t>Cật nhật trạng thái đơn (do nhà tuyển dụng thao tác: xem, mời phỏng vấn, từ chối…)</w:t>
+      </w:r>
+    </w:p>
+    <w:p>
+      <w:pPr>
+        <w:pStyle w:val="4"/>
+        <w:widowControl/>
+        <w:numPr>
+          <w:ilvl w:val="2"/>
+          <w:numId w:val="0"/>
+        </w:numPr>
+        <w:tabs>
+          <w:tab w:val="clear" w:pos="1440"/>
+        </w:tabs>
+        <w:ind w:right="0" w:rightChars="0"/>
+        <w:outlineLvl w:val="2"/>
+        <w:rPr>
+          <w:rFonts w:hint="default" w:ascii="Times New Roman" w:hAnsi="Times New Roman" w:eastAsia="黑体" w:cs="Times New Roman"/>
+          <w:b/>
+          <w:bCs/>
+          <w:kern w:val="0"/>
+          <w:sz w:val="26"/>
+          <w:szCs w:val="26"/>
+        </w:rPr>
+      </w:pPr>
+      <w:r>
+        <w:rPr>
+          <w:rFonts w:hint="default" w:ascii="Times New Roman" w:hAnsi="Times New Roman" w:eastAsia="黑体" w:cs="Times New Roman"/>
+          <w:b/>
+          <w:bCs/>
+          <w:kern w:val="0"/>
+          <w:sz w:val="26"/>
+          <w:szCs w:val="26"/>
+        </w:rPr>
+        <w:t xml:space="preserve">API: </w:t>
+      </w:r>
+      <w:r>
+        <w:t xml:space="preserve">Cật nhật trạng thái đơn (do nhà tuyển dụng thao tác: </w:t>
+      </w:r>
+      <w:r>
+        <w:rPr>
+          <w:rFonts w:hint="default"/>
+        </w:rPr>
+        <w:t>NTD đã xem</w:t>
+      </w:r>
+      <w:r>
+        <w:t xml:space="preserve">, </w:t>
+      </w:r>
+      <w:r>
+        <w:rPr>
+          <w:rFonts w:hint="default"/>
+        </w:rPr>
+        <w:t>Đang phỏng vấn</w:t>
+      </w:r>
+      <w:r>
+        <w:t xml:space="preserve">, </w:t>
+      </w:r>
+      <w:r>
+        <w:rPr>
+          <w:rFonts w:hint="default"/>
+        </w:rPr>
+        <w:t>Đã mời nhận việc</w:t>
+      </w:r>
+      <w:r>
+        <w:rPr>
+          <w:rFonts w:hint="default"/>
+          <w:lang w:val="en-US"/>
+        </w:rPr>
+        <w:t>, Đã từ chối</w:t>
+      </w:r>
+      <w:r>
+        <w:t>)</w:t>
+      </w:r>
+    </w:p>
+    <w:p>
+      <w:pPr>
+        <w:keepNext w:val="0"/>
+        <w:keepLines w:val="0"/>
+        <w:widowControl/>
+        <w:suppressLineNumbers w:val="0"/>
+        <w:suppressAutoHyphens/>
+        <w:spacing w:before="0" w:beforeAutospacing="0" w:after="120" w:afterAutospacing="0" w:line="360" w:lineRule="auto"/>
+        <w:ind w:left="0" w:right="0"/>
+        <w:jc w:val="left"/>
+        <w:rPr>
+          <w:rFonts w:hint="default" w:ascii="Times New Roman" w:hAnsi="Times New Roman" w:eastAsia="Calibri" w:cs="黑体"/>
+          <w:b/>
+          <w:bCs/>
+          <w:kern w:val="0"/>
+          <w:sz w:val="26"/>
+          <w:szCs w:val="26"/>
+          <w:lang w:val="en-US"/>
+        </w:rPr>
+      </w:pPr>
+      <w:r>
+        <w:rPr>
+          <w:rFonts w:hint="default" w:ascii="Times New Roman" w:hAnsi="Times New Roman" w:eastAsia="Calibri" w:cs="黑体"/>
+          <w:b/>
+          <w:bCs/>
+          <w:color w:val="auto"/>
+          <w:kern w:val="0"/>
+          <w:sz w:val="26"/>
+          <w:szCs w:val="26"/>
+          <w:lang w:val="en-US" w:eastAsia="zh-CN" w:bidi="ar"/>
+        </w:rPr>
+        <w:t>URL:</w:t>
+      </w:r>
+      <w:r>
+        <w:rPr>
+          <w:rFonts w:hint="default" w:eastAsia="Calibri" w:cs="黑体"/>
+          <w:b/>
+          <w:bCs/>
+          <w:color w:val="auto"/>
+          <w:kern w:val="0"/>
+          <w:sz w:val="26"/>
+          <w:szCs w:val="26"/>
+          <w:lang w:val="en-US" w:eastAsia="zh-CN" w:bidi="ar"/>
+        </w:rPr>
+        <w:t xml:space="preserve"> </w:t>
+      </w:r>
+      <w:r>
+        <w:rPr>
+          <w:rFonts w:hint="default" w:eastAsia="Calibri"/>
+          <w:b w:val="0"/>
+          <w:bCs w:val="0"/>
+          <w:color w:val="auto"/>
+          <w:kern w:val="0"/>
+          <w:sz w:val="26"/>
+          <w:szCs w:val="26"/>
+          <w:lang w:val="en-US" w:eastAsia="zh-CN"/>
+        </w:rPr>
+        <w:t>/applications/2/update-status/</w:t>
+      </w:r>
+    </w:p>
+    <w:p>
+      <w:pPr>
+        <w:keepNext w:val="0"/>
+        <w:keepLines w:val="0"/>
+        <w:widowControl/>
+        <w:suppressLineNumbers w:val="0"/>
+        <w:suppressAutoHyphens/>
+        <w:spacing w:before="0" w:beforeAutospacing="0" w:after="120" w:afterAutospacing="0" w:line="360" w:lineRule="auto"/>
+        <w:ind w:left="0" w:right="0"/>
+        <w:jc w:val="left"/>
+        <w:rPr>
+          <w:rFonts w:hint="default" w:ascii="Times New Roman" w:hAnsi="Times New Roman" w:eastAsia="Calibri" w:cs="黑体"/>
+          <w:b w:val="0"/>
+          <w:bCs w:val="0"/>
+          <w:kern w:val="0"/>
+          <w:sz w:val="26"/>
+          <w:szCs w:val="26"/>
+          <w:lang w:val="en-US"/>
+        </w:rPr>
+      </w:pPr>
+      <w:r>
+        <w:rPr>
+          <w:rFonts w:hint="default" w:ascii="Times New Roman" w:hAnsi="Times New Roman" w:eastAsia="Calibri" w:cs="黑体"/>
+          <w:b/>
+          <w:bCs/>
+          <w:color w:val="auto"/>
+          <w:kern w:val="0"/>
+          <w:sz w:val="26"/>
+          <w:szCs w:val="26"/>
+          <w:lang w:val="en-US" w:eastAsia="zh-CN" w:bidi="ar"/>
+        </w:rPr>
+        <w:t xml:space="preserve">Phương thức: </w:t>
+      </w:r>
+      <w:r>
+        <w:rPr>
+          <w:rFonts w:hint="default" w:eastAsia="Calibri" w:cs="黑体"/>
+          <w:b/>
+          <w:bCs/>
+          <w:color w:val="auto"/>
+          <w:kern w:val="0"/>
+          <w:sz w:val="26"/>
+          <w:szCs w:val="26"/>
+          <w:lang w:val="en-US" w:eastAsia="zh-CN" w:bidi="ar"/>
+        </w:rPr>
+        <w:t>PATCH</w:t>
+      </w:r>
+    </w:p>
+    <w:p>
+      <w:pPr>
+        <w:keepNext w:val="0"/>
+        <w:keepLines w:val="0"/>
+        <w:widowControl/>
+        <w:suppressLineNumbers w:val="0"/>
+        <w:suppressAutoHyphens/>
+        <w:spacing w:before="0" w:beforeAutospacing="0" w:after="120" w:afterAutospacing="0" w:line="360" w:lineRule="auto"/>
+        <w:ind w:left="0" w:right="0"/>
+        <w:jc w:val="left"/>
+        <w:rPr>
+          <w:rFonts w:hint="default" w:ascii="Times New Roman" w:hAnsi="Times New Roman" w:eastAsia="Calibri" w:cs="黑体"/>
+          <w:b w:val="0"/>
+          <w:bCs w:val="0"/>
+          <w:kern w:val="0"/>
+          <w:sz w:val="26"/>
+          <w:szCs w:val="26"/>
+        </w:rPr>
+      </w:pPr>
+      <w:r>
+        <w:rPr>
+          <w:rFonts w:hint="default" w:ascii="Times New Roman" w:hAnsi="Times New Roman" w:eastAsia="Calibri" w:cs="黑体"/>
+          <w:b/>
+          <w:bCs/>
+          <w:color w:val="auto"/>
+          <w:kern w:val="0"/>
+          <w:sz w:val="26"/>
+          <w:szCs w:val="26"/>
+          <w:lang w:val="en-US" w:eastAsia="zh-CN" w:bidi="ar"/>
+        </w:rPr>
+        <w:t xml:space="preserve">Mô tả: </w:t>
+      </w:r>
+      <w:r>
+        <w:rPr>
+          <w:rFonts w:hint="default" w:ascii="Times New Roman" w:hAnsi="Times New Roman" w:eastAsia="Calibri" w:cs="黑体"/>
+          <w:b w:val="0"/>
+          <w:bCs w:val="0"/>
+          <w:color w:val="auto"/>
+          <w:kern w:val="0"/>
+          <w:sz w:val="26"/>
+          <w:szCs w:val="26"/>
+          <w:lang w:val="en-US" w:eastAsia="zh-CN" w:bidi="ar"/>
+        </w:rPr>
+        <w:t xml:space="preserve">Khi người dùng đăng nhập với vai trò là </w:t>
+      </w:r>
+      <w:r>
+        <w:rPr>
+          <w:rFonts w:hint="default" w:eastAsia="Calibri" w:cs="黑体"/>
+          <w:b w:val="0"/>
+          <w:bCs w:val="0"/>
+          <w:color w:val="auto"/>
+          <w:kern w:val="0"/>
+          <w:sz w:val="26"/>
+          <w:szCs w:val="26"/>
+          <w:lang w:val="en-US" w:eastAsia="zh-CN" w:bidi="ar"/>
+        </w:rPr>
+        <w:t>nhà tuyển dụng</w:t>
+      </w:r>
+      <w:r>
+        <w:rPr>
+          <w:rFonts w:hint="default" w:ascii="Times New Roman" w:hAnsi="Times New Roman" w:eastAsia="Calibri" w:cs="黑体"/>
+          <w:b w:val="0"/>
+          <w:bCs w:val="0"/>
+          <w:color w:val="auto"/>
+          <w:kern w:val="0"/>
+          <w:sz w:val="26"/>
+          <w:szCs w:val="26"/>
+          <w:lang w:val="en-US" w:eastAsia="zh-CN" w:bidi="ar"/>
+        </w:rPr>
+        <w:t xml:space="preserve">, họ có thể </w:t>
+      </w:r>
+      <w:r>
+        <w:rPr>
+          <w:rFonts w:hint="default" w:eastAsia="Calibri" w:cs="黑体"/>
+          <w:b w:val="0"/>
+          <w:bCs w:val="0"/>
+          <w:color w:val="auto"/>
+          <w:kern w:val="0"/>
+          <w:sz w:val="26"/>
+          <w:szCs w:val="26"/>
+          <w:lang w:val="en-US" w:eastAsia="zh-CN" w:bidi="ar"/>
+        </w:rPr>
+        <w:t xml:space="preserve">cập nhật trạng thái đơn ứng tuyển như trạng thái: </w:t>
+      </w:r>
+      <w:r>
+        <w:rPr>
+          <w:rFonts w:hint="default" w:eastAsia="Calibri"/>
+          <w:b w:val="0"/>
+          <w:bCs w:val="0"/>
+          <w:color w:val="auto"/>
+          <w:kern w:val="0"/>
+          <w:sz w:val="26"/>
+          <w:szCs w:val="26"/>
+          <w:lang w:val="en-US" w:eastAsia="zh-CN"/>
+        </w:rPr>
+        <w:t>NTD đã xem, Đang phỏng vấn, Đã mời nhận việc, Đã từ chối</w:t>
+      </w:r>
+      <w:r>
+        <w:rPr>
+          <w:rFonts w:hint="default" w:ascii="Times New Roman" w:hAnsi="Times New Roman" w:eastAsia="Calibri" w:cs="黑体"/>
+          <w:b w:val="0"/>
+          <w:bCs w:val="0"/>
+          <w:color w:val="auto"/>
+          <w:kern w:val="0"/>
+          <w:sz w:val="26"/>
+          <w:szCs w:val="26"/>
+          <w:lang w:val="en-US" w:eastAsia="zh-CN" w:bidi="ar"/>
+        </w:rPr>
+        <w:t>.</w:t>
+      </w:r>
+    </w:p>
+    <w:p>
+      <w:pPr>
+        <w:keepNext w:val="0"/>
+        <w:keepLines w:val="0"/>
+        <w:widowControl/>
+        <w:suppressLineNumbers w:val="0"/>
+        <w:suppressAutoHyphens/>
+        <w:spacing w:before="0" w:beforeAutospacing="0" w:after="120" w:afterAutospacing="0" w:line="360" w:lineRule="auto"/>
+        <w:ind w:left="0" w:right="0"/>
+        <w:jc w:val="left"/>
+        <w:rPr>
+          <w:rFonts w:hint="default"/>
+          <w:b w:val="0"/>
+          <w:bCs w:val="0"/>
+        </w:rPr>
+      </w:pPr>
+      <w:r>
+        <w:rPr>
+          <w:rFonts w:hint="default" w:ascii="Times New Roman" w:hAnsi="Times New Roman" w:eastAsia="Calibri" w:cs="黑体"/>
+          <w:b/>
+          <w:bCs/>
+          <w:color w:val="auto"/>
+          <w:kern w:val="0"/>
+          <w:sz w:val="26"/>
+          <w:szCs w:val="26"/>
+          <w:lang w:val="en-US" w:eastAsia="zh-CN" w:bidi="ar"/>
+        </w:rPr>
+        <w:t>Request:</w:t>
+      </w:r>
+      <w:r>
+        <w:rPr>
+          <w:rFonts w:hint="default" w:eastAsia="Calibri" w:cs="黑体"/>
+          <w:b/>
+          <w:bCs/>
+          <w:color w:val="auto"/>
+          <w:kern w:val="0"/>
+          <w:sz w:val="26"/>
+          <w:szCs w:val="26"/>
+          <w:lang w:val="en-US" w:eastAsia="zh-CN" w:bidi="ar"/>
+        </w:rPr>
+        <w:t xml:space="preserve"> </w:t>
+      </w:r>
+      <w:r>
+        <w:rPr>
+          <w:rFonts w:hint="default"/>
+          <w:b w:val="0"/>
+          <w:bCs w:val="0"/>
+        </w:rPr>
+        <w:t>Header có Authorization: Bearer &lt;token&gt;</w:t>
+      </w:r>
+    </w:p>
+    <w:p>
+      <w:pPr>
+        <w:pStyle w:val="20"/>
+        <w:keepNext w:val="0"/>
+        <w:keepLines w:val="0"/>
+        <w:widowControl/>
+        <w:suppressLineNumbers w:val="0"/>
+      </w:pPr>
+      <w:r>
+        <w:t>{</w:t>
+      </w:r>
+    </w:p>
+    <w:p>
+      <w:pPr>
+        <w:pStyle w:val="20"/>
+        <w:keepNext w:val="0"/>
+        <w:keepLines w:val="0"/>
+        <w:widowControl/>
+        <w:suppressLineNumbers w:val="0"/>
+      </w:pPr>
+      <w:r>
+        <w:t>"status": "Viewed|Interviewing|Offered|Rejected"</w:t>
+      </w:r>
+    </w:p>
+    <w:p>
+      <w:pPr>
+        <w:pStyle w:val="20"/>
+        <w:keepNext w:val="0"/>
+        <w:keepLines w:val="0"/>
+        <w:widowControl/>
+        <w:suppressLineNumbers w:val="0"/>
+        <w:rPr>
+          <w:rFonts w:hint="default"/>
+          <w:b w:val="0"/>
+          <w:bCs w:val="0"/>
+          <w:lang w:val="en-US"/>
+        </w:rPr>
+      </w:pPr>
+      <w:r>
+        <w:t>}</w:t>
+      </w:r>
+    </w:p>
+    <w:p>
+      <w:pPr>
+        <w:keepNext w:val="0"/>
+        <w:keepLines w:val="0"/>
+        <w:widowControl/>
+        <w:suppressLineNumbers w:val="0"/>
+        <w:suppressAutoHyphens/>
+        <w:spacing w:before="0" w:beforeAutospacing="0" w:after="120" w:afterAutospacing="0" w:line="360" w:lineRule="auto"/>
+        <w:ind w:left="0" w:right="0"/>
+        <w:jc w:val="left"/>
+        <w:rPr>
+          <w:rFonts w:hint="default" w:ascii="Times New Roman" w:hAnsi="Times New Roman" w:eastAsia="Calibri" w:cs="黑体"/>
+          <w:b/>
+          <w:bCs/>
+          <w:color w:val="auto"/>
+          <w:kern w:val="0"/>
+          <w:sz w:val="26"/>
+          <w:szCs w:val="26"/>
+          <w:lang w:val="en-US" w:eastAsia="zh-CN" w:bidi="ar"/>
+        </w:rPr>
+      </w:pPr>
+      <w:r>
+        <w:rPr>
+          <w:rFonts w:hint="default" w:ascii="Times New Roman" w:hAnsi="Times New Roman" w:eastAsia="Calibri" w:cs="黑体"/>
+          <w:b/>
+          <w:bCs/>
+          <w:color w:val="auto"/>
+          <w:kern w:val="0"/>
+          <w:sz w:val="26"/>
+          <w:szCs w:val="26"/>
+          <w:lang w:val="en-US" w:eastAsia="zh-CN" w:bidi="ar"/>
+        </w:rPr>
+        <w:t>Response:</w:t>
+      </w:r>
+    </w:p>
+    <w:p>
+      <w:pPr>
+        <w:keepNext w:val="0"/>
+        <w:keepLines w:val="0"/>
+        <w:widowControl/>
+        <w:suppressLineNumbers w:val="0"/>
+        <w:suppressAutoHyphens/>
+        <w:spacing w:before="0" w:beforeAutospacing="0" w:after="120" w:afterAutospacing="0" w:line="360" w:lineRule="auto"/>
+        <w:ind w:left="0" w:right="0"/>
+        <w:jc w:val="left"/>
+        <w:rPr>
+          <w:rFonts w:hint="default" w:ascii="Times New Roman" w:hAnsi="Times New Roman" w:eastAsia="Calibri"/>
+          <w:b w:val="0"/>
+          <w:bCs w:val="0"/>
+          <w:color w:val="auto"/>
+          <w:kern w:val="0"/>
+          <w:sz w:val="26"/>
+          <w:szCs w:val="26"/>
+          <w:lang w:val="en-US" w:eastAsia="zh-CN"/>
+        </w:rPr>
+      </w:pPr>
+      <w:r>
+        <w:rPr>
+          <w:rFonts w:hint="default" w:ascii="Times New Roman" w:hAnsi="Times New Roman" w:eastAsia="Calibri"/>
+          <w:b w:val="0"/>
+          <w:bCs w:val="0"/>
+          <w:color w:val="auto"/>
+          <w:kern w:val="0"/>
+          <w:sz w:val="26"/>
+          <w:szCs w:val="26"/>
+          <w:lang w:val="en-US" w:eastAsia="zh-CN"/>
+        </w:rPr>
+        <w:t>{</w:t>
+      </w:r>
+    </w:p>
+    <w:p>
+      <w:pPr>
+        <w:keepNext w:val="0"/>
+        <w:keepLines w:val="0"/>
+        <w:widowControl/>
+        <w:suppressLineNumbers w:val="0"/>
+        <w:suppressAutoHyphens/>
+        <w:spacing w:before="0" w:beforeAutospacing="0" w:after="120" w:afterAutospacing="0" w:line="360" w:lineRule="auto"/>
+        <w:ind w:left="0" w:right="0"/>
+        <w:jc w:val="left"/>
+        <w:rPr>
+          <w:rFonts w:hint="default" w:ascii="Times New Roman" w:hAnsi="Times New Roman" w:eastAsia="Calibri"/>
+          <w:b w:val="0"/>
+          <w:bCs w:val="0"/>
+          <w:color w:val="auto"/>
+          <w:kern w:val="0"/>
+          <w:sz w:val="26"/>
+          <w:szCs w:val="26"/>
+          <w:lang w:val="en-US" w:eastAsia="zh-CN"/>
+        </w:rPr>
+      </w:pPr>
+      <w:r>
+        <w:rPr>
+          <w:rFonts w:hint="default" w:ascii="Times New Roman" w:hAnsi="Times New Roman" w:eastAsia="Calibri"/>
+          <w:b w:val="0"/>
+          <w:bCs w:val="0"/>
+          <w:color w:val="auto"/>
+          <w:kern w:val="0"/>
+          <w:sz w:val="26"/>
+          <w:szCs w:val="26"/>
+          <w:lang w:val="en-US" w:eastAsia="zh-CN"/>
+        </w:rPr>
+        <w:t xml:space="preserve">    "id": 2,</w:t>
+      </w:r>
+    </w:p>
+    <w:p>
+      <w:pPr>
+        <w:keepNext w:val="0"/>
+        <w:keepLines w:val="0"/>
+        <w:widowControl/>
+        <w:suppressLineNumbers w:val="0"/>
+        <w:suppressAutoHyphens/>
+        <w:spacing w:before="0" w:beforeAutospacing="0" w:after="120" w:afterAutospacing="0" w:line="360" w:lineRule="auto"/>
+        <w:ind w:left="0" w:right="0"/>
+        <w:jc w:val="left"/>
+        <w:rPr>
+          <w:rFonts w:hint="default" w:ascii="Times New Roman" w:hAnsi="Times New Roman" w:eastAsia="Calibri"/>
+          <w:b w:val="0"/>
+          <w:bCs w:val="0"/>
+          <w:color w:val="auto"/>
+          <w:kern w:val="0"/>
+          <w:sz w:val="26"/>
+          <w:szCs w:val="26"/>
+          <w:lang w:val="en-US" w:eastAsia="zh-CN"/>
+        </w:rPr>
+      </w:pPr>
+      <w:r>
+        <w:rPr>
+          <w:rFonts w:hint="default" w:ascii="Times New Roman" w:hAnsi="Times New Roman" w:eastAsia="Calibri"/>
+          <w:b w:val="0"/>
+          <w:bCs w:val="0"/>
+          <w:color w:val="auto"/>
+          <w:kern w:val="0"/>
+          <w:sz w:val="26"/>
+          <w:szCs w:val="26"/>
+          <w:lang w:val="en-US" w:eastAsia="zh-CN"/>
+        </w:rPr>
+        <w:t xml:space="preserve">    "my_user": 2,</w:t>
+      </w:r>
+    </w:p>
+    <w:p>
+      <w:pPr>
+        <w:keepNext w:val="0"/>
+        <w:keepLines w:val="0"/>
+        <w:widowControl/>
+        <w:suppressLineNumbers w:val="0"/>
+        <w:suppressAutoHyphens/>
+        <w:spacing w:before="0" w:beforeAutospacing="0" w:after="120" w:afterAutospacing="0" w:line="360" w:lineRule="auto"/>
+        <w:ind w:left="0" w:right="0"/>
+        <w:jc w:val="left"/>
+        <w:rPr>
+          <w:rFonts w:hint="default" w:ascii="Times New Roman" w:hAnsi="Times New Roman" w:eastAsia="Calibri"/>
+          <w:b w:val="0"/>
+          <w:bCs w:val="0"/>
+          <w:color w:val="auto"/>
+          <w:kern w:val="0"/>
+          <w:sz w:val="26"/>
+          <w:szCs w:val="26"/>
+          <w:lang w:val="en-US" w:eastAsia="zh-CN"/>
+        </w:rPr>
+      </w:pPr>
+      <w:r>
+        <w:rPr>
+          <w:rFonts w:hint="default" w:ascii="Times New Roman" w:hAnsi="Times New Roman" w:eastAsia="Calibri"/>
+          <w:b w:val="0"/>
+          <w:bCs w:val="0"/>
+          <w:color w:val="auto"/>
+          <w:kern w:val="0"/>
+          <w:sz w:val="26"/>
+          <w:szCs w:val="26"/>
+          <w:lang w:val="en-US" w:eastAsia="zh-CN"/>
+        </w:rPr>
+        <w:t xml:space="preserve">    "job_posting": "24da05ff-6666-4056-a8ba-5872af6822b8",</w:t>
+      </w:r>
+    </w:p>
+    <w:p>
+      <w:pPr>
+        <w:keepNext w:val="0"/>
+        <w:keepLines w:val="0"/>
+        <w:widowControl/>
+        <w:suppressLineNumbers w:val="0"/>
+        <w:suppressAutoHyphens/>
+        <w:spacing w:before="0" w:beforeAutospacing="0" w:after="120" w:afterAutospacing="0" w:line="360" w:lineRule="auto"/>
+        <w:ind w:left="0" w:right="0"/>
+        <w:jc w:val="left"/>
+        <w:rPr>
+          <w:rFonts w:hint="default" w:ascii="Times New Roman" w:hAnsi="Times New Roman" w:eastAsia="Calibri"/>
+          <w:b w:val="0"/>
+          <w:bCs w:val="0"/>
+          <w:color w:val="auto"/>
+          <w:kern w:val="0"/>
+          <w:sz w:val="26"/>
+          <w:szCs w:val="26"/>
+          <w:lang w:val="en-US" w:eastAsia="zh-CN"/>
+        </w:rPr>
+      </w:pPr>
+      <w:r>
+        <w:rPr>
+          <w:rFonts w:hint="default" w:ascii="Times New Roman" w:hAnsi="Times New Roman" w:eastAsia="Calibri"/>
+          <w:b w:val="0"/>
+          <w:bCs w:val="0"/>
+          <w:color w:val="auto"/>
+          <w:kern w:val="0"/>
+          <w:sz w:val="26"/>
+          <w:szCs w:val="26"/>
+          <w:lang w:val="en-US" w:eastAsia="zh-CN"/>
+        </w:rPr>
+        <w:t xml:space="preserve">    "cv": 21,</w:t>
+      </w:r>
+    </w:p>
+    <w:p>
+      <w:pPr>
+        <w:keepNext w:val="0"/>
+        <w:keepLines w:val="0"/>
+        <w:widowControl/>
+        <w:suppressLineNumbers w:val="0"/>
+        <w:suppressAutoHyphens/>
+        <w:spacing w:before="0" w:beforeAutospacing="0" w:after="120" w:afterAutospacing="0" w:line="360" w:lineRule="auto"/>
+        <w:ind w:left="0" w:right="0"/>
+        <w:jc w:val="left"/>
+        <w:rPr>
+          <w:rFonts w:hint="default" w:ascii="Times New Roman" w:hAnsi="Times New Roman" w:eastAsia="Calibri"/>
+          <w:b w:val="0"/>
+          <w:bCs w:val="0"/>
+          <w:color w:val="auto"/>
+          <w:kern w:val="0"/>
+          <w:sz w:val="26"/>
+          <w:szCs w:val="26"/>
+          <w:lang w:val="en-US" w:eastAsia="zh-CN"/>
+        </w:rPr>
+      </w:pPr>
+      <w:r>
+        <w:rPr>
+          <w:rFonts w:hint="default" w:ascii="Times New Roman" w:hAnsi="Times New Roman" w:eastAsia="Calibri"/>
+          <w:b w:val="0"/>
+          <w:bCs w:val="0"/>
+          <w:color w:val="auto"/>
+          <w:kern w:val="0"/>
+          <w:sz w:val="26"/>
+          <w:szCs w:val="26"/>
+          <w:lang w:val="en-US" w:eastAsia="zh-CN"/>
+        </w:rPr>
+        <w:t xml:space="preserve">    "status": "Rejected",</w:t>
+      </w:r>
+    </w:p>
+    <w:p>
+      <w:pPr>
+        <w:keepNext w:val="0"/>
+        <w:keepLines w:val="0"/>
+        <w:widowControl/>
+        <w:suppressLineNumbers w:val="0"/>
+        <w:suppressAutoHyphens/>
+        <w:spacing w:before="0" w:beforeAutospacing="0" w:after="120" w:afterAutospacing="0" w:line="360" w:lineRule="auto"/>
+        <w:ind w:left="0" w:right="0"/>
+        <w:jc w:val="left"/>
+        <w:rPr>
+          <w:rFonts w:hint="default" w:ascii="Times New Roman" w:hAnsi="Times New Roman" w:eastAsia="Calibri"/>
+          <w:b w:val="0"/>
+          <w:bCs w:val="0"/>
+          <w:color w:val="auto"/>
+          <w:kern w:val="0"/>
+          <w:sz w:val="26"/>
+          <w:szCs w:val="26"/>
+          <w:lang w:val="en-US" w:eastAsia="zh-CN"/>
+        </w:rPr>
+      </w:pPr>
+      <w:r>
+        <w:rPr>
+          <w:rFonts w:hint="default" w:ascii="Times New Roman" w:hAnsi="Times New Roman" w:eastAsia="Calibri"/>
+          <w:b w:val="0"/>
+          <w:bCs w:val="0"/>
+          <w:color w:val="auto"/>
+          <w:kern w:val="0"/>
+          <w:sz w:val="26"/>
+          <w:szCs w:val="26"/>
+          <w:lang w:val="en-US" w:eastAsia="zh-CN"/>
+        </w:rPr>
+        <w:t xml:space="preserve">    "cover_letter": "Đây là CV của Nguyễn Tấn Lộc muốn Apply vào công việc này",</w:t>
+      </w:r>
+    </w:p>
+    <w:p>
+      <w:pPr>
+        <w:keepNext w:val="0"/>
+        <w:keepLines w:val="0"/>
+        <w:widowControl/>
+        <w:suppressLineNumbers w:val="0"/>
+        <w:suppressAutoHyphens/>
+        <w:spacing w:before="0" w:beforeAutospacing="0" w:after="120" w:afterAutospacing="0" w:line="360" w:lineRule="auto"/>
+        <w:ind w:left="0" w:right="0"/>
+        <w:jc w:val="left"/>
+        <w:rPr>
+          <w:rFonts w:hint="default" w:ascii="Times New Roman" w:hAnsi="Times New Roman" w:eastAsia="Calibri"/>
+          <w:b w:val="0"/>
+          <w:bCs w:val="0"/>
+          <w:color w:val="auto"/>
+          <w:kern w:val="0"/>
+          <w:sz w:val="26"/>
+          <w:szCs w:val="26"/>
+          <w:lang w:val="en-US" w:eastAsia="zh-CN"/>
+        </w:rPr>
+      </w:pPr>
+      <w:r>
+        <w:rPr>
+          <w:rFonts w:hint="default" w:ascii="Times New Roman" w:hAnsi="Times New Roman" w:eastAsia="Calibri"/>
+          <w:b w:val="0"/>
+          <w:bCs w:val="0"/>
+          <w:color w:val="auto"/>
+          <w:kern w:val="0"/>
+          <w:sz w:val="26"/>
+          <w:szCs w:val="26"/>
+          <w:lang w:val="en-US" w:eastAsia="zh-CN"/>
+        </w:rPr>
+        <w:t xml:space="preserve">    "created_at": "2025-05-27T14:42:11.470749Z",</w:t>
+      </w:r>
+    </w:p>
+    <w:p>
+      <w:pPr>
+        <w:keepNext w:val="0"/>
+        <w:keepLines w:val="0"/>
+        <w:widowControl/>
+        <w:suppressLineNumbers w:val="0"/>
+        <w:suppressAutoHyphens/>
+        <w:spacing w:before="0" w:beforeAutospacing="0" w:after="120" w:afterAutospacing="0" w:line="360" w:lineRule="auto"/>
+        <w:ind w:left="0" w:right="0"/>
+        <w:jc w:val="left"/>
+        <w:rPr>
+          <w:rFonts w:hint="default" w:ascii="Times New Roman" w:hAnsi="Times New Roman" w:eastAsia="Calibri"/>
+          <w:b w:val="0"/>
+          <w:bCs w:val="0"/>
+          <w:color w:val="auto"/>
+          <w:kern w:val="0"/>
+          <w:sz w:val="26"/>
+          <w:szCs w:val="26"/>
+          <w:lang w:val="en-US" w:eastAsia="zh-CN"/>
+        </w:rPr>
+      </w:pPr>
+      <w:r>
+        <w:rPr>
+          <w:rFonts w:hint="default" w:ascii="Times New Roman" w:hAnsi="Times New Roman" w:eastAsia="Calibri"/>
+          <w:b w:val="0"/>
+          <w:bCs w:val="0"/>
+          <w:color w:val="auto"/>
+          <w:kern w:val="0"/>
+          <w:sz w:val="26"/>
+          <w:szCs w:val="26"/>
+          <w:lang w:val="en-US" w:eastAsia="zh-CN"/>
+        </w:rPr>
+        <w:t xml:space="preserve">    "updated_at": "2025-05-27T14:51:10.535475Z",</w:t>
+      </w:r>
+    </w:p>
+    <w:p>
+      <w:pPr>
+        <w:keepNext w:val="0"/>
+        <w:keepLines w:val="0"/>
+        <w:widowControl/>
+        <w:suppressLineNumbers w:val="0"/>
+        <w:suppressAutoHyphens/>
+        <w:spacing w:before="0" w:beforeAutospacing="0" w:after="120" w:afterAutospacing="0" w:line="360" w:lineRule="auto"/>
+        <w:ind w:left="0" w:right="0"/>
+        <w:jc w:val="left"/>
+        <w:rPr>
+          <w:rFonts w:hint="default" w:ascii="Times New Roman" w:hAnsi="Times New Roman" w:eastAsia="Calibri"/>
+          <w:b w:val="0"/>
+          <w:bCs w:val="0"/>
+          <w:color w:val="auto"/>
+          <w:kern w:val="0"/>
+          <w:sz w:val="26"/>
+          <w:szCs w:val="26"/>
+          <w:lang w:val="en-US" w:eastAsia="zh-CN"/>
+        </w:rPr>
+      </w:pPr>
+      <w:r>
+        <w:rPr>
+          <w:rFonts w:hint="default" w:ascii="Times New Roman" w:hAnsi="Times New Roman" w:eastAsia="Calibri"/>
+          <w:b w:val="0"/>
+          <w:bCs w:val="0"/>
+          <w:color w:val="auto"/>
+          <w:kern w:val="0"/>
+          <w:sz w:val="26"/>
+          <w:szCs w:val="26"/>
+          <w:lang w:val="en-US" w:eastAsia="zh-CN"/>
+        </w:rPr>
+        <w:t xml:space="preserve">    "job_posting_title": "Chúng tôi cần tuyển tiền đạo hàng đầu nước Anh",</w:t>
+      </w:r>
+    </w:p>
+    <w:p>
+      <w:pPr>
+        <w:keepNext w:val="0"/>
+        <w:keepLines w:val="0"/>
+        <w:widowControl/>
+        <w:suppressLineNumbers w:val="0"/>
+        <w:suppressAutoHyphens/>
+        <w:spacing w:before="0" w:beforeAutospacing="0" w:after="120" w:afterAutospacing="0" w:line="360" w:lineRule="auto"/>
+        <w:ind w:left="0" w:right="0"/>
+        <w:jc w:val="left"/>
+        <w:rPr>
+          <w:rFonts w:hint="default" w:ascii="Times New Roman" w:hAnsi="Times New Roman" w:eastAsia="Calibri"/>
+          <w:b w:val="0"/>
+          <w:bCs w:val="0"/>
+          <w:color w:val="auto"/>
+          <w:kern w:val="0"/>
+          <w:sz w:val="26"/>
+          <w:szCs w:val="26"/>
+          <w:lang w:val="en-US" w:eastAsia="zh-CN"/>
+        </w:rPr>
+      </w:pPr>
+      <w:r>
+        <w:rPr>
+          <w:rFonts w:hint="default" w:ascii="Times New Roman" w:hAnsi="Times New Roman" w:eastAsia="Calibri"/>
+          <w:b w:val="0"/>
+          <w:bCs w:val="0"/>
+          <w:color w:val="auto"/>
+          <w:kern w:val="0"/>
+          <w:sz w:val="26"/>
+          <w:szCs w:val="26"/>
+          <w:lang w:val="en-US" w:eastAsia="zh-CN"/>
+        </w:rPr>
+        <w:t xml:space="preserve">    "job_seeker_username": "JobSeeker1",</w:t>
+      </w:r>
+    </w:p>
+    <w:p>
+      <w:pPr>
+        <w:keepNext w:val="0"/>
+        <w:keepLines w:val="0"/>
+        <w:widowControl/>
+        <w:suppressLineNumbers w:val="0"/>
+        <w:suppressAutoHyphens/>
+        <w:spacing w:before="0" w:beforeAutospacing="0" w:after="120" w:afterAutospacing="0" w:line="360" w:lineRule="auto"/>
+        <w:ind w:left="0" w:right="0"/>
+        <w:jc w:val="left"/>
+        <w:rPr>
+          <w:rFonts w:hint="default" w:ascii="Times New Roman" w:hAnsi="Times New Roman" w:eastAsia="Calibri"/>
+          <w:b w:val="0"/>
+          <w:bCs w:val="0"/>
+          <w:color w:val="auto"/>
+          <w:kern w:val="0"/>
+          <w:sz w:val="26"/>
+          <w:szCs w:val="26"/>
+          <w:lang w:val="en-US" w:eastAsia="zh-CN"/>
+        </w:rPr>
+      </w:pPr>
+      <w:r>
+        <w:rPr>
+          <w:rFonts w:hint="default" w:ascii="Times New Roman" w:hAnsi="Times New Roman" w:eastAsia="Calibri"/>
+          <w:b w:val="0"/>
+          <w:bCs w:val="0"/>
+          <w:color w:val="auto"/>
+          <w:kern w:val="0"/>
+          <w:sz w:val="26"/>
+          <w:szCs w:val="26"/>
+          <w:lang w:val="en-US" w:eastAsia="zh-CN"/>
+        </w:rPr>
+        <w:t xml:space="preserve">    "cv_url": "https://res.cloudinary.com/dlysaj8pb/raw/upload/v1747585614/cvs/rg4qmz598e3zitbqwrkc.png",</w:t>
+      </w:r>
+    </w:p>
+    <w:p>
+      <w:pPr>
+        <w:keepNext w:val="0"/>
+        <w:keepLines w:val="0"/>
+        <w:widowControl/>
+        <w:suppressLineNumbers w:val="0"/>
+        <w:suppressAutoHyphens/>
+        <w:spacing w:before="0" w:beforeAutospacing="0" w:after="120" w:afterAutospacing="0" w:line="360" w:lineRule="auto"/>
+        <w:ind w:left="0" w:right="0"/>
+        <w:jc w:val="left"/>
+        <w:rPr>
+          <w:rFonts w:hint="default" w:ascii="Times New Roman" w:hAnsi="Times New Roman" w:eastAsia="Calibri"/>
+          <w:b w:val="0"/>
+          <w:bCs w:val="0"/>
+          <w:color w:val="auto"/>
+          <w:kern w:val="0"/>
+          <w:sz w:val="26"/>
+          <w:szCs w:val="26"/>
+          <w:lang w:val="en-US" w:eastAsia="zh-CN"/>
+        </w:rPr>
+      </w:pPr>
+      <w:r>
+        <w:rPr>
+          <w:rFonts w:hint="default" w:ascii="Times New Roman" w:hAnsi="Times New Roman" w:eastAsia="Calibri"/>
+          <w:b w:val="0"/>
+          <w:bCs w:val="0"/>
+          <w:color w:val="auto"/>
+          <w:kern w:val="0"/>
+          <w:sz w:val="26"/>
+          <w:szCs w:val="26"/>
+          <w:lang w:val="en-US" w:eastAsia="zh-CN"/>
+        </w:rPr>
+        <w:t xml:space="preserve">    "recruiter_company": "Công ty Bóng đá hàng đầu trời Âu"</w:t>
+      </w:r>
+    </w:p>
+    <w:p>
+      <w:pPr>
+        <w:keepNext w:val="0"/>
+        <w:keepLines w:val="0"/>
+        <w:widowControl/>
+        <w:suppressLineNumbers w:val="0"/>
+        <w:suppressAutoHyphens/>
+        <w:spacing w:before="0" w:beforeAutospacing="0" w:after="120" w:afterAutospacing="0" w:line="360" w:lineRule="auto"/>
+        <w:ind w:left="0" w:right="0"/>
+        <w:jc w:val="left"/>
+        <w:rPr>
+          <w:rFonts w:hint="default" w:ascii="Times New Roman" w:hAnsi="Times New Roman" w:eastAsia="Calibri" w:cs="黑体"/>
+          <w:b w:val="0"/>
+          <w:bCs w:val="0"/>
+          <w:color w:val="auto"/>
+          <w:kern w:val="0"/>
+          <w:sz w:val="26"/>
+          <w:szCs w:val="26"/>
+          <w:lang w:val="en-US" w:eastAsia="zh-CN" w:bidi="ar"/>
+        </w:rPr>
+      </w:pPr>
+      <w:r>
+        <w:rPr>
+          <w:rFonts w:hint="default" w:ascii="Times New Roman" w:hAnsi="Times New Roman" w:eastAsia="Calibri"/>
+          <w:b w:val="0"/>
+          <w:bCs w:val="0"/>
+          <w:color w:val="auto"/>
+          <w:kern w:val="0"/>
+          <w:sz w:val="26"/>
+          <w:szCs w:val="26"/>
+          <w:lang w:val="en-US" w:eastAsia="zh-CN"/>
+        </w:rPr>
+        <w:t>}</w:t>
+      </w:r>
+    </w:p>
+    <w:p>
+      <w:pPr>
+        <w:pStyle w:val="4"/>
+        <w:numPr>
+          <w:ilvl w:val="2"/>
+          <w:numId w:val="0"/>
+        </w:numPr>
+        <w:tabs>
+          <w:tab w:val="clear" w:pos="1440"/>
+        </w:tabs>
+        <w:ind w:right="0" w:rightChars="0"/>
+        <w:outlineLvl w:val="2"/>
+      </w:pPr>
+      <w:r>
+        <w:rPr>
+          <w:rFonts w:hint="default"/>
+          <w:lang w:val="en-US"/>
+        </w:rPr>
+        <w:t xml:space="preserve">2.4.4. </w:t>
+      </w:r>
+      <w:r>
+        <w:t>Rút lui không ứng tuyển nữa</w:t>
+      </w:r>
+    </w:p>
+    <w:p>
+      <w:pPr>
+        <w:pStyle w:val="4"/>
+        <w:widowControl/>
+        <w:numPr>
+          <w:ilvl w:val="2"/>
+          <w:numId w:val="0"/>
+        </w:numPr>
+        <w:tabs>
+          <w:tab w:val="clear" w:pos="1440"/>
+        </w:tabs>
+        <w:ind w:right="0" w:rightChars="0"/>
+        <w:outlineLvl w:val="2"/>
+        <w:rPr>
+          <w:rFonts w:hint="default" w:ascii="Times New Roman" w:hAnsi="Times New Roman" w:eastAsia="黑体" w:cs="Times New Roman"/>
+          <w:b/>
+          <w:bCs/>
+          <w:kern w:val="0"/>
+          <w:sz w:val="26"/>
+          <w:szCs w:val="26"/>
+        </w:rPr>
+      </w:pPr>
+      <w:r>
+        <w:rPr>
+          <w:rFonts w:hint="default" w:ascii="Times New Roman" w:hAnsi="Times New Roman" w:eastAsia="黑体" w:cs="Times New Roman"/>
+          <w:b/>
+          <w:bCs/>
+          <w:kern w:val="0"/>
+          <w:sz w:val="26"/>
+          <w:szCs w:val="26"/>
+        </w:rPr>
+        <w:t xml:space="preserve">API: </w:t>
+      </w:r>
+      <w:r>
+        <w:t>Rút lui không ứng tuyển nữa</w:t>
+      </w:r>
+    </w:p>
+    <w:p>
+      <w:pPr>
+        <w:keepNext w:val="0"/>
+        <w:keepLines w:val="0"/>
+        <w:widowControl/>
+        <w:suppressLineNumbers w:val="0"/>
+        <w:suppressAutoHyphens/>
+        <w:spacing w:before="0" w:beforeAutospacing="0" w:after="120" w:afterAutospacing="0" w:line="360" w:lineRule="auto"/>
+        <w:ind w:left="0" w:right="0"/>
+        <w:jc w:val="left"/>
+        <w:rPr>
+          <w:rFonts w:hint="default" w:ascii="Times New Roman" w:hAnsi="Times New Roman" w:eastAsia="Calibri" w:cs="黑体"/>
+          <w:b/>
+          <w:bCs/>
+          <w:kern w:val="0"/>
+          <w:sz w:val="26"/>
+          <w:szCs w:val="26"/>
+        </w:rPr>
+      </w:pPr>
+      <w:r>
+        <w:rPr>
+          <w:rFonts w:hint="default" w:ascii="Times New Roman" w:hAnsi="Times New Roman" w:eastAsia="Calibri" w:cs="黑体"/>
+          <w:b/>
+          <w:bCs/>
+          <w:color w:val="auto"/>
+          <w:kern w:val="0"/>
+          <w:sz w:val="26"/>
+          <w:szCs w:val="26"/>
+          <w:lang w:val="en-US" w:eastAsia="zh-CN" w:bidi="ar"/>
+        </w:rPr>
+        <w:t>URL:</w:t>
+      </w:r>
+      <w:r>
+        <w:rPr>
+          <w:rFonts w:hint="default" w:ascii="Times New Roman" w:hAnsi="Times New Roman" w:eastAsia="Calibri" w:cs="黑体"/>
+          <w:b w:val="0"/>
+          <w:bCs w:val="0"/>
+          <w:color w:val="auto"/>
+          <w:kern w:val="0"/>
+          <w:sz w:val="26"/>
+          <w:szCs w:val="26"/>
+          <w:lang w:val="en-US" w:eastAsia="zh-CN" w:bidi="ar"/>
+        </w:rPr>
+        <w:t xml:space="preserve"> </w:t>
+      </w:r>
+      <w:r>
+        <w:rPr>
+          <w:rFonts w:hint="default" w:ascii="Times New Roman" w:hAnsi="Times New Roman" w:eastAsia="Calibri"/>
+          <w:b w:val="0"/>
+          <w:bCs w:val="0"/>
+          <w:color w:val="auto"/>
+          <w:kern w:val="0"/>
+          <w:sz w:val="26"/>
+          <w:szCs w:val="26"/>
+          <w:lang w:val="en-US" w:eastAsia="zh-CN"/>
+        </w:rPr>
+        <w:t>/applications/</w:t>
+      </w:r>
+      <w:r>
+        <w:rPr>
+          <w:rFonts w:hint="default" w:eastAsia="Calibri"/>
+          <w:b w:val="0"/>
+          <w:bCs w:val="0"/>
+          <w:color w:val="auto"/>
+          <w:kern w:val="0"/>
+          <w:sz w:val="26"/>
+          <w:szCs w:val="26"/>
+          <w:lang w:val="en-US" w:eastAsia="zh-CN"/>
+        </w:rPr>
+        <w:t>2</w:t>
+      </w:r>
+      <w:r>
+        <w:rPr>
+          <w:rFonts w:hint="default" w:ascii="Times New Roman" w:hAnsi="Times New Roman" w:eastAsia="Calibri"/>
+          <w:b w:val="0"/>
+          <w:bCs w:val="0"/>
+          <w:color w:val="auto"/>
+          <w:kern w:val="0"/>
+          <w:sz w:val="26"/>
+          <w:szCs w:val="26"/>
+          <w:lang w:val="en-US" w:eastAsia="zh-CN"/>
+        </w:rPr>
+        <w:t>/withdraw/</w:t>
+      </w:r>
+    </w:p>
+    <w:p>
+      <w:pPr>
+        <w:keepNext w:val="0"/>
+        <w:keepLines w:val="0"/>
+        <w:widowControl/>
+        <w:suppressLineNumbers w:val="0"/>
+        <w:suppressAutoHyphens/>
+        <w:spacing w:before="0" w:beforeAutospacing="0" w:after="120" w:afterAutospacing="0" w:line="360" w:lineRule="auto"/>
+        <w:ind w:left="0" w:right="0"/>
+        <w:jc w:val="left"/>
+        <w:rPr>
+          <w:rFonts w:hint="default" w:ascii="Times New Roman" w:hAnsi="Times New Roman" w:eastAsia="Calibri" w:cs="黑体"/>
+          <w:b w:val="0"/>
+          <w:bCs w:val="0"/>
+          <w:kern w:val="0"/>
+          <w:sz w:val="26"/>
+          <w:szCs w:val="26"/>
+          <w:lang w:val="en-US"/>
+        </w:rPr>
+      </w:pPr>
+      <w:r>
+        <w:rPr>
+          <w:rFonts w:hint="default" w:ascii="Times New Roman" w:hAnsi="Times New Roman" w:eastAsia="Calibri" w:cs="黑体"/>
+          <w:b/>
+          <w:bCs/>
+          <w:color w:val="auto"/>
+          <w:kern w:val="0"/>
+          <w:sz w:val="26"/>
+          <w:szCs w:val="26"/>
+          <w:lang w:val="en-US" w:eastAsia="zh-CN" w:bidi="ar"/>
+        </w:rPr>
+        <w:t xml:space="preserve">Phương thức: </w:t>
+      </w:r>
+      <w:r>
+        <w:rPr>
+          <w:rFonts w:hint="default" w:eastAsia="Calibri" w:cs="黑体"/>
+          <w:b/>
+          <w:bCs/>
+          <w:color w:val="auto"/>
+          <w:kern w:val="0"/>
+          <w:sz w:val="26"/>
+          <w:szCs w:val="26"/>
+          <w:lang w:val="en-US" w:eastAsia="zh-CN" w:bidi="ar"/>
+        </w:rPr>
+        <w:t>PATCH</w:t>
+      </w:r>
+    </w:p>
+    <w:p>
+      <w:pPr>
+        <w:keepNext w:val="0"/>
+        <w:keepLines w:val="0"/>
+        <w:widowControl/>
+        <w:suppressLineNumbers w:val="0"/>
+        <w:suppressAutoHyphens/>
+        <w:spacing w:before="0" w:beforeAutospacing="0" w:after="120" w:afterAutospacing="0" w:line="360" w:lineRule="auto"/>
+        <w:ind w:left="0" w:right="0"/>
+        <w:jc w:val="left"/>
+        <w:rPr>
+          <w:rFonts w:hint="default" w:ascii="Times New Roman" w:hAnsi="Times New Roman" w:eastAsia="Calibri" w:cs="黑体"/>
+          <w:b w:val="0"/>
+          <w:bCs w:val="0"/>
+          <w:kern w:val="0"/>
+          <w:sz w:val="26"/>
+          <w:szCs w:val="26"/>
+        </w:rPr>
+      </w:pPr>
+      <w:r>
+        <w:rPr>
+          <w:rFonts w:hint="default" w:ascii="Times New Roman" w:hAnsi="Times New Roman" w:eastAsia="Calibri" w:cs="黑体"/>
+          <w:b/>
+          <w:bCs/>
+          <w:color w:val="auto"/>
+          <w:kern w:val="0"/>
+          <w:sz w:val="26"/>
+          <w:szCs w:val="26"/>
+          <w:lang w:val="en-US" w:eastAsia="zh-CN" w:bidi="ar"/>
+        </w:rPr>
+        <w:t xml:space="preserve">Mô tả: </w:t>
+      </w:r>
+      <w:r>
+        <w:rPr>
+          <w:rFonts w:hint="default" w:ascii="Times New Roman" w:hAnsi="Times New Roman" w:eastAsia="Calibri" w:cs="黑体"/>
+          <w:b w:val="0"/>
+          <w:bCs w:val="0"/>
+          <w:color w:val="auto"/>
+          <w:kern w:val="0"/>
+          <w:sz w:val="26"/>
+          <w:szCs w:val="26"/>
+          <w:lang w:val="en-US" w:eastAsia="zh-CN" w:bidi="ar"/>
+        </w:rPr>
+        <w:t xml:space="preserve">Khi người dùng đăng nhập với vai trò là </w:t>
+      </w:r>
+      <w:r>
+        <w:rPr>
+          <w:rFonts w:hint="default" w:eastAsia="Calibri" w:cs="黑体"/>
+          <w:b w:val="0"/>
+          <w:bCs w:val="0"/>
+          <w:color w:val="auto"/>
+          <w:kern w:val="0"/>
+          <w:sz w:val="26"/>
+          <w:szCs w:val="26"/>
+          <w:lang w:val="en-US" w:eastAsia="zh-CN" w:bidi="ar"/>
+        </w:rPr>
+        <w:t>người tìm việc</w:t>
+      </w:r>
+      <w:r>
+        <w:rPr>
+          <w:rFonts w:hint="default" w:ascii="Times New Roman" w:hAnsi="Times New Roman" w:eastAsia="Calibri" w:cs="黑体"/>
+          <w:b w:val="0"/>
+          <w:bCs w:val="0"/>
+          <w:color w:val="auto"/>
+          <w:kern w:val="0"/>
+          <w:sz w:val="26"/>
+          <w:szCs w:val="26"/>
+          <w:lang w:val="en-US" w:eastAsia="zh-CN" w:bidi="ar"/>
+        </w:rPr>
+        <w:t xml:space="preserve">, họ có thể </w:t>
+      </w:r>
+      <w:r>
+        <w:rPr>
+          <w:rFonts w:hint="default" w:eastAsia="Calibri" w:cs="黑体"/>
+          <w:b w:val="0"/>
+          <w:bCs w:val="0"/>
+          <w:color w:val="auto"/>
+          <w:kern w:val="0"/>
+          <w:sz w:val="26"/>
+          <w:szCs w:val="26"/>
+          <w:lang w:val="en-US" w:eastAsia="zh-CN" w:bidi="ar"/>
+        </w:rPr>
+        <w:t xml:space="preserve">cập nhật trạng thái đơn ứng tuyển thành </w:t>
+      </w:r>
+      <w:r>
+        <w:rPr>
+          <w:rFonts w:hint="default" w:eastAsia="Calibri"/>
+          <w:b w:val="0"/>
+          <w:bCs w:val="0"/>
+          <w:color w:val="auto"/>
+          <w:kern w:val="0"/>
+          <w:sz w:val="26"/>
+          <w:szCs w:val="26"/>
+          <w:lang w:val="en-US" w:eastAsia="zh-CN"/>
+        </w:rPr>
+        <w:t>Ứng viên đã rút</w:t>
+      </w:r>
+      <w:r>
+        <w:rPr>
+          <w:rFonts w:hint="default" w:ascii="Times New Roman" w:hAnsi="Times New Roman" w:eastAsia="Calibri" w:cs="黑体"/>
+          <w:b w:val="0"/>
+          <w:bCs w:val="0"/>
+          <w:color w:val="auto"/>
+          <w:kern w:val="0"/>
+          <w:sz w:val="26"/>
+          <w:szCs w:val="26"/>
+          <w:lang w:val="en-US" w:eastAsia="zh-CN" w:bidi="ar"/>
+        </w:rPr>
+        <w:t>.</w:t>
+      </w:r>
+    </w:p>
+    <w:p>
+      <w:pPr>
+        <w:keepNext w:val="0"/>
+        <w:keepLines w:val="0"/>
+        <w:widowControl/>
+        <w:suppressLineNumbers w:val="0"/>
+        <w:suppressAutoHyphens/>
+        <w:spacing w:before="0" w:beforeAutospacing="0" w:after="120" w:afterAutospacing="0" w:line="360" w:lineRule="auto"/>
+        <w:ind w:left="0" w:right="0"/>
+        <w:jc w:val="left"/>
+        <w:rPr>
+          <w:rFonts w:hint="default" w:ascii="Times New Roman" w:hAnsi="Times New Roman" w:eastAsia="Calibri" w:cs="黑体"/>
+          <w:b/>
+          <w:bCs/>
+          <w:kern w:val="0"/>
+          <w:sz w:val="26"/>
+          <w:szCs w:val="26"/>
+          <w:lang w:val="en-US"/>
+        </w:rPr>
+      </w:pPr>
+      <w:r>
+        <w:rPr>
+          <w:rFonts w:hint="default" w:ascii="Times New Roman" w:hAnsi="Times New Roman" w:eastAsia="Calibri" w:cs="黑体"/>
+          <w:b/>
+          <w:bCs/>
+          <w:color w:val="auto"/>
+          <w:kern w:val="0"/>
+          <w:sz w:val="26"/>
+          <w:szCs w:val="26"/>
+          <w:lang w:val="en-US" w:eastAsia="zh-CN" w:bidi="ar"/>
+        </w:rPr>
+        <w:t>Request:</w:t>
+      </w:r>
+      <w:r>
+        <w:rPr>
+          <w:rFonts w:hint="default" w:eastAsia="Calibri" w:cs="黑体"/>
+          <w:b/>
+          <w:bCs/>
+          <w:color w:val="auto"/>
+          <w:kern w:val="0"/>
+          <w:sz w:val="26"/>
+          <w:szCs w:val="26"/>
+          <w:lang w:val="en-US" w:eastAsia="zh-CN" w:bidi="ar"/>
+        </w:rPr>
+        <w:t xml:space="preserve"> </w:t>
+      </w:r>
+      <w:r>
+        <w:rPr>
+          <w:rFonts w:hint="default" w:ascii="Times New Roman" w:hAnsi="Times New Roman" w:eastAsia="Calibri" w:cs="黑体"/>
+          <w:b w:val="0"/>
+          <w:bCs w:val="0"/>
+          <w:color w:val="auto"/>
+          <w:kern w:val="0"/>
+          <w:sz w:val="26"/>
+          <w:szCs w:val="26"/>
+          <w:lang w:val="en-US" w:eastAsia="zh-CN" w:bidi="ar"/>
+        </w:rPr>
+        <w:t>Header có Authorization: Bearer &lt;token&gt;</w:t>
+      </w:r>
+    </w:p>
+    <w:p>
+      <w:pPr>
+        <w:keepNext w:val="0"/>
+        <w:keepLines w:val="0"/>
+        <w:widowControl/>
+        <w:suppressLineNumbers w:val="0"/>
+        <w:suppressAutoHyphens/>
+        <w:spacing w:before="0" w:beforeAutospacing="0" w:after="120" w:afterAutospacing="0" w:line="360" w:lineRule="auto"/>
+        <w:ind w:left="0" w:right="0"/>
+        <w:jc w:val="left"/>
+        <w:rPr>
+          <w:rFonts w:hint="default" w:ascii="Times New Roman" w:hAnsi="Times New Roman" w:eastAsia="Calibri" w:cs="黑体"/>
+          <w:b/>
+          <w:bCs/>
+          <w:color w:val="auto"/>
+          <w:kern w:val="0"/>
+          <w:sz w:val="26"/>
+          <w:szCs w:val="26"/>
+          <w:lang w:val="en-US" w:eastAsia="zh-CN" w:bidi="ar"/>
+        </w:rPr>
+      </w:pPr>
+      <w:r>
+        <w:rPr>
+          <w:rFonts w:hint="default" w:ascii="Times New Roman" w:hAnsi="Times New Roman" w:eastAsia="Calibri" w:cs="黑体"/>
+          <w:b/>
+          <w:bCs/>
+          <w:color w:val="auto"/>
+          <w:kern w:val="0"/>
+          <w:sz w:val="26"/>
+          <w:szCs w:val="26"/>
+          <w:lang w:val="en-US" w:eastAsia="zh-CN" w:bidi="ar"/>
+        </w:rPr>
+        <w:t>Response:</w:t>
+      </w:r>
+    </w:p>
+    <w:p>
+      <w:pPr>
+        <w:keepNext w:val="0"/>
+        <w:keepLines w:val="0"/>
+        <w:widowControl/>
+        <w:suppressLineNumbers w:val="0"/>
+        <w:suppressAutoHyphens/>
+        <w:spacing w:before="0" w:beforeAutospacing="0" w:after="120" w:afterAutospacing="0" w:line="360" w:lineRule="auto"/>
+        <w:ind w:left="0" w:right="0"/>
+        <w:jc w:val="left"/>
+        <w:rPr>
+          <w:rFonts w:hint="default" w:ascii="Times New Roman" w:hAnsi="Times New Roman" w:eastAsia="Calibri"/>
+          <w:b w:val="0"/>
+          <w:bCs w:val="0"/>
+          <w:color w:val="auto"/>
+          <w:kern w:val="0"/>
+          <w:sz w:val="26"/>
+          <w:szCs w:val="26"/>
+          <w:lang w:val="en-US" w:eastAsia="zh-CN"/>
+        </w:rPr>
+      </w:pPr>
+      <w:bookmarkStart w:id="105" w:name="_GoBack"/>
+      <w:r>
+        <w:rPr>
+          <w:rFonts w:hint="default" w:ascii="Times New Roman" w:hAnsi="Times New Roman" w:eastAsia="Calibri"/>
+          <w:b w:val="0"/>
+          <w:bCs w:val="0"/>
+          <w:color w:val="auto"/>
+          <w:kern w:val="0"/>
+          <w:sz w:val="26"/>
+          <w:szCs w:val="26"/>
+          <w:lang w:val="en-US" w:eastAsia="zh-CN"/>
+        </w:rPr>
+        <w:t>{</w:t>
+      </w:r>
+    </w:p>
+    <w:p>
+      <w:pPr>
+        <w:keepNext w:val="0"/>
+        <w:keepLines w:val="0"/>
+        <w:widowControl/>
+        <w:suppressLineNumbers w:val="0"/>
+        <w:suppressAutoHyphens/>
+        <w:spacing w:before="0" w:beforeAutospacing="0" w:after="120" w:afterAutospacing="0" w:line="360" w:lineRule="auto"/>
+        <w:ind w:left="0" w:right="0"/>
+        <w:jc w:val="left"/>
+        <w:rPr>
+          <w:rFonts w:hint="default" w:ascii="Times New Roman" w:hAnsi="Times New Roman" w:eastAsia="Calibri"/>
+          <w:b w:val="0"/>
+          <w:bCs w:val="0"/>
+          <w:color w:val="auto"/>
+          <w:kern w:val="0"/>
+          <w:sz w:val="26"/>
+          <w:szCs w:val="26"/>
+          <w:lang w:val="en-US" w:eastAsia="zh-CN"/>
+        </w:rPr>
+      </w:pPr>
+      <w:r>
+        <w:rPr>
+          <w:rFonts w:hint="default" w:ascii="Times New Roman" w:hAnsi="Times New Roman" w:eastAsia="Calibri"/>
+          <w:b w:val="0"/>
+          <w:bCs w:val="0"/>
+          <w:color w:val="auto"/>
+          <w:kern w:val="0"/>
+          <w:sz w:val="26"/>
+          <w:szCs w:val="26"/>
+          <w:lang w:val="en-US" w:eastAsia="zh-CN"/>
+        </w:rPr>
+        <w:t xml:space="preserve">    "id": 3,</w:t>
+      </w:r>
+    </w:p>
+    <w:p>
+      <w:pPr>
+        <w:keepNext w:val="0"/>
+        <w:keepLines w:val="0"/>
+        <w:widowControl/>
+        <w:suppressLineNumbers w:val="0"/>
+        <w:suppressAutoHyphens/>
+        <w:spacing w:before="0" w:beforeAutospacing="0" w:after="120" w:afterAutospacing="0" w:line="360" w:lineRule="auto"/>
+        <w:ind w:left="0" w:right="0"/>
+        <w:jc w:val="left"/>
+        <w:rPr>
+          <w:rFonts w:hint="default" w:ascii="Times New Roman" w:hAnsi="Times New Roman" w:eastAsia="Calibri"/>
+          <w:b w:val="0"/>
+          <w:bCs w:val="0"/>
+          <w:color w:val="auto"/>
+          <w:kern w:val="0"/>
+          <w:sz w:val="26"/>
+          <w:szCs w:val="26"/>
+          <w:lang w:val="en-US" w:eastAsia="zh-CN"/>
+        </w:rPr>
+      </w:pPr>
+      <w:r>
+        <w:rPr>
+          <w:rFonts w:hint="default" w:ascii="Times New Roman" w:hAnsi="Times New Roman" w:eastAsia="Calibri"/>
+          <w:b w:val="0"/>
+          <w:bCs w:val="0"/>
+          <w:color w:val="auto"/>
+          <w:kern w:val="0"/>
+          <w:sz w:val="26"/>
+          <w:szCs w:val="26"/>
+          <w:lang w:val="en-US" w:eastAsia="zh-CN"/>
+        </w:rPr>
+        <w:t xml:space="preserve">    "my_user": 2,</w:t>
+      </w:r>
+    </w:p>
+    <w:p>
+      <w:pPr>
+        <w:keepNext w:val="0"/>
+        <w:keepLines w:val="0"/>
+        <w:widowControl/>
+        <w:suppressLineNumbers w:val="0"/>
+        <w:suppressAutoHyphens/>
+        <w:spacing w:before="0" w:beforeAutospacing="0" w:after="120" w:afterAutospacing="0" w:line="360" w:lineRule="auto"/>
+        <w:ind w:left="0" w:right="0"/>
+        <w:jc w:val="left"/>
+        <w:rPr>
+          <w:rFonts w:hint="default" w:ascii="Times New Roman" w:hAnsi="Times New Roman" w:eastAsia="Calibri"/>
+          <w:b w:val="0"/>
+          <w:bCs w:val="0"/>
+          <w:color w:val="auto"/>
+          <w:kern w:val="0"/>
+          <w:sz w:val="26"/>
+          <w:szCs w:val="26"/>
+          <w:lang w:val="en-US" w:eastAsia="zh-CN"/>
+        </w:rPr>
+      </w:pPr>
+      <w:r>
+        <w:rPr>
+          <w:rFonts w:hint="default" w:ascii="Times New Roman" w:hAnsi="Times New Roman" w:eastAsia="Calibri"/>
+          <w:b w:val="0"/>
+          <w:bCs w:val="0"/>
+          <w:color w:val="auto"/>
+          <w:kern w:val="0"/>
+          <w:sz w:val="26"/>
+          <w:szCs w:val="26"/>
+          <w:lang w:val="en-US" w:eastAsia="zh-CN"/>
+        </w:rPr>
+        <w:t xml:space="preserve">    "job_posting": "24da05ff-6666-4056-a8ba-5872af6822b8",</w:t>
+      </w:r>
+    </w:p>
+    <w:p>
+      <w:pPr>
+        <w:keepNext w:val="0"/>
+        <w:keepLines w:val="0"/>
+        <w:widowControl/>
+        <w:suppressLineNumbers w:val="0"/>
+        <w:suppressAutoHyphens/>
+        <w:spacing w:before="0" w:beforeAutospacing="0" w:after="120" w:afterAutospacing="0" w:line="360" w:lineRule="auto"/>
+        <w:ind w:left="0" w:right="0"/>
+        <w:jc w:val="left"/>
+        <w:rPr>
+          <w:rFonts w:hint="default" w:ascii="Times New Roman" w:hAnsi="Times New Roman" w:eastAsia="Calibri"/>
+          <w:b w:val="0"/>
+          <w:bCs w:val="0"/>
+          <w:color w:val="auto"/>
+          <w:kern w:val="0"/>
+          <w:sz w:val="26"/>
+          <w:szCs w:val="26"/>
+          <w:lang w:val="en-US" w:eastAsia="zh-CN"/>
+        </w:rPr>
+      </w:pPr>
+      <w:r>
+        <w:rPr>
+          <w:rFonts w:hint="default" w:ascii="Times New Roman" w:hAnsi="Times New Roman" w:eastAsia="Calibri"/>
+          <w:b w:val="0"/>
+          <w:bCs w:val="0"/>
+          <w:color w:val="auto"/>
+          <w:kern w:val="0"/>
+          <w:sz w:val="26"/>
+          <w:szCs w:val="26"/>
+          <w:lang w:val="en-US" w:eastAsia="zh-CN"/>
+        </w:rPr>
+        <w:t xml:space="preserve">    "cv": 21,</w:t>
+      </w:r>
+    </w:p>
+    <w:p>
+      <w:pPr>
+        <w:keepNext w:val="0"/>
+        <w:keepLines w:val="0"/>
+        <w:widowControl/>
+        <w:suppressLineNumbers w:val="0"/>
+        <w:suppressAutoHyphens/>
+        <w:spacing w:before="0" w:beforeAutospacing="0" w:after="120" w:afterAutospacing="0" w:line="360" w:lineRule="auto"/>
+        <w:ind w:left="0" w:right="0"/>
+        <w:jc w:val="left"/>
+        <w:rPr>
+          <w:rFonts w:hint="default" w:ascii="Times New Roman" w:hAnsi="Times New Roman" w:eastAsia="Calibri"/>
+          <w:b w:val="0"/>
+          <w:bCs w:val="0"/>
+          <w:color w:val="auto"/>
+          <w:kern w:val="0"/>
+          <w:sz w:val="26"/>
+          <w:szCs w:val="26"/>
+          <w:lang w:val="en-US" w:eastAsia="zh-CN"/>
+        </w:rPr>
+      </w:pPr>
+      <w:r>
+        <w:rPr>
+          <w:rFonts w:hint="default" w:ascii="Times New Roman" w:hAnsi="Times New Roman" w:eastAsia="Calibri"/>
+          <w:b w:val="0"/>
+          <w:bCs w:val="0"/>
+          <w:color w:val="auto"/>
+          <w:kern w:val="0"/>
+          <w:sz w:val="26"/>
+          <w:szCs w:val="26"/>
+          <w:lang w:val="en-US" w:eastAsia="zh-CN"/>
+        </w:rPr>
+        <w:t xml:space="preserve">    "status": "Withdrawn",</w:t>
+      </w:r>
+    </w:p>
+    <w:p>
+      <w:pPr>
+        <w:keepNext w:val="0"/>
+        <w:keepLines w:val="0"/>
+        <w:widowControl/>
+        <w:suppressLineNumbers w:val="0"/>
+        <w:suppressAutoHyphens/>
+        <w:spacing w:before="0" w:beforeAutospacing="0" w:after="120" w:afterAutospacing="0" w:line="360" w:lineRule="auto"/>
+        <w:ind w:left="0" w:right="0"/>
+        <w:jc w:val="left"/>
+        <w:rPr>
+          <w:rFonts w:hint="default" w:ascii="Times New Roman" w:hAnsi="Times New Roman" w:eastAsia="Calibri"/>
+          <w:b w:val="0"/>
+          <w:bCs w:val="0"/>
+          <w:color w:val="auto"/>
+          <w:kern w:val="0"/>
+          <w:sz w:val="26"/>
+          <w:szCs w:val="26"/>
+          <w:lang w:val="en-US" w:eastAsia="zh-CN"/>
+        </w:rPr>
+      </w:pPr>
+      <w:r>
+        <w:rPr>
+          <w:rFonts w:hint="default" w:ascii="Times New Roman" w:hAnsi="Times New Roman" w:eastAsia="Calibri"/>
+          <w:b w:val="0"/>
+          <w:bCs w:val="0"/>
+          <w:color w:val="auto"/>
+          <w:kern w:val="0"/>
+          <w:sz w:val="26"/>
+          <w:szCs w:val="26"/>
+          <w:lang w:val="en-US" w:eastAsia="zh-CN"/>
+        </w:rPr>
+        <w:t xml:space="preserve">    "cover_letter": "Đây là CV của Nguyễn Tấn Lộc muốn Apply vào công việc này",</w:t>
+      </w:r>
+    </w:p>
+    <w:p>
+      <w:pPr>
+        <w:keepNext w:val="0"/>
+        <w:keepLines w:val="0"/>
+        <w:widowControl/>
+        <w:suppressLineNumbers w:val="0"/>
+        <w:suppressAutoHyphens/>
+        <w:spacing w:before="0" w:beforeAutospacing="0" w:after="120" w:afterAutospacing="0" w:line="360" w:lineRule="auto"/>
+        <w:ind w:left="0" w:right="0"/>
+        <w:jc w:val="left"/>
+        <w:rPr>
+          <w:rFonts w:hint="default" w:ascii="Times New Roman" w:hAnsi="Times New Roman" w:eastAsia="Calibri"/>
+          <w:b w:val="0"/>
+          <w:bCs w:val="0"/>
+          <w:color w:val="auto"/>
+          <w:kern w:val="0"/>
+          <w:sz w:val="26"/>
+          <w:szCs w:val="26"/>
+          <w:lang w:val="en-US" w:eastAsia="zh-CN"/>
+        </w:rPr>
+      </w:pPr>
+      <w:r>
+        <w:rPr>
+          <w:rFonts w:hint="default" w:ascii="Times New Roman" w:hAnsi="Times New Roman" w:eastAsia="Calibri"/>
+          <w:b w:val="0"/>
+          <w:bCs w:val="0"/>
+          <w:color w:val="auto"/>
+          <w:kern w:val="0"/>
+          <w:sz w:val="26"/>
+          <w:szCs w:val="26"/>
+          <w:lang w:val="en-US" w:eastAsia="zh-CN"/>
+        </w:rPr>
+        <w:t xml:space="preserve">    "created_at": "2025-05-27T15:18:41.453077Z",</w:t>
+      </w:r>
+    </w:p>
+    <w:p>
+      <w:pPr>
+        <w:keepNext w:val="0"/>
+        <w:keepLines w:val="0"/>
+        <w:widowControl/>
+        <w:suppressLineNumbers w:val="0"/>
+        <w:suppressAutoHyphens/>
+        <w:spacing w:before="0" w:beforeAutospacing="0" w:after="120" w:afterAutospacing="0" w:line="360" w:lineRule="auto"/>
+        <w:ind w:left="0" w:right="0"/>
+        <w:jc w:val="left"/>
+        <w:rPr>
+          <w:rFonts w:hint="default" w:ascii="Times New Roman" w:hAnsi="Times New Roman" w:eastAsia="Calibri"/>
+          <w:b w:val="0"/>
+          <w:bCs w:val="0"/>
+          <w:color w:val="auto"/>
+          <w:kern w:val="0"/>
+          <w:sz w:val="26"/>
+          <w:szCs w:val="26"/>
+          <w:lang w:val="en-US" w:eastAsia="zh-CN"/>
+        </w:rPr>
+      </w:pPr>
+      <w:r>
+        <w:rPr>
+          <w:rFonts w:hint="default" w:ascii="Times New Roman" w:hAnsi="Times New Roman" w:eastAsia="Calibri"/>
+          <w:b w:val="0"/>
+          <w:bCs w:val="0"/>
+          <w:color w:val="auto"/>
+          <w:kern w:val="0"/>
+          <w:sz w:val="26"/>
+          <w:szCs w:val="26"/>
+          <w:lang w:val="en-US" w:eastAsia="zh-CN"/>
+        </w:rPr>
+        <w:t xml:space="preserve">    "updated_at": "2025-05-27T15:18:52.381670Z",</w:t>
+      </w:r>
+    </w:p>
+    <w:p>
+      <w:pPr>
+        <w:keepNext w:val="0"/>
+        <w:keepLines w:val="0"/>
+        <w:widowControl/>
+        <w:suppressLineNumbers w:val="0"/>
+        <w:suppressAutoHyphens/>
+        <w:spacing w:before="0" w:beforeAutospacing="0" w:after="120" w:afterAutospacing="0" w:line="360" w:lineRule="auto"/>
+        <w:ind w:left="0" w:right="0"/>
+        <w:jc w:val="left"/>
+        <w:rPr>
+          <w:rFonts w:hint="default" w:ascii="Times New Roman" w:hAnsi="Times New Roman" w:eastAsia="Calibri"/>
+          <w:b w:val="0"/>
+          <w:bCs w:val="0"/>
+          <w:color w:val="auto"/>
+          <w:kern w:val="0"/>
+          <w:sz w:val="26"/>
+          <w:szCs w:val="26"/>
+          <w:lang w:val="en-US" w:eastAsia="zh-CN"/>
+        </w:rPr>
+      </w:pPr>
+      <w:r>
+        <w:rPr>
+          <w:rFonts w:hint="default" w:ascii="Times New Roman" w:hAnsi="Times New Roman" w:eastAsia="Calibri"/>
+          <w:b w:val="0"/>
+          <w:bCs w:val="0"/>
+          <w:color w:val="auto"/>
+          <w:kern w:val="0"/>
+          <w:sz w:val="26"/>
+          <w:szCs w:val="26"/>
+          <w:lang w:val="en-US" w:eastAsia="zh-CN"/>
+        </w:rPr>
+        <w:t xml:space="preserve">    "job_posting_title": "Chúng tôi cần tuyển tiền đạo hàng đầu nước Anh",</w:t>
+      </w:r>
+    </w:p>
+    <w:p>
+      <w:pPr>
+        <w:keepNext w:val="0"/>
+        <w:keepLines w:val="0"/>
+        <w:widowControl/>
+        <w:suppressLineNumbers w:val="0"/>
+        <w:suppressAutoHyphens/>
+        <w:spacing w:before="0" w:beforeAutospacing="0" w:after="120" w:afterAutospacing="0" w:line="360" w:lineRule="auto"/>
+        <w:ind w:left="0" w:right="0"/>
+        <w:jc w:val="left"/>
+        <w:rPr>
+          <w:rFonts w:hint="default" w:ascii="Times New Roman" w:hAnsi="Times New Roman" w:eastAsia="Calibri"/>
+          <w:b w:val="0"/>
+          <w:bCs w:val="0"/>
+          <w:color w:val="auto"/>
+          <w:kern w:val="0"/>
+          <w:sz w:val="26"/>
+          <w:szCs w:val="26"/>
+          <w:lang w:val="en-US" w:eastAsia="zh-CN"/>
+        </w:rPr>
+      </w:pPr>
+      <w:r>
+        <w:rPr>
+          <w:rFonts w:hint="default" w:ascii="Times New Roman" w:hAnsi="Times New Roman" w:eastAsia="Calibri"/>
+          <w:b w:val="0"/>
+          <w:bCs w:val="0"/>
+          <w:color w:val="auto"/>
+          <w:kern w:val="0"/>
+          <w:sz w:val="26"/>
+          <w:szCs w:val="26"/>
+          <w:lang w:val="en-US" w:eastAsia="zh-CN"/>
+        </w:rPr>
+        <w:t xml:space="preserve">    "job_seeker_username": "JobSeeker1",</w:t>
+      </w:r>
+    </w:p>
+    <w:p>
+      <w:pPr>
+        <w:keepNext w:val="0"/>
+        <w:keepLines w:val="0"/>
+        <w:widowControl/>
+        <w:suppressLineNumbers w:val="0"/>
+        <w:suppressAutoHyphens/>
+        <w:spacing w:before="0" w:beforeAutospacing="0" w:after="120" w:afterAutospacing="0" w:line="360" w:lineRule="auto"/>
+        <w:ind w:left="0" w:right="0"/>
+        <w:jc w:val="left"/>
+        <w:rPr>
+          <w:rFonts w:hint="default" w:ascii="Times New Roman" w:hAnsi="Times New Roman" w:eastAsia="Calibri"/>
+          <w:b w:val="0"/>
+          <w:bCs w:val="0"/>
+          <w:color w:val="auto"/>
+          <w:kern w:val="0"/>
+          <w:sz w:val="26"/>
+          <w:szCs w:val="26"/>
+          <w:lang w:val="en-US" w:eastAsia="zh-CN"/>
+        </w:rPr>
+      </w:pPr>
+      <w:r>
+        <w:rPr>
+          <w:rFonts w:hint="default" w:ascii="Times New Roman" w:hAnsi="Times New Roman" w:eastAsia="Calibri"/>
+          <w:b w:val="0"/>
+          <w:bCs w:val="0"/>
+          <w:color w:val="auto"/>
+          <w:kern w:val="0"/>
+          <w:sz w:val="26"/>
+          <w:szCs w:val="26"/>
+          <w:lang w:val="en-US" w:eastAsia="zh-CN"/>
+        </w:rPr>
+        <w:t xml:space="preserve">    "cv_url": "https://res.cloudinary.com/dlysaj8pb/raw/upload/v1747585614/cvs/rg4qmz598e3zitbqwrkc.png",</w:t>
+      </w:r>
+    </w:p>
+    <w:p>
+      <w:pPr>
+        <w:keepNext w:val="0"/>
+        <w:keepLines w:val="0"/>
+        <w:widowControl/>
+        <w:suppressLineNumbers w:val="0"/>
+        <w:suppressAutoHyphens/>
+        <w:spacing w:before="0" w:beforeAutospacing="0" w:after="120" w:afterAutospacing="0" w:line="360" w:lineRule="auto"/>
+        <w:ind w:left="0" w:right="0"/>
+        <w:jc w:val="left"/>
+        <w:rPr>
+          <w:rFonts w:hint="default" w:ascii="Times New Roman" w:hAnsi="Times New Roman" w:eastAsia="Calibri"/>
+          <w:b w:val="0"/>
+          <w:bCs w:val="0"/>
+          <w:color w:val="auto"/>
+          <w:kern w:val="0"/>
+          <w:sz w:val="26"/>
+          <w:szCs w:val="26"/>
+          <w:lang w:val="en-US" w:eastAsia="zh-CN"/>
+        </w:rPr>
+      </w:pPr>
+      <w:r>
+        <w:rPr>
+          <w:rFonts w:hint="default" w:ascii="Times New Roman" w:hAnsi="Times New Roman" w:eastAsia="Calibri"/>
+          <w:b w:val="0"/>
+          <w:bCs w:val="0"/>
+          <w:color w:val="auto"/>
+          <w:kern w:val="0"/>
+          <w:sz w:val="26"/>
+          <w:szCs w:val="26"/>
+          <w:lang w:val="en-US" w:eastAsia="zh-CN"/>
+        </w:rPr>
+        <w:t xml:space="preserve">    "recruiter_company": "Công ty Bóng đá hàng đầu trời Âu"</w:t>
+      </w:r>
+    </w:p>
+    <w:p>
+      <w:pPr>
+        <w:keepNext w:val="0"/>
+        <w:keepLines w:val="0"/>
+        <w:widowControl/>
+        <w:suppressLineNumbers w:val="0"/>
+        <w:suppressAutoHyphens/>
+        <w:spacing w:before="0" w:beforeAutospacing="0" w:after="120" w:afterAutospacing="0" w:line="360" w:lineRule="auto"/>
+        <w:ind w:left="0" w:right="0"/>
+        <w:jc w:val="left"/>
+        <w:rPr>
+          <w:rFonts w:hint="default" w:ascii="Times New Roman" w:hAnsi="Times New Roman" w:eastAsia="Calibri" w:cs="黑体"/>
+          <w:b/>
+          <w:bCs/>
+          <w:color w:val="auto"/>
+          <w:kern w:val="0"/>
+          <w:sz w:val="26"/>
+          <w:szCs w:val="26"/>
+          <w:lang w:val="en-US" w:eastAsia="zh-CN" w:bidi="ar"/>
+        </w:rPr>
+      </w:pPr>
+      <w:r>
+        <w:rPr>
+          <w:rFonts w:hint="default" w:ascii="Times New Roman" w:hAnsi="Times New Roman" w:eastAsia="Calibri"/>
+          <w:b w:val="0"/>
+          <w:bCs w:val="0"/>
+          <w:color w:val="auto"/>
+          <w:kern w:val="0"/>
+          <w:sz w:val="26"/>
+          <w:szCs w:val="26"/>
+          <w:lang w:val="en-US" w:eastAsia="zh-CN"/>
+        </w:rPr>
+        <w:t>}</w:t>
+      </w:r>
+      <w:bookmarkEnd w:id="105"/>
+    </w:p>
+    <w:p>
+      <w:pPr>
+        <w:pStyle w:val="3"/>
+        <w:ind w:left="567" w:hanging="567"/>
+        <w:outlineLvl w:val="0"/>
+        <w:rPr>
+          <w:rFonts w:ascii="Times New Roman" w:hAnsi="Times New Roman" w:cs="Times New Roman"/>
+          <w:sz w:val="26"/>
+          <w:szCs w:val="26"/>
+          <w:lang w:val="vi-VN"/>
+        </w:rPr>
+      </w:pPr>
+      <w:bookmarkStart w:id="43" w:name="_Toc28376_Copy_4"/>
+      <w:bookmarkStart w:id="44" w:name="_Toc5442_Copy_4"/>
+      <w:bookmarkStart w:id="45" w:name="_Toc30056_Copy_4"/>
+      <w:bookmarkStart w:id="46" w:name="_Toc16474_Copy_4"/>
+      <w:r>
+        <w:rPr>
+          <w:rFonts w:cs="Times New Roman"/>
+          <w:sz w:val="26"/>
+          <w:szCs w:val="26"/>
+          <w:lang w:val="vi-VN"/>
+        </w:rPr>
+        <w:t>Nhà tuyển dụng tạo việc làm</w:t>
+      </w:r>
+      <w:bookmarkEnd w:id="43"/>
+      <w:bookmarkEnd w:id="44"/>
+      <w:bookmarkEnd w:id="45"/>
+      <w:bookmarkEnd w:id="46"/>
     </w:p>
     <w:p>
       <w:pPr>
@@ -10220,7 +13848,7 @@
         <w:ind w:left="1440" w:right="0" w:hanging="360"/>
       </w:pPr>
       <w:r>
-        <w:t>Lấy danh sách công việc (có lọc theo từ khóa, vị trí, mức lương, loại công việc, công ty…)</w:t>
+        <w:t>Tạo bài đăng tuyển dụng mới</w:t>
       </w:r>
     </w:p>
     <w:p>
@@ -10233,7 +13861,7 @@
         <w:ind w:left="1440" w:right="0" w:hanging="360"/>
       </w:pPr>
       <w:r>
-        <w:t>Chi tiết một việc làm cụ thể</w:t>
+        <w:t>Chỉnh sửa bài đăng tuyển dụng</w:t>
       </w:r>
     </w:p>
     <w:p>
@@ -10246,29 +13874,7 @@
         <w:ind w:left="1440" w:right="0" w:hanging="360"/>
       </w:pPr>
       <w:r>
-        <w:t>API gợi ý công việc dựa trên hồ sơ người dùng</w:t>
-      </w:r>
-    </w:p>
-    <w:p>
-      <w:pPr>
-        <w:pStyle w:val="3"/>
-        <w:ind w:left="567" w:hanging="567"/>
-        <w:outlineLvl w:val="0"/>
-        <w:rPr>
-          <w:rFonts w:ascii="Times New Roman" w:hAnsi="Times New Roman" w:cs="Times New Roman"/>
-          <w:sz w:val="26"/>
-          <w:szCs w:val="26"/>
-          <w:lang w:val="vi-VN"/>
-        </w:rPr>
-      </w:pPr>
-      <w:r>
-        <w:rPr>
-          <w:rFonts w:cs="Times New Roman"/>
-          <w:sz w:val="26"/>
-          <w:szCs w:val="26"/>
-          <w:lang w:val="vi-VN"/>
-        </w:rPr>
-        <w:t>Quản lý quy trình ứng tuyển</w:t>
+        <w:t>Đóng/xóa bài đăng tuyển dụng</w:t>
       </w:r>
     </w:p>
     <w:p>
@@ -10281,7 +13887,7 @@
         <w:ind w:left="1440" w:right="0" w:hanging="360"/>
       </w:pPr>
       <w:r>
-        <w:t>Lấy danh sách đơn ứng tuyển của người dùng hoặc nhà tuyển dụng (tùy vai trò)</w:t>
+        <w:t>Lấy danh sách việc làm của nhà tuyển dụng</w:t>
       </w:r>
     </w:p>
     <w:p>
@@ -10294,7 +13900,29 @@
         <w:ind w:left="1440" w:right="0" w:hanging="360"/>
       </w:pPr>
       <w:r>
-        <w:t>Tạo đơn ứng tuyển cho việc làm mới (CV, thư xin việc)</w:t>
+        <w:t xml:space="preserve">Gừi admin phê duyệt bài đăng </w:t>
+      </w:r>
+    </w:p>
+    <w:p>
+      <w:pPr>
+        <w:pStyle w:val="3"/>
+        <w:ind w:left="567" w:hanging="567"/>
+        <w:outlineLvl w:val="0"/>
+        <w:rPr>
+          <w:rFonts w:ascii="Times New Roman" w:hAnsi="Times New Roman" w:cs="Times New Roman"/>
+          <w:sz w:val="26"/>
+          <w:szCs w:val="26"/>
+          <w:lang w:val="vi-VN"/>
+        </w:rPr>
+      </w:pPr>
+      <w:r>
+        <w:rPr>
+          <w:rFonts w:cs="Times New Roman"/>
+          <w:sz w:val="26"/>
+          <w:szCs w:val="26"/>
+          <w:lang w:val="vi-VN"/>
+        </w:rPr>
+        <w:t>Admin xác thực nhà tuyển dụng và duyệt việc làm</w:t>
       </w:r>
     </w:p>
     <w:p>
@@ -10307,7 +13935,7 @@
         <w:ind w:left="1440" w:right="0" w:hanging="360"/>
       </w:pPr>
       <w:r>
-        <w:t>Cật nhật trạng thái đơn  (do nhà tuyển dụng thao tác: xem, mời phỏng vấn, từ chối…)</w:t>
+        <w:t>Lấy danh sách nhà tuyển dụng chờ duyệt</w:t>
       </w:r>
     </w:p>
     <w:p>
@@ -10320,38 +13948,8 @@
         <w:ind w:left="1440" w:right="0" w:hanging="360"/>
       </w:pPr>
       <w:r>
-        <w:t>Rút lui không ứng tuyển nữa</w:t>
-      </w:r>
-    </w:p>
-    <w:p>
-      <w:pPr>
-        <w:pStyle w:val="3"/>
-        <w:ind w:left="567" w:hanging="567"/>
-        <w:outlineLvl w:val="0"/>
-        <w:rPr>
-          <w:rFonts w:ascii="Times New Roman" w:hAnsi="Times New Roman" w:cs="Times New Roman"/>
-          <w:sz w:val="26"/>
-          <w:szCs w:val="26"/>
-          <w:lang w:val="vi-VN"/>
-        </w:rPr>
-      </w:pPr>
-      <w:bookmarkStart w:id="43" w:name="_Toc30056_Copy_4"/>
-      <w:bookmarkStart w:id="44" w:name="_Toc5442_Copy_4"/>
-      <w:bookmarkStart w:id="45" w:name="_Toc16474_Copy_4"/>
-      <w:bookmarkStart w:id="46" w:name="_Toc28376_Copy_4"/>
-      <w:r>
-        <w:rPr>
-          <w:rFonts w:cs="Times New Roman"/>
-          <w:sz w:val="26"/>
-          <w:szCs w:val="26"/>
-          <w:lang w:val="vi-VN"/>
-        </w:rPr>
-        <w:t>Nhà tuyển dụng tạo việc làm</w:t>
-      </w:r>
-      <w:bookmarkEnd w:id="43"/>
-      <w:bookmarkEnd w:id="44"/>
-      <w:bookmarkEnd w:id="45"/>
-      <w:bookmarkEnd w:id="46"/>
+        <w:t>Lấy danh sách nhà tuyển dụng chờ duyệt</w:t>
+      </w:r>
     </w:p>
     <w:p>
       <w:pPr>
@@ -10363,7 +13961,7 @@
         <w:ind w:left="1440" w:right="0" w:hanging="360"/>
       </w:pPr>
       <w:r>
-        <w:t>Tạo bài đăng tuyển dụng mới</w:t>
+        <w:t>Lấy danh sách việc làm chờ phê duyệt</w:t>
       </w:r>
     </w:p>
     <w:p>
@@ -10376,7 +13974,29 @@
         <w:ind w:left="1440" w:right="0" w:hanging="360"/>
       </w:pPr>
       <w:r>
-        <w:t>Chỉnh sửa bài đăng tuyển dụng</w:t>
+        <w:t>Phê duyệt hoặc từ chối bài đăng việc làm</w:t>
+      </w:r>
+    </w:p>
+    <w:p>
+      <w:pPr>
+        <w:pStyle w:val="3"/>
+        <w:ind w:left="567" w:hanging="567"/>
+        <w:outlineLvl w:val="0"/>
+        <w:rPr>
+          <w:rFonts w:ascii="Times New Roman" w:hAnsi="Times New Roman" w:cs="Times New Roman"/>
+          <w:sz w:val="26"/>
+          <w:szCs w:val="26"/>
+          <w:lang w:val="vi-VN"/>
+        </w:rPr>
+      </w:pPr>
+      <w:r>
+        <w:rPr>
+          <w:rFonts w:cs="Times New Roman"/>
+          <w:sz w:val="26"/>
+          <w:szCs w:val="26"/>
+          <w:lang w:val="vi-VN"/>
+        </w:rPr>
+        <w:t xml:space="preserve">Chat và phỏng vấn trực tuyến </w:t>
       </w:r>
     </w:p>
     <w:p>
@@ -10389,7 +14009,7 @@
         <w:ind w:left="1440" w:right="0" w:hanging="360"/>
       </w:pPr>
       <w:r>
-        <w:t>Đóng/xóa bài đăng tuyển dụng</w:t>
+        <w:t>Lấy danh sách tin nhắn của người dùng</w:t>
       </w:r>
     </w:p>
     <w:p>
@@ -10402,7 +14022,7 @@
         <w:ind w:left="1440" w:right="0" w:hanging="360"/>
       </w:pPr>
       <w:r>
-        <w:t>Lấy danh sách việc làm của nhà tuyển dụng</w:t>
+        <w:t>Gửi tin nhắn cho người khác (ứng viên hoặc nhà tuyển dụng)</w:t>
       </w:r>
     </w:p>
     <w:p>
@@ -10415,29 +14035,7 @@
         <w:ind w:left="1440" w:right="0" w:hanging="360"/>
       </w:pPr>
       <w:r>
-        <w:t xml:space="preserve">Gừi admin phê duyệt bài đăng </w:t>
-      </w:r>
-    </w:p>
-    <w:p>
-      <w:pPr>
-        <w:pStyle w:val="3"/>
-        <w:ind w:left="567" w:hanging="567"/>
-        <w:outlineLvl w:val="0"/>
-        <w:rPr>
-          <w:rFonts w:ascii="Times New Roman" w:hAnsi="Times New Roman" w:cs="Times New Roman"/>
-          <w:sz w:val="26"/>
-          <w:szCs w:val="26"/>
-          <w:lang w:val="vi-VN"/>
-        </w:rPr>
-      </w:pPr>
-      <w:r>
-        <w:rPr>
-          <w:rFonts w:cs="Times New Roman"/>
-          <w:sz w:val="26"/>
-          <w:szCs w:val="26"/>
-          <w:lang w:val="vi-VN"/>
-        </w:rPr>
-        <w:t>Admin xác thực nhà tuyển dụng và duyệt việc làm</w:t>
+        <w:t>Lấy lịch phỏng vấn của người dùng (ứng viên hoặc nhà tuyển dụng)</w:t>
       </w:r>
     </w:p>
     <w:p>
@@ -10450,7 +14048,7 @@
         <w:ind w:left="1440" w:right="0" w:hanging="360"/>
       </w:pPr>
       <w:r>
-        <w:t>Lấy danh sách nhà tuyển dụng chờ duyệt</w:t>
+        <w:t>Tạo lịch phỏng vấn (thường do nhà tuyển dụng)</w:t>
       </w:r>
     </w:p>
     <w:p>
@@ -10463,7 +14061,29 @@
         <w:ind w:left="1440" w:right="0" w:hanging="360"/>
       </w:pPr>
       <w:r>
-        <w:t>Lấy danh sách nhà tuyển dụng chờ duyệt</w:t>
+        <w:t>Cập nhật trạng thái cuộc phỏng vấn (đã hoàn thành, hủy...)</w:t>
+      </w:r>
+    </w:p>
+    <w:p>
+      <w:pPr>
+        <w:pStyle w:val="3"/>
+        <w:ind w:left="567" w:hanging="567"/>
+        <w:outlineLvl w:val="0"/>
+        <w:rPr>
+          <w:rFonts w:ascii="Times New Roman" w:hAnsi="Times New Roman" w:cs="Times New Roman"/>
+          <w:sz w:val="26"/>
+          <w:szCs w:val="26"/>
+          <w:lang w:val="vi-VN"/>
+        </w:rPr>
+      </w:pPr>
+      <w:r>
+        <w:rPr>
+          <w:rFonts w:cs="Times New Roman"/>
+          <w:sz w:val="26"/>
+          <w:szCs w:val="26"/>
+          <w:lang w:val="vi-VN"/>
+        </w:rPr>
+        <w:t>Thông báo và nhắc nhở</w:t>
       </w:r>
     </w:p>
     <w:p>
@@ -10476,7 +14096,7 @@
         <w:ind w:left="1440" w:right="0" w:hanging="360"/>
       </w:pPr>
       <w:r>
-        <w:t>Lấy danh sách việc làm chờ phê duyệt</w:t>
+        <w:t>Lấy danh sách thông báo của người dùng</w:t>
       </w:r>
     </w:p>
     <w:p>
@@ -10489,7 +14109,7 @@
         <w:ind w:left="1440" w:right="0" w:hanging="360"/>
       </w:pPr>
       <w:r>
-        <w:t>Phê duyệt hoặc từ chối bài đăng việc làm</w:t>
+        <w:t>Đánh dấu thông báo đã đọc và báo cáo</w:t>
       </w:r>
     </w:p>
     <w:p>
@@ -10511,7 +14131,7 @@
           <w:szCs w:val="26"/>
           <w:lang w:val="vi-VN"/>
         </w:rPr>
-        <w:t xml:space="preserve">Chat và phỏng vấn trực tuyến </w:t>
+        <w:t>Thống kê và báo cáo</w:t>
       </w:r>
     </w:p>
     <w:p>
@@ -10524,7 +14144,7 @@
         <w:ind w:left="1440" w:right="0" w:hanging="360"/>
       </w:pPr>
       <w:r>
-        <w:t>Lấy danh sách tin nhắn của người dùng</w:t>
+        <w:t>Báo cáo cho nhà tuyển dụng (số hồ sơ nhận, tỉ lệ ứng viên đạt...)</w:t>
       </w:r>
     </w:p>
     <w:p>
@@ -10537,8 +14157,38 @@
         <w:ind w:left="1440" w:right="0" w:hanging="360"/>
       </w:pPr>
       <w:r>
-        <w:t>Gửi tin nhắn cho người khác (ứng viên hoặc nhà tuyển dụng)</w:t>
-      </w:r>
+        <w:t>Báo cáo cho người tìm việc (lượt xem hồ sơ, tỉ lệ phản hồi...)</w:t>
+      </w:r>
+    </w:p>
+    <w:p>
+      <w:pPr>
+        <w:pStyle w:val="3"/>
+        <w:ind w:left="567" w:hanging="567"/>
+        <w:outlineLvl w:val="0"/>
+        <w:rPr>
+          <w:rFonts w:ascii="Times New Roman" w:hAnsi="Times New Roman" w:cs="Times New Roman"/>
+          <w:sz w:val="26"/>
+          <w:szCs w:val="26"/>
+          <w:lang w:val="vi-VN"/>
+        </w:rPr>
+      </w:pPr>
+      <w:bookmarkStart w:id="47" w:name="_Toc5442_Copy_7"/>
+      <w:bookmarkStart w:id="48" w:name="_Toc28376_Copy_7"/>
+      <w:bookmarkStart w:id="49" w:name="_Toc30056_Copy_7"/>
+      <w:bookmarkStart w:id="50" w:name="_Toc16474_Copy_7"/>
+      <w:r>
+        <w:rPr>
+          <w:rFonts w:cs="Times New Roman"/>
+          <w:sz w:val="26"/>
+          <w:szCs w:val="26"/>
+          <w:lang w:val="vi-VN"/>
+        </w:rPr>
+        <w:t>Quản lý kỹ năng</w:t>
+      </w:r>
+      <w:bookmarkEnd w:id="47"/>
+      <w:bookmarkEnd w:id="48"/>
+      <w:bookmarkEnd w:id="49"/>
+      <w:bookmarkEnd w:id="50"/>
     </w:p>
     <w:p>
       <w:pPr>
@@ -10550,171 +14200,6 @@
         <w:ind w:left="1440" w:right="0" w:hanging="360"/>
       </w:pPr>
       <w:r>
-        <w:t>Lấy lịch phỏng vấn của người dùng (ứng viên hoặc nhà tuyển dụng)</w:t>
-      </w:r>
-    </w:p>
-    <w:p>
-      <w:pPr>
-        <w:pStyle w:val="4"/>
-        <w:numPr>
-          <w:ilvl w:val="2"/>
-          <w:numId w:val="2"/>
-        </w:numPr>
-        <w:ind w:left="1440" w:right="0" w:hanging="360"/>
-      </w:pPr>
-      <w:r>
-        <w:t>Tạo lịch phỏng vấn (thường do nhà tuyển dụng)</w:t>
-      </w:r>
-    </w:p>
-    <w:p>
-      <w:pPr>
-        <w:pStyle w:val="4"/>
-        <w:numPr>
-          <w:ilvl w:val="2"/>
-          <w:numId w:val="2"/>
-        </w:numPr>
-        <w:ind w:left="1440" w:right="0" w:hanging="360"/>
-      </w:pPr>
-      <w:r>
-        <w:t>Cập nhật trạng thái cuộc phỏng vấn (đã hoàn thành, hủy...)</w:t>
-      </w:r>
-    </w:p>
-    <w:p>
-      <w:pPr>
-        <w:pStyle w:val="3"/>
-        <w:ind w:left="567" w:hanging="567"/>
-        <w:outlineLvl w:val="0"/>
-        <w:rPr>
-          <w:rFonts w:ascii="Times New Roman" w:hAnsi="Times New Roman" w:cs="Times New Roman"/>
-          <w:sz w:val="26"/>
-          <w:szCs w:val="26"/>
-          <w:lang w:val="vi-VN"/>
-        </w:rPr>
-      </w:pPr>
-      <w:r>
-        <w:rPr>
-          <w:rFonts w:cs="Times New Roman"/>
-          <w:sz w:val="26"/>
-          <w:szCs w:val="26"/>
-          <w:lang w:val="vi-VN"/>
-        </w:rPr>
-        <w:t>Thông báo và nhắc nhở</w:t>
-      </w:r>
-    </w:p>
-    <w:p>
-      <w:pPr>
-        <w:pStyle w:val="4"/>
-        <w:numPr>
-          <w:ilvl w:val="2"/>
-          <w:numId w:val="2"/>
-        </w:numPr>
-        <w:ind w:left="1440" w:right="0" w:hanging="360"/>
-      </w:pPr>
-      <w:r>
-        <w:t>Lấy danh sách thông báo của người dùng</w:t>
-      </w:r>
-    </w:p>
-    <w:p>
-      <w:pPr>
-        <w:pStyle w:val="4"/>
-        <w:numPr>
-          <w:ilvl w:val="2"/>
-          <w:numId w:val="2"/>
-        </w:numPr>
-        <w:ind w:left="1440" w:right="0" w:hanging="360"/>
-      </w:pPr>
-      <w:r>
-        <w:t>Đánh dấu thông báo đã đọc và báo cáo</w:t>
-      </w:r>
-    </w:p>
-    <w:p>
-      <w:pPr>
-        <w:pStyle w:val="3"/>
-        <w:ind w:left="567" w:hanging="567"/>
-        <w:outlineLvl w:val="0"/>
-        <w:rPr>
-          <w:rFonts w:ascii="Times New Roman" w:hAnsi="Times New Roman" w:cs="Times New Roman"/>
-          <w:sz w:val="26"/>
-          <w:szCs w:val="26"/>
-          <w:lang w:val="vi-VN"/>
-        </w:rPr>
-      </w:pPr>
-      <w:r>
-        <w:rPr>
-          <w:rFonts w:cs="Times New Roman"/>
-          <w:sz w:val="26"/>
-          <w:szCs w:val="26"/>
-          <w:lang w:val="vi-VN"/>
-        </w:rPr>
-        <w:t>Thống kê và báo cáo</w:t>
-      </w:r>
-    </w:p>
-    <w:p>
-      <w:pPr>
-        <w:pStyle w:val="4"/>
-        <w:numPr>
-          <w:ilvl w:val="2"/>
-          <w:numId w:val="2"/>
-        </w:numPr>
-        <w:ind w:left="1440" w:right="0" w:hanging="360"/>
-      </w:pPr>
-      <w:r>
-        <w:t>Báo cáo cho nhà tuyển dụng (số hồ sơ nhận, tỉ lệ ứng viên đạt...)</w:t>
-      </w:r>
-    </w:p>
-    <w:p>
-      <w:pPr>
-        <w:pStyle w:val="4"/>
-        <w:numPr>
-          <w:ilvl w:val="2"/>
-          <w:numId w:val="2"/>
-        </w:numPr>
-        <w:ind w:left="1440" w:right="0" w:hanging="360"/>
-      </w:pPr>
-      <w:r>
-        <w:t>Báo cáo cho người tìm việc (lượt xem hồ sơ, tỉ lệ phản hồi...)</w:t>
-      </w:r>
-    </w:p>
-    <w:p>
-      <w:pPr>
-        <w:pStyle w:val="3"/>
-        <w:ind w:left="567" w:hanging="567"/>
-        <w:outlineLvl w:val="0"/>
-        <w:rPr>
-          <w:rFonts w:ascii="Times New Roman" w:hAnsi="Times New Roman" w:cs="Times New Roman"/>
-          <w:sz w:val="26"/>
-          <w:szCs w:val="26"/>
-          <w:lang w:val="vi-VN"/>
-        </w:rPr>
-      </w:pPr>
-      <w:bookmarkStart w:id="47" w:name="_Toc28376_Copy_7"/>
-      <w:bookmarkStart w:id="48" w:name="_Toc5442_Copy_7"/>
-      <w:bookmarkStart w:id="49" w:name="_Toc30056_Copy_7"/>
-      <w:bookmarkStart w:id="50" w:name="_Toc16474_Copy_7"/>
-      <w:r>
-        <w:rPr>
-          <w:rFonts w:cs="Times New Roman"/>
-          <w:sz w:val="26"/>
-          <w:szCs w:val="26"/>
-          <w:lang w:val="vi-VN"/>
-        </w:rPr>
-        <w:t>Quản lý kỹ năng</w:t>
-      </w:r>
-      <w:bookmarkEnd w:id="47"/>
-      <w:bookmarkEnd w:id="48"/>
-      <w:bookmarkEnd w:id="49"/>
-      <w:bookmarkEnd w:id="50"/>
-    </w:p>
-    <w:p>
-      <w:pPr>
-        <w:pStyle w:val="4"/>
-        <w:numPr>
-          <w:ilvl w:val="2"/>
-          <w:numId w:val="2"/>
-        </w:numPr>
-        <w:ind w:left="1440" w:right="0" w:hanging="360"/>
-      </w:pPr>
-      <w:r>
         <w:t>Lấy danh sách kỹ năng (để người tìm việc chọn thêm vào hồ sơ)</w:t>
       </w:r>
     </w:p>
@@ -10797,11 +14282,11 @@
           <w:szCs w:val="26"/>
         </w:rPr>
       </w:pPr>
-      <w:bookmarkStart w:id="55" w:name="_Toc13115"/>
-      <w:bookmarkStart w:id="56" w:name="_Toc30432"/>
-      <w:bookmarkStart w:id="57" w:name="_Toc11843"/>
-      <w:bookmarkStart w:id="58" w:name="_Toc11900"/>
-      <w:bookmarkStart w:id="59" w:name="_Toc6532"/>
+      <w:bookmarkStart w:id="55" w:name="_Toc30432"/>
+      <w:bookmarkStart w:id="56" w:name="_Toc13115"/>
+      <w:bookmarkStart w:id="57" w:name="_Toc6532"/>
+      <w:bookmarkStart w:id="58" w:name="_Toc11843"/>
+      <w:bookmarkStart w:id="59" w:name="_Toc11900"/>
       <w:r>
         <w:rPr>
           <w:rFonts w:cs="Times New Roman"/>
@@ -10829,11 +14314,11 @@
       </w:pPr>
       <w:bookmarkStart w:id="60" w:name="_5698ty2r0u41"/>
       <w:bookmarkEnd w:id="60"/>
-      <w:bookmarkStart w:id="61" w:name="_Toc14159"/>
-      <w:bookmarkStart w:id="62" w:name="_Toc24516"/>
-      <w:bookmarkStart w:id="63" w:name="_Toc20172"/>
+      <w:bookmarkStart w:id="61" w:name="_Toc4607"/>
+      <w:bookmarkStart w:id="62" w:name="_Toc14159"/>
+      <w:bookmarkStart w:id="63" w:name="_Toc24516"/>
       <w:bookmarkStart w:id="64" w:name="_Toc26826"/>
-      <w:bookmarkStart w:id="65" w:name="_Toc4607"/>
+      <w:bookmarkStart w:id="65" w:name="_Toc20172"/>
       <w:r>
         <w:rPr>
           <w:rFonts w:cs="Times New Roman"/>
@@ -10862,10 +14347,10 @@
       <w:bookmarkStart w:id="66" w:name="_448q7m2v4n3t"/>
       <w:bookmarkEnd w:id="66"/>
       <w:bookmarkStart w:id="67" w:name="_Toc27147"/>
-      <w:bookmarkStart w:id="68" w:name="_Toc31986"/>
+      <w:bookmarkStart w:id="68" w:name="_Toc21530"/>
       <w:bookmarkStart w:id="69" w:name="_Toc4164"/>
       <w:bookmarkStart w:id="70" w:name="_Toc25619"/>
-      <w:bookmarkStart w:id="71" w:name="_Toc21530"/>
+      <w:bookmarkStart w:id="71" w:name="_Toc31986"/>
       <w:r>
         <w:rPr>
           <w:rFonts w:cs="Times New Roman"/>
@@ -10893,10 +14378,10 @@
       </w:pPr>
       <w:bookmarkStart w:id="72" w:name="_q5fqr05xr78h"/>
       <w:bookmarkEnd w:id="72"/>
-      <w:bookmarkStart w:id="73" w:name="_Toc13524"/>
-      <w:bookmarkStart w:id="74" w:name="_Toc13526"/>
-      <w:bookmarkStart w:id="75" w:name="_Toc15972"/>
-      <w:bookmarkStart w:id="76" w:name="_Toc27514"/>
+      <w:bookmarkStart w:id="73" w:name="_Toc15972"/>
+      <w:bookmarkStart w:id="74" w:name="_Toc13524"/>
+      <w:bookmarkStart w:id="75" w:name="_Toc27514"/>
+      <w:bookmarkStart w:id="76" w:name="_Toc13526"/>
       <w:bookmarkStart w:id="77" w:name="_Toc9623"/>
       <w:r>
         <w:rPr>
@@ -10936,10 +14421,10 @@
         </w:rPr>
       </w:pPr>
       <w:bookmarkStart w:id="78" w:name="_Toc20360"/>
-      <w:bookmarkStart w:id="79" w:name="_Toc127971485"/>
+      <w:bookmarkStart w:id="79" w:name="_Toc14191"/>
       <w:bookmarkStart w:id="80" w:name="_Toc5822"/>
-      <w:bookmarkStart w:id="81" w:name="_Toc19751"/>
-      <w:bookmarkStart w:id="82" w:name="_Toc14191"/>
+      <w:bookmarkStart w:id="81" w:name="_Toc127971485"/>
+      <w:bookmarkStart w:id="82" w:name="_Toc19751"/>
       <w:r>
         <w:rPr>
           <w:rFonts w:cs="Times New Roman"/>
@@ -10977,9 +14462,9 @@
       </w:pPr>
       <w:bookmarkStart w:id="83" w:name="_Toc13195"/>
       <w:bookmarkStart w:id="84" w:name="_Toc127971486"/>
-      <w:bookmarkStart w:id="85" w:name="_Toc10333"/>
+      <w:bookmarkStart w:id="85" w:name="_Toc3436"/>
       <w:bookmarkStart w:id="86" w:name="_Toc11363"/>
-      <w:bookmarkStart w:id="87" w:name="_Toc3436"/>
+      <w:bookmarkStart w:id="87" w:name="_Toc10333"/>
       <w:r>
         <w:rPr>
           <w:rFonts w:cs="Times New Roman"/>
@@ -11014,11 +14499,11 @@
           <w:szCs w:val="26"/>
         </w:rPr>
       </w:pPr>
-      <w:bookmarkStart w:id="88" w:name="_Toc127971487"/>
-      <w:bookmarkStart w:id="89" w:name="_Toc30177"/>
+      <w:bookmarkStart w:id="88" w:name="_Toc30177"/>
+      <w:bookmarkStart w:id="89" w:name="_Toc127971487"/>
       <w:bookmarkStart w:id="90" w:name="_Toc31865"/>
-      <w:bookmarkStart w:id="91" w:name="_Toc27488"/>
-      <w:bookmarkStart w:id="92" w:name="_Toc17000"/>
+      <w:bookmarkStart w:id="91" w:name="_Toc17000"/>
+      <w:bookmarkStart w:id="92" w:name="_Toc27488"/>
       <w:r>
         <w:rPr>
           <w:rFonts w:cs="Times New Roman"/>
@@ -11048,11 +14533,11 @@
           <w:szCs w:val="26"/>
         </w:rPr>
       </w:pPr>
-      <w:bookmarkStart w:id="93" w:name="_Toc13364"/>
+      <w:bookmarkStart w:id="93" w:name="_Toc22422"/>
       <w:bookmarkStart w:id="94" w:name="_Toc13287"/>
       <w:bookmarkStart w:id="95" w:name="_Toc26820"/>
-      <w:bookmarkStart w:id="96" w:name="_Toc22422"/>
-      <w:bookmarkStart w:id="97" w:name="_Toc127971488"/>
+      <w:bookmarkStart w:id="96" w:name="_Toc127971488"/>
+      <w:bookmarkStart w:id="97" w:name="_Toc13364"/>
       <w:r>
         <w:rPr>
           <w:rFonts w:cs="Times New Roman"/>
@@ -11262,11 +14747,11 @@
           <w:szCs w:val="26"/>
         </w:rPr>
       </w:pPr>
-      <w:bookmarkStart w:id="99" w:name="_Toc16701"/>
-      <w:bookmarkStart w:id="100" w:name="_Toc127971489"/>
+      <w:bookmarkStart w:id="99" w:name="_Toc20288"/>
+      <w:bookmarkStart w:id="100" w:name="_Toc31248"/>
       <w:bookmarkStart w:id="101" w:name="_Toc13483"/>
-      <w:bookmarkStart w:id="102" w:name="_Toc20288"/>
-      <w:bookmarkStart w:id="103" w:name="_Toc31248"/>
+      <w:bookmarkStart w:id="102" w:name="_Toc16701"/>
+      <w:bookmarkStart w:id="103" w:name="_Toc127971489"/>
       <w:r>
         <w:rPr>
           <w:rFonts w:cs="Times New Roman"/>
@@ -12614,14 +16099,21 @@
   </w:style>
   <w:style w:type="paragraph" w:styleId="20">
     <w:name w:val="Normal (Web)"/>
-    <w:basedOn w:val="1"/>
     <w:semiHidden/>
     <w:unhideWhenUsed/>
     <w:qFormat/>
     <w:uiPriority w:val="99"/>
+    <w:pPr>
+      <w:spacing w:before="0" w:beforeAutospacing="1" w:after="0" w:afterAutospacing="1"/>
+      <w:ind w:left="0" w:right="0"/>
+      <w:jc w:val="left"/>
+    </w:pPr>
     <w:rPr>
+      <w:rFonts w:ascii="Times New Roman" w:hAnsi="Times New Roman" w:eastAsia="SimSun" w:cs="Times New Roman"/>
+      <w:kern w:val="0"/>
       <w:sz w:val="24"/>
       <w:szCs w:val="24"/>
+      <w:lang w:val="en-US" w:eastAsia="zh-CN" w:bidi="ar"/>
     </w:rPr>
   </w:style>
   <w:style w:type="character" w:styleId="21">

</xml_diff>

<commit_message>
API loc va tim kiem cong viec con thieu goi y cong viec phu hop
</commit_message>
<xml_diff>
--- a/Documents/BC_CNLTHD.docx
+++ b/Documents/BC_CNLTHD.docx
@@ -10294,6 +10294,14 @@
         </w:rPr>
         <w:t xml:space="preserve"> </w:t>
       </w:r>
+      <w:r>
+        <w:rPr>
+          <w:rFonts w:hint="default"/>
+          <w:b w:val="0"/>
+          <w:bCs w:val="0"/>
+        </w:rPr>
+        <w:t>/jobs/</w:t>
+      </w:r>
     </w:p>
     <w:p>
       <w:pPr>
@@ -10311,6 +10319,15 @@
         </w:rPr>
         <w:t xml:space="preserve">Phương thức: </w:t>
       </w:r>
+      <w:r>
+        <w:rPr>
+          <w:rFonts w:hint="default"/>
+          <w:b/>
+          <w:bCs/>
+          <w:lang w:val="en-US"/>
+        </w:rPr>
+        <w:t>GET</w:t>
+      </w:r>
     </w:p>
     <w:p>
       <w:pPr>
@@ -10344,14 +10361,16 @@
           <w:bCs w:val="0"/>
           <w:lang w:val="en-US"/>
         </w:rPr>
-        <w:t>Khi người dùng đăng nhập với vai trò là người dùng, họ có thể lọc các công việc theo từ khóa, vị trí, mức lương, loại công việc, công ty.</w:t>
-      </w:r>
-    </w:p>
-    <w:p>
-      <w:pPr>
-        <w:rPr>
-          <w:b/>
-          <w:bCs/>
+        <w:t>Tất cả mọi người có thể lọc các công việc theo từ khóa, vị trí, mức lương, loại công việc, công ty.</w:t>
+      </w:r>
+    </w:p>
+    <w:p>
+      <w:pPr>
+        <w:rPr>
+          <w:rFonts w:hint="default"/>
+          <w:b w:val="0"/>
+          <w:bCs w:val="0"/>
+          <w:lang w:val="en-US"/>
         </w:rPr>
       </w:pPr>
       <w:r>
@@ -10361,14 +10380,182 @@
         </w:rPr>
         <w:t>Request:</w:t>
       </w:r>
-    </w:p>
-    <w:p>
-      <w:pPr>
-        <w:rPr>
-          <w:rFonts w:hint="default"/>
-          <w:b/>
-          <w:bCs/>
-          <w:lang w:val="en-US"/>
+      <w:r>
+        <w:rPr>
+          <w:rFonts w:hint="default"/>
+          <w:b/>
+          <w:bCs/>
+          <w:lang w:val="en-US"/>
+        </w:rPr>
+        <w:t xml:space="preserve"> </w:t>
+      </w:r>
+      <w:r>
+        <w:rPr>
+          <w:rFonts w:hint="default"/>
+          <w:b w:val="0"/>
+          <w:bCs w:val="0"/>
+          <w:lang w:val="en-US"/>
+        </w:rPr>
+        <w:t>Gửi bằng params</w:t>
+      </w:r>
+    </w:p>
+    <w:p>
+      <w:pPr>
+        <w:rPr>
+          <w:rFonts w:hint="default"/>
+          <w:b w:val="0"/>
+          <w:bCs w:val="0"/>
+        </w:rPr>
+      </w:pPr>
+      <w:r>
+        <w:rPr>
+          <w:rFonts w:hint="default"/>
+          <w:b w:val="0"/>
+          <w:bCs w:val="0"/>
+        </w:rPr>
+        <w:t>{</w:t>
+      </w:r>
+    </w:p>
+    <w:p>
+      <w:pPr>
+        <w:rPr>
+          <w:rFonts w:hint="default"/>
+          <w:b w:val="0"/>
+          <w:bCs w:val="0"/>
+        </w:rPr>
+      </w:pPr>
+      <w:r>
+        <w:rPr>
+          <w:rFonts w:hint="default"/>
+          <w:b w:val="0"/>
+          <w:bCs w:val="0"/>
+        </w:rPr>
+        <w:t xml:space="preserve">    "keyword": "</w:t>
+      </w:r>
+      <w:r>
+        <w:rPr>
+          <w:rFonts w:hint="default"/>
+          <w:b w:val="0"/>
+          <w:bCs w:val="0"/>
+          <w:lang w:val="en-US"/>
+        </w:rPr>
+        <w:t>thủ môn</w:t>
+      </w:r>
+      <w:r>
+        <w:rPr>
+          <w:rFonts w:hint="default"/>
+          <w:b w:val="0"/>
+          <w:bCs w:val="0"/>
+        </w:rPr>
+        <w:t>",</w:t>
+      </w:r>
+    </w:p>
+    <w:p>
+      <w:pPr>
+        <w:rPr>
+          <w:rFonts w:hint="default"/>
+          <w:b w:val="0"/>
+          <w:bCs w:val="0"/>
+        </w:rPr>
+      </w:pPr>
+      <w:r>
+        <w:rPr>
+          <w:rFonts w:hint="default"/>
+          <w:b w:val="0"/>
+          <w:bCs w:val="0"/>
+        </w:rPr>
+        <w:t xml:space="preserve">    "location": "city or region",</w:t>
+      </w:r>
+    </w:p>
+    <w:p>
+      <w:pPr>
+        <w:rPr>
+          <w:rFonts w:hint="default"/>
+          <w:b w:val="0"/>
+          <w:bCs w:val="0"/>
+        </w:rPr>
+      </w:pPr>
+      <w:r>
+        <w:rPr>
+          <w:rFonts w:hint="default"/>
+          <w:b w:val="0"/>
+          <w:bCs w:val="0"/>
+        </w:rPr>
+        <w:t xml:space="preserve">    "salary_min": 50000,</w:t>
+      </w:r>
+    </w:p>
+    <w:p>
+      <w:pPr>
+        <w:rPr>
+          <w:rFonts w:hint="default"/>
+          <w:b w:val="0"/>
+          <w:bCs w:val="0"/>
+        </w:rPr>
+      </w:pPr>
+      <w:r>
+        <w:rPr>
+          <w:rFonts w:hint="default"/>
+          <w:b w:val="0"/>
+          <w:bCs w:val="0"/>
+        </w:rPr>
+        <w:t xml:space="preserve">    "salary_max": 100000,</w:t>
+      </w:r>
+    </w:p>
+    <w:p>
+      <w:pPr>
+        <w:rPr>
+          <w:rFonts w:hint="default"/>
+          <w:b w:val="0"/>
+          <w:bCs w:val="0"/>
+        </w:rPr>
+      </w:pPr>
+      <w:r>
+        <w:rPr>
+          <w:rFonts w:hint="default"/>
+          <w:b w:val="0"/>
+          <w:bCs w:val="0"/>
+        </w:rPr>
+        <w:t xml:space="preserve">    "job_type": "Full-time|Part-time|Freelance|Internship",</w:t>
+      </w:r>
+    </w:p>
+    <w:p>
+      <w:pPr>
+        <w:rPr>
+          <w:rFonts w:hint="default"/>
+          <w:b w:val="0"/>
+          <w:bCs w:val="0"/>
+        </w:rPr>
+      </w:pPr>
+      <w:r>
+        <w:rPr>
+          <w:rFonts w:hint="default"/>
+          <w:b w:val="0"/>
+          <w:bCs w:val="0"/>
+        </w:rPr>
+        <w:t xml:space="preserve">    "company": "company name"</w:t>
+      </w:r>
+    </w:p>
+    <w:p>
+      <w:pPr>
+        <w:rPr>
+          <w:b w:val="0"/>
+          <w:bCs w:val="0"/>
+        </w:rPr>
+      </w:pPr>
+      <w:r>
+        <w:rPr>
+          <w:rFonts w:hint="default"/>
+          <w:b w:val="0"/>
+          <w:bCs w:val="0"/>
+        </w:rPr>
+        <w:t>}</w:t>
+      </w:r>
+    </w:p>
+    <w:p>
+      <w:pPr>
+        <w:rPr>
+          <w:b/>
+          <w:bCs/>
         </w:rPr>
       </w:pPr>
       <w:r>
@@ -10378,6 +10565,407 @@
         </w:rPr>
         <w:t>Response:</w:t>
       </w:r>
+    </w:p>
+    <w:p>
+      <w:pPr>
+        <w:rPr>
+          <w:rFonts w:hint="default"/>
+          <w:b w:val="0"/>
+          <w:bCs w:val="0"/>
+          <w:lang w:val="en-US"/>
+        </w:rPr>
+      </w:pPr>
+      <w:r>
+        <w:rPr>
+          <w:rFonts w:hint="default"/>
+          <w:b w:val="0"/>
+          <w:bCs w:val="0"/>
+          <w:lang w:val="en-US"/>
+        </w:rPr>
+        <w:t>[</w:t>
+      </w:r>
+    </w:p>
+    <w:p>
+      <w:pPr>
+        <w:rPr>
+          <w:rFonts w:hint="default"/>
+          <w:b w:val="0"/>
+          <w:bCs w:val="0"/>
+          <w:lang w:val="en-US"/>
+        </w:rPr>
+      </w:pPr>
+      <w:r>
+        <w:rPr>
+          <w:rFonts w:hint="default"/>
+          <w:b w:val="0"/>
+          <w:bCs w:val="0"/>
+          <w:lang w:val="en-US"/>
+        </w:rPr>
+        <w:t xml:space="preserve">    {</w:t>
+      </w:r>
+    </w:p>
+    <w:p>
+      <w:pPr>
+        <w:rPr>
+          <w:rFonts w:hint="default"/>
+          <w:b w:val="0"/>
+          <w:bCs w:val="0"/>
+          <w:lang w:val="en-US"/>
+        </w:rPr>
+      </w:pPr>
+      <w:r>
+        <w:rPr>
+          <w:rFonts w:hint="default"/>
+          <w:b w:val="0"/>
+          <w:bCs w:val="0"/>
+          <w:lang w:val="en-US"/>
+        </w:rPr>
+        <w:t xml:space="preserve">        "id": "24da05ff-6666-4056-a8ba-5872af6822b8",</w:t>
+      </w:r>
+    </w:p>
+    <w:p>
+      <w:pPr>
+        <w:rPr>
+          <w:rFonts w:hint="default"/>
+          <w:b w:val="0"/>
+          <w:bCs w:val="0"/>
+          <w:lang w:val="en-US"/>
+        </w:rPr>
+      </w:pPr>
+      <w:r>
+        <w:rPr>
+          <w:rFonts w:hint="default"/>
+          <w:b w:val="0"/>
+          <w:bCs w:val="0"/>
+          <w:lang w:val="en-US"/>
+        </w:rPr>
+        <w:t xml:space="preserve">        "title": "Chúng tôi cần tuyển tiền đạo hàng đầu nước Anh",</w:t>
+      </w:r>
+    </w:p>
+    <w:p>
+      <w:pPr>
+        <w:rPr>
+          <w:rFonts w:hint="default"/>
+          <w:b w:val="0"/>
+          <w:bCs w:val="0"/>
+          <w:lang w:val="en-US"/>
+        </w:rPr>
+      </w:pPr>
+      <w:r>
+        <w:rPr>
+          <w:rFonts w:hint="default"/>
+          <w:b w:val="0"/>
+          <w:bCs w:val="0"/>
+          <w:lang w:val="en-US"/>
+        </w:rPr>
+        <w:t xml:space="preserve">        "slug": "chung-toi-can-tuyen-tien-ao-hang-au-nuoc-anh",</w:t>
+      </w:r>
+    </w:p>
+    <w:p>
+      <w:pPr>
+        <w:rPr>
+          <w:rFonts w:hint="default"/>
+          <w:b w:val="0"/>
+          <w:bCs w:val="0"/>
+          <w:lang w:val="en-US"/>
+        </w:rPr>
+      </w:pPr>
+      <w:r>
+        <w:rPr>
+          <w:rFonts w:hint="default"/>
+          <w:b w:val="0"/>
+          <w:bCs w:val="0"/>
+          <w:lang w:val="en-US"/>
+        </w:rPr>
+        <w:t xml:space="preserve">        "description": "Tiền đạo hàng đầu trời Âu cách bạn không xa",</w:t>
+      </w:r>
+    </w:p>
+    <w:p>
+      <w:pPr>
+        <w:rPr>
+          <w:rFonts w:hint="default"/>
+          <w:b w:val="0"/>
+          <w:bCs w:val="0"/>
+          <w:lang w:val="en-US"/>
+        </w:rPr>
+      </w:pPr>
+      <w:r>
+        <w:rPr>
+          <w:rFonts w:hint="default"/>
+          <w:b w:val="0"/>
+          <w:bCs w:val="0"/>
+          <w:lang w:val="en-US"/>
+        </w:rPr>
+        <w:t xml:space="preserve">        "location": "Sân Monumental",</w:t>
+      </w:r>
+    </w:p>
+    <w:p>
+      <w:pPr>
+        <w:rPr>
+          <w:rFonts w:hint="default"/>
+          <w:b w:val="0"/>
+          <w:bCs w:val="0"/>
+          <w:lang w:val="en-US"/>
+        </w:rPr>
+      </w:pPr>
+      <w:r>
+        <w:rPr>
+          <w:rFonts w:hint="default"/>
+          <w:b w:val="0"/>
+          <w:bCs w:val="0"/>
+          <w:lang w:val="en-US"/>
+        </w:rPr>
+        <w:t xml:space="preserve">        "salary_min": 200000.0,</w:t>
+      </w:r>
+    </w:p>
+    <w:p>
+      <w:pPr>
+        <w:rPr>
+          <w:rFonts w:hint="default"/>
+          <w:b w:val="0"/>
+          <w:bCs w:val="0"/>
+          <w:lang w:val="en-US"/>
+        </w:rPr>
+      </w:pPr>
+      <w:r>
+        <w:rPr>
+          <w:rFonts w:hint="default"/>
+          <w:b w:val="0"/>
+          <w:bCs w:val="0"/>
+          <w:lang w:val="en-US"/>
+        </w:rPr>
+        <w:t xml:space="preserve">        "salary_max": 500000.0,</w:t>
+      </w:r>
+    </w:p>
+    <w:p>
+      <w:pPr>
+        <w:rPr>
+          <w:rFonts w:hint="default"/>
+          <w:b w:val="0"/>
+          <w:bCs w:val="0"/>
+          <w:lang w:val="en-US"/>
+        </w:rPr>
+      </w:pPr>
+      <w:r>
+        <w:rPr>
+          <w:rFonts w:hint="default"/>
+          <w:b w:val="0"/>
+          <w:bCs w:val="0"/>
+          <w:lang w:val="en-US"/>
+        </w:rPr>
+        <w:t xml:space="preserve">        "experience_required": "5 năm",</w:t>
+      </w:r>
+    </w:p>
+    <w:p>
+      <w:pPr>
+        <w:rPr>
+          <w:rFonts w:hint="default"/>
+          <w:b w:val="0"/>
+          <w:bCs w:val="0"/>
+          <w:lang w:val="en-US"/>
+        </w:rPr>
+      </w:pPr>
+      <w:r>
+        <w:rPr>
+          <w:rFonts w:hint="default"/>
+          <w:b w:val="0"/>
+          <w:bCs w:val="0"/>
+          <w:lang w:val="en-US"/>
+        </w:rPr>
+        <w:t xml:space="preserve">        "job_type": "Full-time",</w:t>
+      </w:r>
+    </w:p>
+    <w:p>
+      <w:pPr>
+        <w:rPr>
+          <w:rFonts w:hint="default"/>
+          <w:b w:val="0"/>
+          <w:bCs w:val="0"/>
+          <w:lang w:val="en-US"/>
+        </w:rPr>
+      </w:pPr>
+      <w:r>
+        <w:rPr>
+          <w:rFonts w:hint="default"/>
+          <w:b w:val="0"/>
+          <w:bCs w:val="0"/>
+          <w:lang w:val="en-US"/>
+        </w:rPr>
+        <w:t xml:space="preserve">        "is_active": true,</w:t>
+      </w:r>
+    </w:p>
+    <w:p>
+      <w:pPr>
+        <w:rPr>
+          <w:rFonts w:hint="default"/>
+          <w:b w:val="0"/>
+          <w:bCs w:val="0"/>
+          <w:lang w:val="en-US"/>
+        </w:rPr>
+      </w:pPr>
+      <w:r>
+        <w:rPr>
+          <w:rFonts w:hint="default"/>
+          <w:b w:val="0"/>
+          <w:bCs w:val="0"/>
+          <w:lang w:val="en-US"/>
+        </w:rPr>
+        <w:t xml:space="preserve">        "expiration_date": "2025-05-29T10:05:42Z",</w:t>
+      </w:r>
+    </w:p>
+    <w:p>
+      <w:pPr>
+        <w:rPr>
+          <w:rFonts w:hint="default"/>
+          <w:b w:val="0"/>
+          <w:bCs w:val="0"/>
+          <w:lang w:val="en-US"/>
+        </w:rPr>
+      </w:pPr>
+      <w:r>
+        <w:rPr>
+          <w:rFonts w:hint="default"/>
+          <w:b w:val="0"/>
+          <w:bCs w:val="0"/>
+          <w:lang w:val="en-US"/>
+        </w:rPr>
+        <w:t xml:space="preserve">        "status": "approved",</w:t>
+      </w:r>
+    </w:p>
+    <w:p>
+      <w:pPr>
+        <w:rPr>
+          <w:rFonts w:hint="default"/>
+          <w:b w:val="0"/>
+          <w:bCs w:val="0"/>
+          <w:lang w:val="en-US"/>
+        </w:rPr>
+      </w:pPr>
+      <w:r>
+        <w:rPr>
+          <w:rFonts w:hint="default"/>
+          <w:b w:val="0"/>
+          <w:bCs w:val="0"/>
+          <w:lang w:val="en-US"/>
+        </w:rPr>
+        <w:t xml:space="preserve">        "created_at": "2025-05-27T10:06:23.234649Z",</w:t>
+      </w:r>
+    </w:p>
+    <w:p>
+      <w:pPr>
+        <w:rPr>
+          <w:rFonts w:hint="default"/>
+          <w:b w:val="0"/>
+          <w:bCs w:val="0"/>
+          <w:lang w:val="en-US"/>
+        </w:rPr>
+      </w:pPr>
+      <w:r>
+        <w:rPr>
+          <w:rFonts w:hint="default"/>
+          <w:b w:val="0"/>
+          <w:bCs w:val="0"/>
+          <w:lang w:val="en-US"/>
+        </w:rPr>
+        <w:t xml:space="preserve">        "updated_at": "2025-05-27T10:06:23.234699Z",</w:t>
+      </w:r>
+    </w:p>
+    <w:p>
+      <w:pPr>
+        <w:rPr>
+          <w:rFonts w:hint="default"/>
+          <w:b w:val="0"/>
+          <w:bCs w:val="0"/>
+          <w:lang w:val="en-US"/>
+        </w:rPr>
+      </w:pPr>
+      <w:r>
+        <w:rPr>
+          <w:rFonts w:hint="default"/>
+          <w:b w:val="0"/>
+          <w:bCs w:val="0"/>
+          <w:lang w:val="en-US"/>
+        </w:rPr>
+        <w:t xml:space="preserve">        "company_name": "Công ty Bóng đá hàng đầu trời Âu",</w:t>
+      </w:r>
+    </w:p>
+    <w:p>
+      <w:pPr>
+        <w:rPr>
+          <w:rFonts w:hint="default"/>
+          <w:b w:val="0"/>
+          <w:bCs w:val="0"/>
+          <w:lang w:val="en-US"/>
+        </w:rPr>
+      </w:pPr>
+      <w:r>
+        <w:rPr>
+          <w:rFonts w:hint="default"/>
+          <w:b w:val="0"/>
+          <w:bCs w:val="0"/>
+          <w:lang w:val="en-US"/>
+        </w:rPr>
+        <w:t xml:space="preserve">        "company_logo": "https://s120-ava-talk.zadn.vn/0/4/e/7/7/120/a02ac5fec1faa536d6b170fa5814c42f",</w:t>
+      </w:r>
+    </w:p>
+    <w:p>
+      <w:pPr>
+        <w:rPr>
+          <w:rFonts w:hint="default"/>
+          <w:b w:val="0"/>
+          <w:bCs w:val="0"/>
+          <w:lang w:val="en-US"/>
+        </w:rPr>
+      </w:pPr>
+      <w:r>
+        <w:rPr>
+          <w:rFonts w:hint="default"/>
+          <w:b w:val="0"/>
+          <w:bCs w:val="0"/>
+          <w:lang w:val="en-US"/>
+        </w:rPr>
+        <w:t xml:space="preserve">        "recruiter_username": "Recruiter1"</w:t>
+      </w:r>
+    </w:p>
+    <w:p>
+      <w:pPr>
+        <w:rPr>
+          <w:rFonts w:hint="default"/>
+          <w:b w:val="0"/>
+          <w:bCs w:val="0"/>
+          <w:lang w:val="en-US"/>
+        </w:rPr>
+      </w:pPr>
+      <w:r>
+        <w:rPr>
+          <w:rFonts w:hint="default"/>
+          <w:b w:val="0"/>
+          <w:bCs w:val="0"/>
+          <w:lang w:val="en-US"/>
+        </w:rPr>
+        <w:t xml:space="preserve">    }</w:t>
+      </w:r>
+    </w:p>
+    <w:p>
+      <w:pPr>
+        <w:rPr>
+          <w:rFonts w:hint="default"/>
+          <w:b/>
+          <w:bCs/>
+          <w:lang w:val="en-US"/>
+        </w:rPr>
+      </w:pPr>
+      <w:r>
+        <w:rPr>
+          <w:rFonts w:hint="default"/>
+          <w:b w:val="0"/>
+          <w:bCs w:val="0"/>
+          <w:lang w:val="en-US"/>
+        </w:rPr>
+        <w:t>]</w:t>
+      </w:r>
+      <w:bookmarkStart w:id="105" w:name="_GoBack"/>
+      <w:bookmarkEnd w:id="105"/>
     </w:p>
     <w:p>
       <w:pPr>
@@ -10465,6 +11053,14 @@
         </w:rPr>
         <w:t xml:space="preserve"> </w:t>
       </w:r>
+      <w:r>
+        <w:rPr>
+          <w:rFonts w:hint="default"/>
+          <w:b w:val="0"/>
+          <w:bCs w:val="0"/>
+        </w:rPr>
+        <w:t>/jobs/&lt;id&gt;/</w:t>
+      </w:r>
     </w:p>
     <w:p>
       <w:pPr>
@@ -10482,6 +11078,15 @@
         </w:rPr>
         <w:t xml:space="preserve">Phương thức: </w:t>
       </w:r>
+      <w:r>
+        <w:rPr>
+          <w:rFonts w:hint="default"/>
+          <w:b/>
+          <w:bCs/>
+          <w:lang w:val="en-US"/>
+        </w:rPr>
+        <w:t>GET</w:t>
+      </w:r>
     </w:p>
     <w:p>
       <w:pPr>
@@ -10515,7 +11120,16 @@
           <w:bCs w:val="0"/>
           <w:lang w:val="en-US"/>
         </w:rPr>
-        <w:t>Khi người dùng đăng nhập với vai trò là người dùng, truy cập vào một công việc và xem được chi tiết công việc đó.</w:t>
+        <w:t>Tất cả mọi người đều có quyền</w:t>
+      </w:r>
+      <w:r>
+        <w:rPr>
+          <w:rFonts w:hint="default"/>
+          <w:b w:val="0"/>
+          <w:bCs w:val="0"/>
+          <w:lang w:val="en-US"/>
+        </w:rPr>
+        <w:t xml:space="preserve"> truy cập vào một công việc và xem được chi tiết công việc đó.</w:t>
       </w:r>
     </w:p>
     <w:p>
@@ -10534,12 +11148,340 @@
       </w:r>
     </w:p>
     <w:p>
+      <w:pPr>
+        <w:rPr>
+          <w:b/>
+          <w:bCs/>
+        </w:rPr>
+      </w:pPr>
       <w:r>
         <w:rPr>
           <w:b/>
           <w:bCs/>
         </w:rPr>
         <w:t>Response:</w:t>
+      </w:r>
+    </w:p>
+    <w:p>
+      <w:pPr>
+        <w:rPr>
+          <w:rFonts w:hint="default"/>
+          <w:b w:val="0"/>
+          <w:bCs w:val="0"/>
+        </w:rPr>
+      </w:pPr>
+      <w:r>
+        <w:rPr>
+          <w:rFonts w:hint="default"/>
+          <w:b w:val="0"/>
+          <w:bCs w:val="0"/>
+        </w:rPr>
+        <w:t>{</w:t>
+      </w:r>
+    </w:p>
+    <w:p>
+      <w:pPr>
+        <w:rPr>
+          <w:rFonts w:hint="default"/>
+          <w:b w:val="0"/>
+          <w:bCs w:val="0"/>
+        </w:rPr>
+      </w:pPr>
+      <w:r>
+        <w:rPr>
+          <w:rFonts w:hint="default"/>
+          <w:b w:val="0"/>
+          <w:bCs w:val="0"/>
+        </w:rPr>
+        <w:t xml:space="preserve">    "id": "24da05ff-6666-4056-a8ba-5872af6822b8",</w:t>
+      </w:r>
+    </w:p>
+    <w:p>
+      <w:pPr>
+        <w:rPr>
+          <w:rFonts w:hint="default"/>
+          <w:b w:val="0"/>
+          <w:bCs w:val="0"/>
+        </w:rPr>
+      </w:pPr>
+      <w:r>
+        <w:rPr>
+          <w:rFonts w:hint="default"/>
+          <w:b w:val="0"/>
+          <w:bCs w:val="0"/>
+        </w:rPr>
+        <w:t xml:space="preserve">    "title": "Chúng tôi cần tuyển tiền đạo hàng đầu nước Anh",</w:t>
+      </w:r>
+    </w:p>
+    <w:p>
+      <w:pPr>
+        <w:rPr>
+          <w:rFonts w:hint="default"/>
+          <w:b w:val="0"/>
+          <w:bCs w:val="0"/>
+        </w:rPr>
+      </w:pPr>
+      <w:r>
+        <w:rPr>
+          <w:rFonts w:hint="default"/>
+          <w:b w:val="0"/>
+          <w:bCs w:val="0"/>
+        </w:rPr>
+        <w:t xml:space="preserve">    "slug": "chung-toi-can-tuyen-tien-ao-hang-au-nuoc-anh",</w:t>
+      </w:r>
+    </w:p>
+    <w:p>
+      <w:pPr>
+        <w:rPr>
+          <w:rFonts w:hint="default"/>
+          <w:b w:val="0"/>
+          <w:bCs w:val="0"/>
+        </w:rPr>
+      </w:pPr>
+      <w:r>
+        <w:rPr>
+          <w:rFonts w:hint="default"/>
+          <w:b w:val="0"/>
+          <w:bCs w:val="0"/>
+        </w:rPr>
+        <w:t xml:space="preserve">    "description": "Tiền đạo hàng đầu trời Âu cách bạn không xa",</w:t>
+      </w:r>
+    </w:p>
+    <w:p>
+      <w:pPr>
+        <w:rPr>
+          <w:rFonts w:hint="default"/>
+          <w:b w:val="0"/>
+          <w:bCs w:val="0"/>
+        </w:rPr>
+      </w:pPr>
+      <w:r>
+        <w:rPr>
+          <w:rFonts w:hint="default"/>
+          <w:b w:val="0"/>
+          <w:bCs w:val="0"/>
+        </w:rPr>
+        <w:t xml:space="preserve">    "location": "Sân Monumental",</w:t>
+      </w:r>
+    </w:p>
+    <w:p>
+      <w:pPr>
+        <w:rPr>
+          <w:rFonts w:hint="default"/>
+          <w:b w:val="0"/>
+          <w:bCs w:val="0"/>
+        </w:rPr>
+      </w:pPr>
+      <w:r>
+        <w:rPr>
+          <w:rFonts w:hint="default"/>
+          <w:b w:val="0"/>
+          <w:bCs w:val="0"/>
+        </w:rPr>
+        <w:t xml:space="preserve">    "salary_min": 200000.0,</w:t>
+      </w:r>
+    </w:p>
+    <w:p>
+      <w:pPr>
+        <w:rPr>
+          <w:rFonts w:hint="default"/>
+          <w:b w:val="0"/>
+          <w:bCs w:val="0"/>
+        </w:rPr>
+      </w:pPr>
+      <w:r>
+        <w:rPr>
+          <w:rFonts w:hint="default"/>
+          <w:b w:val="0"/>
+          <w:bCs w:val="0"/>
+        </w:rPr>
+        <w:t xml:space="preserve">    "salary_max": 500000.0,</w:t>
+      </w:r>
+    </w:p>
+    <w:p>
+      <w:pPr>
+        <w:rPr>
+          <w:rFonts w:hint="default"/>
+          <w:b w:val="0"/>
+          <w:bCs w:val="0"/>
+        </w:rPr>
+      </w:pPr>
+      <w:r>
+        <w:rPr>
+          <w:rFonts w:hint="default"/>
+          <w:b w:val="0"/>
+          <w:bCs w:val="0"/>
+        </w:rPr>
+        <w:t xml:space="preserve">    "experience_required": "5+ years",</w:t>
+      </w:r>
+    </w:p>
+    <w:p>
+      <w:pPr>
+        <w:rPr>
+          <w:rFonts w:hint="default"/>
+          <w:b w:val="0"/>
+          <w:bCs w:val="0"/>
+        </w:rPr>
+      </w:pPr>
+      <w:r>
+        <w:rPr>
+          <w:rFonts w:hint="default"/>
+          <w:b w:val="0"/>
+          <w:bCs w:val="0"/>
+        </w:rPr>
+        <w:t xml:space="preserve">    "job_type": "Full-time",</w:t>
+      </w:r>
+    </w:p>
+    <w:p>
+      <w:pPr>
+        <w:rPr>
+          <w:rFonts w:hint="default"/>
+          <w:b w:val="0"/>
+          <w:bCs w:val="0"/>
+        </w:rPr>
+      </w:pPr>
+      <w:r>
+        <w:rPr>
+          <w:rFonts w:hint="default"/>
+          <w:b w:val="0"/>
+          <w:bCs w:val="0"/>
+        </w:rPr>
+        <w:t xml:space="preserve">    "is_active": true,</w:t>
+      </w:r>
+    </w:p>
+    <w:p>
+      <w:pPr>
+        <w:rPr>
+          <w:rFonts w:hint="default"/>
+          <w:b w:val="0"/>
+          <w:bCs w:val="0"/>
+        </w:rPr>
+      </w:pPr>
+      <w:r>
+        <w:rPr>
+          <w:rFonts w:hint="default"/>
+          <w:b w:val="0"/>
+          <w:bCs w:val="0"/>
+        </w:rPr>
+        <w:t xml:space="preserve">    "expiration_date": "2025-05-29T10:05:42Z",</w:t>
+      </w:r>
+    </w:p>
+    <w:p>
+      <w:pPr>
+        <w:rPr>
+          <w:rFonts w:hint="default"/>
+          <w:b w:val="0"/>
+          <w:bCs w:val="0"/>
+        </w:rPr>
+      </w:pPr>
+      <w:r>
+        <w:rPr>
+          <w:rFonts w:hint="default"/>
+          <w:b w:val="0"/>
+          <w:bCs w:val="0"/>
+        </w:rPr>
+        <w:t xml:space="preserve">    "status": "approved",</w:t>
+      </w:r>
+    </w:p>
+    <w:p>
+      <w:pPr>
+        <w:rPr>
+          <w:rFonts w:hint="default"/>
+          <w:b w:val="0"/>
+          <w:bCs w:val="0"/>
+        </w:rPr>
+      </w:pPr>
+      <w:r>
+        <w:rPr>
+          <w:rFonts w:hint="default"/>
+          <w:b w:val="0"/>
+          <w:bCs w:val="0"/>
+        </w:rPr>
+        <w:t xml:space="preserve">    "created_at": "2025-05-27T10:06:23.234649Z",</w:t>
+      </w:r>
+    </w:p>
+    <w:p>
+      <w:pPr>
+        <w:rPr>
+          <w:rFonts w:hint="default"/>
+          <w:b w:val="0"/>
+          <w:bCs w:val="0"/>
+        </w:rPr>
+      </w:pPr>
+      <w:r>
+        <w:rPr>
+          <w:rFonts w:hint="default"/>
+          <w:b w:val="0"/>
+          <w:bCs w:val="0"/>
+        </w:rPr>
+        <w:t xml:space="preserve">    "updated_at": "2025-05-27T10:06:23.234699Z",</w:t>
+      </w:r>
+    </w:p>
+    <w:p>
+      <w:pPr>
+        <w:rPr>
+          <w:rFonts w:hint="default"/>
+          <w:b w:val="0"/>
+          <w:bCs w:val="0"/>
+        </w:rPr>
+      </w:pPr>
+      <w:r>
+        <w:rPr>
+          <w:rFonts w:hint="default"/>
+          <w:b w:val="0"/>
+          <w:bCs w:val="0"/>
+        </w:rPr>
+        <w:t xml:space="preserve">    "company_name": "Công ty Bóng đá hàng đầu trời Âu",</w:t>
+      </w:r>
+    </w:p>
+    <w:p>
+      <w:pPr>
+        <w:rPr>
+          <w:rFonts w:hint="default"/>
+          <w:b w:val="0"/>
+          <w:bCs w:val="0"/>
+        </w:rPr>
+      </w:pPr>
+      <w:r>
+        <w:rPr>
+          <w:rFonts w:hint="default"/>
+          <w:b w:val="0"/>
+          <w:bCs w:val="0"/>
+        </w:rPr>
+        <w:t xml:space="preserve">    "company_logo": "https://s120-ava-talk.zadn.vn/0/4/e/7/7/120/a02ac5fec1faa536d6b170fa5814c42f",</w:t>
+      </w:r>
+    </w:p>
+    <w:p>
+      <w:pPr>
+        <w:rPr>
+          <w:rFonts w:hint="default"/>
+          <w:b w:val="0"/>
+          <w:bCs w:val="0"/>
+        </w:rPr>
+      </w:pPr>
+      <w:r>
+        <w:rPr>
+          <w:rFonts w:hint="default"/>
+          <w:b w:val="0"/>
+          <w:bCs w:val="0"/>
+        </w:rPr>
+        <w:t xml:space="preserve">    "recruiter_username": "Recruiter1"</w:t>
+      </w:r>
+    </w:p>
+    <w:p>
+      <w:pPr>
+        <w:rPr>
+          <w:b w:val="0"/>
+          <w:bCs w:val="0"/>
+        </w:rPr>
+      </w:pPr>
+      <w:r>
+        <w:rPr>
+          <w:rFonts w:hint="default"/>
+          <w:b w:val="0"/>
+          <w:bCs w:val="0"/>
+        </w:rPr>
+        <w:t>}</w:t>
       </w:r>
     </w:p>
     <w:p>
@@ -10554,6 +11496,10 @@
         </w:tabs>
         <w:ind w:right="0" w:rightChars="0"/>
         <w:outlineLvl w:val="2"/>
+        <w:rPr>
+          <w:rFonts w:hint="default"/>
+          <w:lang w:val="en-US"/>
+        </w:rPr>
       </w:pPr>
       <w:r>
         <w:rPr>
@@ -10563,7 +11509,185 @@
         <w:t xml:space="preserve">2.3.3. </w:t>
       </w:r>
       <w:r>
-        <w:t>API gợi ý công việc dựa trên hồ sơ người dùng</w:t>
+        <w:t xml:space="preserve">API gợi ý công việc dựa trên hồ sơ người </w:t>
+      </w:r>
+      <w:r>
+        <w:rPr>
+          <w:rFonts w:hint="default"/>
+          <w:lang w:val="en-US"/>
+        </w:rPr>
+        <w:t>tìm việc</w:t>
+      </w:r>
+      <w:r>
+        <w:br w:type="textWrapping"/>
+      </w:r>
+      <w:r>
+        <w:rPr>
+          <w:rFonts w:hint="default"/>
+        </w:rPr>
+        <w:t xml:space="preserve">API: </w:t>
+      </w:r>
+      <w:r>
+        <w:t xml:space="preserve">API gợi ý công việc dựa trên hồ sơ người </w:t>
+      </w:r>
+      <w:r>
+        <w:rPr>
+          <w:rFonts w:hint="default"/>
+          <w:lang w:val="en-US"/>
+        </w:rPr>
+        <w:t>tìm việc</w:t>
+      </w:r>
+    </w:p>
+    <w:p>
+      <w:pPr>
+        <w:pStyle w:val="4"/>
+        <w:numPr>
+          <w:ilvl w:val="2"/>
+          <w:numId w:val="0"/>
+        </w:numPr>
+        <w:tabs>
+          <w:tab w:val="clear" w:pos="1440"/>
+        </w:tabs>
+        <w:ind w:right="0" w:rightChars="0"/>
+        <w:outlineLvl w:val="2"/>
+        <w:rPr>
+          <w:rFonts w:hint="default"/>
+        </w:rPr>
+      </w:pPr>
+      <w:r>
+        <w:rPr>
+          <w:rFonts w:hint="default"/>
+        </w:rPr>
+        <w:t xml:space="preserve">URL: </w:t>
+      </w:r>
+      <w:r>
+        <w:rPr>
+          <w:rFonts w:hint="default"/>
+          <w:b w:val="0"/>
+          <w:bCs w:val="0"/>
+        </w:rPr>
+        <w:t>/jobs/recommended/</w:t>
+      </w:r>
+    </w:p>
+    <w:p>
+      <w:pPr>
+        <w:pStyle w:val="4"/>
+        <w:numPr>
+          <w:ilvl w:val="2"/>
+          <w:numId w:val="0"/>
+        </w:numPr>
+        <w:tabs>
+          <w:tab w:val="clear" w:pos="1440"/>
+        </w:tabs>
+        <w:ind w:right="0" w:rightChars="0"/>
+        <w:outlineLvl w:val="2"/>
+        <w:rPr>
+          <w:rFonts w:hint="default"/>
+          <w:lang w:val="en-US"/>
+        </w:rPr>
+      </w:pPr>
+      <w:r>
+        <w:rPr>
+          <w:rFonts w:hint="default"/>
+        </w:rPr>
+        <w:t xml:space="preserve">Phương thức: </w:t>
+      </w:r>
+      <w:r>
+        <w:rPr>
+          <w:rFonts w:hint="default"/>
+          <w:lang w:val="en-US"/>
+        </w:rPr>
+        <w:t>GET</w:t>
+      </w:r>
+    </w:p>
+    <w:p>
+      <w:pPr>
+        <w:pStyle w:val="4"/>
+        <w:numPr>
+          <w:ilvl w:val="2"/>
+          <w:numId w:val="0"/>
+        </w:numPr>
+        <w:tabs>
+          <w:tab w:val="clear" w:pos="1440"/>
+        </w:tabs>
+        <w:ind w:right="0" w:rightChars="0"/>
+        <w:outlineLvl w:val="2"/>
+        <w:rPr>
+          <w:rFonts w:hint="default"/>
+          <w:b w:val="0"/>
+          <w:bCs w:val="0"/>
+          <w:lang w:val="en-US"/>
+        </w:rPr>
+      </w:pPr>
+      <w:r>
+        <w:rPr>
+          <w:rFonts w:hint="default"/>
+        </w:rPr>
+        <w:t xml:space="preserve">Mô tả: </w:t>
+      </w:r>
+      <w:r>
+        <w:rPr>
+          <w:rFonts w:hint="default"/>
+          <w:b w:val="0"/>
+          <w:bCs w:val="0"/>
+        </w:rPr>
+        <w:t xml:space="preserve">Khi người dùng đăng nhập với vai trò là người </w:t>
+      </w:r>
+      <w:r>
+        <w:rPr>
+          <w:rFonts w:hint="default"/>
+          <w:b w:val="0"/>
+          <w:bCs w:val="0"/>
+          <w:lang w:val="en-US"/>
+        </w:rPr>
+        <w:t>tìm việc</w:t>
+      </w:r>
+      <w:r>
+        <w:rPr>
+          <w:rFonts w:hint="default"/>
+          <w:b w:val="0"/>
+          <w:bCs w:val="0"/>
+        </w:rPr>
+        <w:t xml:space="preserve">, </w:t>
+      </w:r>
+      <w:r>
+        <w:rPr>
+          <w:rFonts w:hint="default"/>
+          <w:b w:val="0"/>
+          <w:bCs w:val="0"/>
+          <w:lang w:val="en-US"/>
+        </w:rPr>
+        <w:t>họ có thể sử dụng chức năng lọc theo sự phù hợp với profile của họ, kết quả lọc công việc sẽ là các công việc phù hợp với profile của người tìm việc.</w:t>
+      </w:r>
+    </w:p>
+    <w:p>
+      <w:pPr>
+        <w:rPr>
+          <w:b/>
+          <w:bCs/>
+        </w:rPr>
+      </w:pPr>
+      <w:r>
+        <w:rPr>
+          <w:b/>
+          <w:bCs/>
+        </w:rPr>
+        <w:t>Request:</w:t>
+      </w:r>
+    </w:p>
+    <w:p>
+      <w:pPr>
+        <w:rPr>
+          <w:rFonts w:hint="default"/>
+          <w:lang w:val="en-US"/>
+        </w:rPr>
+      </w:pPr>
+      <w:r>
+        <w:rPr>
+          <w:b/>
+          <w:bCs/>
+        </w:rPr>
+        <w:t>Response:</w:t>
       </w:r>
     </w:p>
     <w:p>
@@ -13337,7 +14461,6 @@
           <w:lang w:val="en-US" w:eastAsia="zh-CN"/>
         </w:rPr>
       </w:pPr>
-      <w:bookmarkStart w:id="105" w:name="_GoBack"/>
       <w:r>
         <w:rPr>
           <w:rFonts w:hint="default" w:ascii="Times New Roman" w:hAnsi="Times New Roman" w:eastAsia="Calibri"/>
@@ -13806,7 +14929,6 @@
         </w:rPr>
         <w:t>}</w:t>
       </w:r>
-      <w:bookmarkEnd w:id="105"/>
     </w:p>
     <w:p>
       <w:pPr>

</xml_diff>

<commit_message>
tim kiem viec lÃam bang slug va toi uu lai application api
</commit_message>
<xml_diff>
--- a/Documents/BC_CNLTHD.docx
+++ b/Documents/BC_CNLTHD.docx
@@ -1971,8 +1971,8 @@
           <w:szCs w:val="26"/>
         </w:rPr>
       </w:pPr>
-      <w:bookmarkStart w:id="3" w:name="_Toc127971472"/>
-      <w:bookmarkStart w:id="4" w:name="_Toc25729"/>
+      <w:bookmarkStart w:id="3" w:name="_Toc25729"/>
+      <w:bookmarkStart w:id="4" w:name="_Toc127971472"/>
       <w:r>
         <w:rPr>
           <w:rFonts w:cs="Times New Roman"/>
@@ -2404,10 +2404,10 @@
         </w:rPr>
       </w:pPr>
       <w:bookmarkStart w:id="10" w:name="_Toc29762"/>
-      <w:bookmarkStart w:id="11" w:name="_Toc26858"/>
+      <w:bookmarkStart w:id="11" w:name="_Toc127971474"/>
       <w:bookmarkStart w:id="12" w:name="_Toc12896"/>
-      <w:bookmarkStart w:id="13" w:name="_Toc127971474"/>
-      <w:bookmarkStart w:id="14" w:name="_Toc1321"/>
+      <w:bookmarkStart w:id="13" w:name="_Toc1321"/>
+      <w:bookmarkStart w:id="14" w:name="_Toc26858"/>
       <w:r>
         <w:rPr>
           <w:rFonts w:cs="Times New Roman"/>
@@ -2435,11 +2435,11 @@
           <w:lang w:val="vi-VN"/>
         </w:rPr>
       </w:pPr>
-      <w:bookmarkStart w:id="15" w:name="_Toc32569"/>
-      <w:bookmarkStart w:id="16" w:name="_Toc24718"/>
-      <w:bookmarkStart w:id="17" w:name="_Toc15799"/>
+      <w:bookmarkStart w:id="15" w:name="_Toc24718"/>
+      <w:bookmarkStart w:id="16" w:name="_Toc15799"/>
+      <w:bookmarkStart w:id="17" w:name="_Toc24559"/>
       <w:bookmarkStart w:id="18" w:name="_Toc127971475"/>
-      <w:bookmarkStart w:id="19" w:name="_Toc24559"/>
+      <w:bookmarkStart w:id="19" w:name="_Toc32569"/>
       <w:r>
         <w:rPr>
           <w:rFonts w:cs="Times New Roman"/>
@@ -2492,11 +2492,11 @@
           <w:szCs w:val="26"/>
         </w:rPr>
       </w:pPr>
-      <w:bookmarkStart w:id="20" w:name="_Toc21081"/>
-      <w:bookmarkStart w:id="21" w:name="_Toc9194"/>
-      <w:bookmarkStart w:id="22" w:name="_Toc5262"/>
-      <w:bookmarkStart w:id="23" w:name="_Toc3839"/>
-      <w:bookmarkStart w:id="24" w:name="_Toc127971476"/>
+      <w:bookmarkStart w:id="20" w:name="_Toc3839"/>
+      <w:bookmarkStart w:id="21" w:name="_Toc21081"/>
+      <w:bookmarkStart w:id="22" w:name="_Toc127971476"/>
+      <w:bookmarkStart w:id="23" w:name="_Toc9194"/>
+      <w:bookmarkStart w:id="24" w:name="_Toc5262"/>
       <w:r>
         <w:rPr>
           <w:rFonts w:cs="Times New Roman"/>
@@ -2527,9 +2527,9 @@
         </w:rPr>
       </w:pPr>
       <w:bookmarkStart w:id="25" w:name="_Toc26472"/>
-      <w:bookmarkStart w:id="26" w:name="_Toc4543"/>
+      <w:bookmarkStart w:id="26" w:name="_Toc11807"/>
       <w:bookmarkStart w:id="27" w:name="_Toc8189"/>
-      <w:bookmarkStart w:id="28" w:name="_Toc11807"/>
+      <w:bookmarkStart w:id="28" w:name="_Toc4543"/>
       <w:r>
         <w:rPr>
           <w:rFonts w:cs="Times New Roman"/>
@@ -3944,10 +3944,10 @@
         <w:bidi w:val="0"/>
         <w:ind w:left="1078" w:right="0" w:hanging="851"/>
       </w:pPr>
-      <w:bookmarkStart w:id="30" w:name="_Toc2410"/>
-      <w:bookmarkStart w:id="31" w:name="_Toc12536"/>
-      <w:bookmarkStart w:id="32" w:name="_Toc32152"/>
-      <w:bookmarkStart w:id="33" w:name="_Toc13193"/>
+      <w:bookmarkStart w:id="30" w:name="_Toc32152"/>
+      <w:bookmarkStart w:id="31" w:name="_Toc13193"/>
+      <w:bookmarkStart w:id="32" w:name="_Toc2410"/>
+      <w:bookmarkStart w:id="33" w:name="_Toc12536"/>
       <w:r>
         <w:rPr>
           <w:lang w:val="vi-VN"/>
@@ -4148,10 +4148,10 @@
           <w:lang w:val="en-US" w:eastAsia="en-US" w:bidi="ar-SA"/>
         </w:rPr>
       </w:pPr>
-      <w:bookmarkStart w:id="35" w:name="_Toc26732"/>
-      <w:bookmarkStart w:id="36" w:name="_Toc17063"/>
-      <w:bookmarkStart w:id="37" w:name="_Toc29387"/>
-      <w:bookmarkStart w:id="38" w:name="_Toc1611"/>
+      <w:bookmarkStart w:id="35" w:name="_Toc1611"/>
+      <w:bookmarkStart w:id="36" w:name="_Toc29387"/>
+      <w:bookmarkStart w:id="37" w:name="_Toc26732"/>
+      <w:bookmarkStart w:id="38" w:name="_Toc17063"/>
       <w:r>
         <w:rPr>
           <w:rFonts w:eastAsia="Times New Roman" w:cs="Times New Roman"/>
@@ -6978,13 +6978,13 @@
       <w:r>
         <w:t>Quản lý hồ sơ và CV</w:t>
       </w:r>
-      <w:bookmarkStart w:id="39" w:name="_Toc5442_Copy_1"/>
+      <w:bookmarkStart w:id="39" w:name="_Toc30056_Copy_1"/>
       <w:bookmarkEnd w:id="39"/>
-      <w:bookmarkStart w:id="40" w:name="_Toc30056_Copy_1"/>
+      <w:bookmarkStart w:id="40" w:name="_Toc28376_Copy_1"/>
       <w:bookmarkEnd w:id="40"/>
       <w:bookmarkStart w:id="41" w:name="_Toc16474_Copy_1"/>
       <w:bookmarkEnd w:id="41"/>
-      <w:bookmarkStart w:id="42" w:name="_Toc28376_Copy_1"/>
+      <w:bookmarkStart w:id="42" w:name="_Toc5442_Copy_1"/>
       <w:bookmarkEnd w:id="42"/>
       <w:r>
         <w:rPr>
@@ -10964,8 +10964,6 @@
         </w:rPr>
         <w:t>]</w:t>
       </w:r>
-      <w:bookmarkStart w:id="105" w:name="_GoBack"/>
-      <w:bookmarkEnd w:id="105"/>
     </w:p>
     <w:p>
       <w:pPr>
@@ -11059,7 +11057,24 @@
           <w:b w:val="0"/>
           <w:bCs w:val="0"/>
         </w:rPr>
-        <w:t>/jobs/&lt;id&gt;/</w:t>
+        <w:t>/jobs/&lt;</w:t>
+      </w:r>
+      <w:r>
+        <w:rPr>
+          <w:rFonts w:hint="default"/>
+          <w:b w:val="0"/>
+          <w:bCs w:val="0"/>
+          <w:lang w:val="en-US"/>
+        </w:rPr>
+        <w:t>slug</w:t>
+      </w:r>
+      <w:r>
+        <w:rPr>
+          <w:rFonts w:hint="default"/>
+          <w:b w:val="0"/>
+          <w:bCs w:val="0"/>
+        </w:rPr>
+        <w:t>&gt;/</w:t>
       </w:r>
     </w:p>
     <w:p>
@@ -11120,16 +11135,7 @@
           <w:bCs w:val="0"/>
           <w:lang w:val="en-US"/>
         </w:rPr>
-        <w:t>Tất cả mọi người đều có quyền</w:t>
-      </w:r>
-      <w:r>
-        <w:rPr>
-          <w:rFonts w:hint="default"/>
-          <w:b w:val="0"/>
-          <w:bCs w:val="0"/>
-          <w:lang w:val="en-US"/>
-        </w:rPr>
-        <w:t xml:space="preserve"> truy cập vào một công việc và xem được chi tiết công việc đó.</w:t>
+        <w:t>Tất cả mọi người đều có quyền truy cập vào một công việc và xem được chi tiết công việc đó.</w:t>
       </w:r>
     </w:p>
     <w:p>
@@ -11193,7 +11199,25 @@
           <w:b w:val="0"/>
           <w:bCs w:val="0"/>
         </w:rPr>
-        <w:t xml:space="preserve">    "id": "24da05ff-6666-4056-a8ba-5872af6822b8",</w:t>
+        <w:t xml:space="preserve">    "id": "</w:t>
+      </w:r>
+      <w:bookmarkStart w:id="105" w:name="_GoBack"/>
+      <w:r>
+        <w:rPr>
+          <w:rFonts w:hint="default"/>
+          <w:b w:val="0"/>
+          <w:bCs w:val="0"/>
+        </w:rPr>
+        <w:t>24da05ff-6666-4056-a8ba-58</w:t>
+      </w:r>
+      <w:bookmarkEnd w:id="105"/>
+      <w:r>
+        <w:rPr>
+          <w:rFonts w:hint="default"/>
+          <w:b w:val="0"/>
+          <w:bCs w:val="0"/>
+        </w:rPr>
+        <w:t>72af6822b8",</w:t>
       </w:r>
     </w:p>
     <w:p>
@@ -14943,9 +14967,9 @@
         </w:rPr>
       </w:pPr>
       <w:bookmarkStart w:id="43" w:name="_Toc28376_Copy_4"/>
-      <w:bookmarkStart w:id="44" w:name="_Toc5442_Copy_4"/>
-      <w:bookmarkStart w:id="45" w:name="_Toc30056_Copy_4"/>
-      <w:bookmarkStart w:id="46" w:name="_Toc16474_Copy_4"/>
+      <w:bookmarkStart w:id="44" w:name="_Toc16474_Copy_4"/>
+      <w:bookmarkStart w:id="45" w:name="_Toc5442_Copy_4"/>
+      <w:bookmarkStart w:id="46" w:name="_Toc30056_Copy_4"/>
       <w:r>
         <w:rPr>
           <w:rFonts w:cs="Times New Roman"/>
@@ -15295,9 +15319,9 @@
         </w:rPr>
       </w:pPr>
       <w:bookmarkStart w:id="47" w:name="_Toc5442_Copy_7"/>
-      <w:bookmarkStart w:id="48" w:name="_Toc28376_Copy_7"/>
-      <w:bookmarkStart w:id="49" w:name="_Toc30056_Copy_7"/>
-      <w:bookmarkStart w:id="50" w:name="_Toc16474_Copy_7"/>
+      <w:bookmarkStart w:id="48" w:name="_Toc16474_Copy_7"/>
+      <w:bookmarkStart w:id="49" w:name="_Toc28376_Copy_7"/>
+      <w:bookmarkStart w:id="50" w:name="_Toc30056_Copy_7"/>
       <w:r>
         <w:rPr>
           <w:rFonts w:cs="Times New Roman"/>
@@ -15374,10 +15398,10 @@
         </w:rPr>
         <w:t xml:space="preserve"> </w:t>
       </w:r>
-      <w:bookmarkStart w:id="51" w:name="_Toc1520"/>
-      <w:bookmarkStart w:id="52" w:name="_Toc25133"/>
-      <w:bookmarkStart w:id="53" w:name="_Toc4304"/>
-      <w:bookmarkStart w:id="54" w:name="_Toc1149"/>
+      <w:bookmarkStart w:id="51" w:name="_Toc25133"/>
+      <w:bookmarkStart w:id="52" w:name="_Toc4304"/>
+      <w:bookmarkStart w:id="53" w:name="_Toc1149"/>
+      <w:bookmarkStart w:id="54" w:name="_Toc1520"/>
       <w:r>
         <w:rPr>
           <w:rFonts w:cs="Times New Roman"/>
@@ -15404,11 +15428,11 @@
           <w:szCs w:val="26"/>
         </w:rPr>
       </w:pPr>
-      <w:bookmarkStart w:id="55" w:name="_Toc30432"/>
-      <w:bookmarkStart w:id="56" w:name="_Toc13115"/>
-      <w:bookmarkStart w:id="57" w:name="_Toc6532"/>
+      <w:bookmarkStart w:id="55" w:name="_Toc6532"/>
+      <w:bookmarkStart w:id="56" w:name="_Toc11900"/>
+      <w:bookmarkStart w:id="57" w:name="_Toc30432"/>
       <w:bookmarkStart w:id="58" w:name="_Toc11843"/>
-      <w:bookmarkStart w:id="59" w:name="_Toc11900"/>
+      <w:bookmarkStart w:id="59" w:name="_Toc13115"/>
       <w:r>
         <w:rPr>
           <w:rFonts w:cs="Times New Roman"/>
@@ -15436,11 +15460,11 @@
       </w:pPr>
       <w:bookmarkStart w:id="60" w:name="_5698ty2r0u41"/>
       <w:bookmarkEnd w:id="60"/>
-      <w:bookmarkStart w:id="61" w:name="_Toc4607"/>
-      <w:bookmarkStart w:id="62" w:name="_Toc14159"/>
+      <w:bookmarkStart w:id="61" w:name="_Toc26826"/>
+      <w:bookmarkStart w:id="62" w:name="_Toc20172"/>
       <w:bookmarkStart w:id="63" w:name="_Toc24516"/>
-      <w:bookmarkStart w:id="64" w:name="_Toc26826"/>
-      <w:bookmarkStart w:id="65" w:name="_Toc20172"/>
+      <w:bookmarkStart w:id="64" w:name="_Toc4607"/>
+      <w:bookmarkStart w:id="65" w:name="_Toc14159"/>
       <w:r>
         <w:rPr>
           <w:rFonts w:cs="Times New Roman"/>
@@ -15470,9 +15494,9 @@
       <w:bookmarkEnd w:id="66"/>
       <w:bookmarkStart w:id="67" w:name="_Toc27147"/>
       <w:bookmarkStart w:id="68" w:name="_Toc21530"/>
-      <w:bookmarkStart w:id="69" w:name="_Toc4164"/>
-      <w:bookmarkStart w:id="70" w:name="_Toc25619"/>
-      <w:bookmarkStart w:id="71" w:name="_Toc31986"/>
+      <w:bookmarkStart w:id="69" w:name="_Toc31986"/>
+      <w:bookmarkStart w:id="70" w:name="_Toc4164"/>
+      <w:bookmarkStart w:id="71" w:name="_Toc25619"/>
       <w:r>
         <w:rPr>
           <w:rFonts w:cs="Times New Roman"/>
@@ -15500,11 +15524,11 @@
       </w:pPr>
       <w:bookmarkStart w:id="72" w:name="_q5fqr05xr78h"/>
       <w:bookmarkEnd w:id="72"/>
-      <w:bookmarkStart w:id="73" w:name="_Toc15972"/>
-      <w:bookmarkStart w:id="74" w:name="_Toc13524"/>
+      <w:bookmarkStart w:id="73" w:name="_Toc13526"/>
+      <w:bookmarkStart w:id="74" w:name="_Toc9623"/>
       <w:bookmarkStart w:id="75" w:name="_Toc27514"/>
-      <w:bookmarkStart w:id="76" w:name="_Toc13526"/>
-      <w:bookmarkStart w:id="77" w:name="_Toc9623"/>
+      <w:bookmarkStart w:id="76" w:name="_Toc13524"/>
+      <w:bookmarkStart w:id="77" w:name="_Toc15972"/>
       <w:r>
         <w:rPr>
           <w:rFonts w:cs="Times New Roman"/>
@@ -15542,11 +15566,11 @@
           <w:szCs w:val="26"/>
         </w:rPr>
       </w:pPr>
-      <w:bookmarkStart w:id="78" w:name="_Toc20360"/>
-      <w:bookmarkStart w:id="79" w:name="_Toc14191"/>
-      <w:bookmarkStart w:id="80" w:name="_Toc5822"/>
-      <w:bookmarkStart w:id="81" w:name="_Toc127971485"/>
-      <w:bookmarkStart w:id="82" w:name="_Toc19751"/>
+      <w:bookmarkStart w:id="78" w:name="_Toc127971485"/>
+      <w:bookmarkStart w:id="79" w:name="_Toc19751"/>
+      <w:bookmarkStart w:id="80" w:name="_Toc20360"/>
+      <w:bookmarkStart w:id="81" w:name="_Toc14191"/>
+      <w:bookmarkStart w:id="82" w:name="_Toc5822"/>
       <w:r>
         <w:rPr>
           <w:rFonts w:cs="Times New Roman"/>
@@ -15584,9 +15608,9 @@
       </w:pPr>
       <w:bookmarkStart w:id="83" w:name="_Toc13195"/>
       <w:bookmarkStart w:id="84" w:name="_Toc127971486"/>
-      <w:bookmarkStart w:id="85" w:name="_Toc3436"/>
-      <w:bookmarkStart w:id="86" w:name="_Toc11363"/>
-      <w:bookmarkStart w:id="87" w:name="_Toc10333"/>
+      <w:bookmarkStart w:id="85" w:name="_Toc11363"/>
+      <w:bookmarkStart w:id="86" w:name="_Toc10333"/>
+      <w:bookmarkStart w:id="87" w:name="_Toc3436"/>
       <w:r>
         <w:rPr>
           <w:rFonts w:cs="Times New Roman"/>
@@ -15621,10 +15645,10 @@
           <w:szCs w:val="26"/>
         </w:rPr>
       </w:pPr>
-      <w:bookmarkStart w:id="88" w:name="_Toc30177"/>
-      <w:bookmarkStart w:id="89" w:name="_Toc127971487"/>
-      <w:bookmarkStart w:id="90" w:name="_Toc31865"/>
-      <w:bookmarkStart w:id="91" w:name="_Toc17000"/>
+      <w:bookmarkStart w:id="88" w:name="_Toc31865"/>
+      <w:bookmarkStart w:id="89" w:name="_Toc30177"/>
+      <w:bookmarkStart w:id="90" w:name="_Toc17000"/>
+      <w:bookmarkStart w:id="91" w:name="_Toc127971487"/>
       <w:bookmarkStart w:id="92" w:name="_Toc27488"/>
       <w:r>
         <w:rPr>
@@ -15656,10 +15680,10 @@
         </w:rPr>
       </w:pPr>
       <w:bookmarkStart w:id="93" w:name="_Toc22422"/>
-      <w:bookmarkStart w:id="94" w:name="_Toc13287"/>
+      <w:bookmarkStart w:id="94" w:name="_Toc13364"/>
       <w:bookmarkStart w:id="95" w:name="_Toc26820"/>
       <w:bookmarkStart w:id="96" w:name="_Toc127971488"/>
-      <w:bookmarkStart w:id="97" w:name="_Toc13364"/>
+      <w:bookmarkStart w:id="97" w:name="_Toc13287"/>
       <w:r>
         <w:rPr>
           <w:rFonts w:cs="Times New Roman"/>
@@ -15869,11 +15893,11 @@
           <w:szCs w:val="26"/>
         </w:rPr>
       </w:pPr>
-      <w:bookmarkStart w:id="99" w:name="_Toc20288"/>
-      <w:bookmarkStart w:id="100" w:name="_Toc31248"/>
-      <w:bookmarkStart w:id="101" w:name="_Toc13483"/>
-      <w:bookmarkStart w:id="102" w:name="_Toc16701"/>
-      <w:bookmarkStart w:id="103" w:name="_Toc127971489"/>
+      <w:bookmarkStart w:id="99" w:name="_Toc127971489"/>
+      <w:bookmarkStart w:id="100" w:name="_Toc13483"/>
+      <w:bookmarkStart w:id="101" w:name="_Toc31248"/>
+      <w:bookmarkStart w:id="102" w:name="_Toc20288"/>
+      <w:bookmarkStart w:id="103" w:name="_Toc16701"/>
       <w:r>
         <w:rPr>
           <w:rFonts w:cs="Times New Roman"/>

</xml_diff>